<commit_message>
affichage dynamique entete publication fonciere
</commit_message>
<xml_diff>
--- a/documents/Avenant-template.docx
+++ b/documents/Avenant-template.docx
@@ -737,6 +737,7 @@
         <w:rPr>
           <w:rFonts w:cs="TimesNewRomanPSMT"/>
         </w:rPr>
+        <w:lastRenderedPageBreak/>
         <w:t>sont convenus de ce qui suit :</w:t>
       </w:r>
     </w:p>
@@ -3486,21 +3487,30 @@
     <w:p>
       <w:pPr>
         <w:jc w:val="both"/>
+        <w:rPr>
+          <w:lang w:val="en-US"/>
+        </w:rPr>
       </w:pPr>
       <w:bookmarkStart w:id="16" w:name="_Hlk213411565"/>
       <w:r>
+        <w:rPr>
+          <w:lang w:val="en-US"/>
+        </w:rPr>
         <w:t xml:space="preserve">{% set </w:t>
       </w:r>
       <w:proofErr w:type="spellStart"/>
       <w:r>
+        <w:rPr>
+          <w:lang w:val="en-US"/>
+        </w:rPr>
         <w:t>displayed_annexes</w:t>
       </w:r>
       <w:proofErr w:type="spellEnd"/>
       <w:r>
-        <w:t xml:space="preserve"> = [] %}</w:t>
-      </w:r>
-      <w:r>
-        <w:t>{% for lot in lots %}</w:t>
+        <w:rPr>
+          <w:lang w:val="en-US"/>
+        </w:rPr>
+        <w:t xml:space="preserve"> = [] %}{% for lot in lots %}</w:t>
       </w:r>
     </w:p>
     <w:p>
@@ -3509,18 +3519,26 @@
         <w:rPr>
           <w:sz w:val="16"/>
           <w:szCs w:val="16"/>
-        </w:rPr>
-      </w:pPr>
-      <w:r>
+          <w:lang w:val="en-US"/>
+        </w:rPr>
+      </w:pPr>
+      <w:r>
+        <w:rPr>
+          <w:lang w:val="en-US"/>
+        </w:rPr>
         <w:t xml:space="preserve">  </w:t>
       </w:r>
       <w:r>
+        <w:rPr>
+          <w:lang w:val="en-US"/>
+        </w:rPr>
         <w:tab/>
       </w:r>
       <w:r>
         <w:rPr>
           <w:sz w:val="16"/>
           <w:szCs w:val="16"/>
+          <w:lang w:val="en-US"/>
         </w:rPr>
         <w:t xml:space="preserve">{%- if </w:t>
       </w:r>
@@ -3529,6 +3547,7 @@
         <w:rPr>
           <w:sz w:val="16"/>
           <w:szCs w:val="16"/>
+          <w:lang w:val="en-US"/>
         </w:rPr>
         <w:t>lot.annexe_caves</w:t>
       </w:r>
@@ -3537,6 +3556,7 @@
         <w:rPr>
           <w:sz w:val="16"/>
           <w:szCs w:val="16"/>
+          <w:lang w:val="en-US"/>
         </w:rPr>
         <w:t xml:space="preserve"> and 'caves' not in </w:t>
       </w:r>
@@ -3545,6 +3565,7 @@
         <w:rPr>
           <w:sz w:val="16"/>
           <w:szCs w:val="16"/>
+          <w:lang w:val="en-US"/>
         </w:rPr>
         <w:t>displayed_annexes</w:t>
       </w:r>
@@ -3553,6 +3574,7 @@
         <w:rPr>
           <w:sz w:val="16"/>
           <w:szCs w:val="16"/>
+          <w:lang w:val="en-US"/>
         </w:rPr>
         <w:t xml:space="preserve"> %}</w:t>
       </w:r>
@@ -3565,13 +3587,15 @@
           <w:rFonts w:cs="TimesNewRomanPSMT"/>
           <w:sz w:val="16"/>
           <w:szCs w:val="16"/>
-        </w:rPr>
-      </w:pPr>
-      <w:r>
-        <w:rPr>
-          <w:rFonts w:cs="TimesNewRomanPSMT"/>
-          <w:sz w:val="16"/>
-          <w:szCs w:val="16"/>
+          <w:lang w:val="en-US"/>
+        </w:rPr>
+      </w:pPr>
+      <w:r>
+        <w:rPr>
+          <w:rFonts w:cs="TimesNewRomanPSMT"/>
+          <w:sz w:val="16"/>
+          <w:szCs w:val="16"/>
+          <w:lang w:val="en-US"/>
         </w:rPr>
         <w:t xml:space="preserve">{{ </w:t>
       </w:r>
@@ -3581,6 +3605,7 @@
           <w:rFonts w:cs="TimesNewRomanPSMT"/>
           <w:sz w:val="16"/>
           <w:szCs w:val="16"/>
+          <w:lang w:val="en-US"/>
         </w:rPr>
         <w:t>displayed_annexes.append</w:t>
       </w:r>
@@ -3590,6 +3615,7 @@
           <w:rFonts w:cs="TimesNewRomanPSMT"/>
           <w:sz w:val="16"/>
           <w:szCs w:val="16"/>
+          <w:lang w:val="en-US"/>
         </w:rPr>
         <w:t>('caves') or '' }}</w:t>
       </w:r>
@@ -3598,6 +3624,9 @@
       <w:pPr>
         <w:ind w:firstLine="708"/>
         <w:jc w:val="both"/>
+        <w:rPr>
+          <w:lang w:val="en-US"/>
+        </w:rPr>
       </w:pPr>
       <w:r>
         <w:fldChar w:fldCharType="begin">
@@ -3617,6 +3646,7 @@
         <w:rPr>
           <w:sz w:val="16"/>
           <w:szCs w:val="16"/>
+          <w:lang w:val="en-US"/>
         </w:rPr>
         <w:instrText xml:space="preserve"> FORMCHECKBOX </w:instrText>
       </w:r>
@@ -3649,6 +3679,7 @@
       <w:r>
         <w:rPr>
           <w:rFonts w:cs="TimesNewRomanPSMT"/>
+          <w:lang w:val="en-US"/>
         </w:rPr>
         <w:t xml:space="preserve"> Caves</w:t>
       </w:r>
@@ -3657,6 +3688,7 @@
           <w:rFonts w:cs="TimesNewRomanPSMT"/>
           <w:sz w:val="16"/>
           <w:szCs w:val="16"/>
+          <w:lang w:val="en-US"/>
         </w:rPr>
         <w:t xml:space="preserve"> </w:t>
       </w:r>
@@ -3665,32 +3697,18 @@
       <w:pPr>
         <w:ind w:firstLine="708"/>
         <w:jc w:val="both"/>
-      </w:pPr>
-      <w:r>
-        <w:rPr>
-          <w:rFonts w:cs="TimesNewRomanPSMT"/>
-          <w:sz w:val="16"/>
-          <w:szCs w:val="16"/>
-        </w:rPr>
-        <w:t xml:space="preserve">{%- </w:t>
-      </w:r>
-      <w:proofErr w:type="spellStart"/>
-      <w:r>
-        <w:rPr>
-          <w:rFonts w:cs="TimesNewRomanPSMT"/>
-          <w:sz w:val="16"/>
-          <w:szCs w:val="16"/>
-        </w:rPr>
-        <w:t>endif</w:t>
-      </w:r>
-      <w:proofErr w:type="spellEnd"/>
-      <w:r>
-        <w:rPr>
-          <w:rFonts w:cs="TimesNewRomanPSMT"/>
-          <w:sz w:val="16"/>
-          <w:szCs w:val="16"/>
-        </w:rPr>
-        <w:t xml:space="preserve"> %} </w:t>
+        <w:rPr>
+          <w:lang w:val="en-US"/>
+        </w:rPr>
+      </w:pPr>
+      <w:r>
+        <w:rPr>
+          <w:rFonts w:cs="TimesNewRomanPSMT"/>
+          <w:sz w:val="16"/>
+          <w:szCs w:val="16"/>
+          <w:lang w:val="en-US"/>
+        </w:rPr>
+        <w:t xml:space="preserve">{%- endif %} </w:t>
       </w:r>
     </w:p>
     <w:p>
@@ -3701,13 +3719,15 @@
           <w:rFonts w:cs="TimesNewRomanPSMT"/>
           <w:sz w:val="16"/>
           <w:szCs w:val="16"/>
-        </w:rPr>
-      </w:pPr>
-      <w:r>
-        <w:rPr>
-          <w:rFonts w:cs="TimesNewRomanPSMT"/>
-          <w:sz w:val="16"/>
-          <w:szCs w:val="16"/>
+          <w:lang w:val="en-US"/>
+        </w:rPr>
+      </w:pPr>
+      <w:r>
+        <w:rPr>
+          <w:rFonts w:cs="TimesNewRomanPSMT"/>
+          <w:sz w:val="16"/>
+          <w:szCs w:val="16"/>
+          <w:lang w:val="en-US"/>
         </w:rPr>
         <w:t xml:space="preserve">{%- if </w:t>
       </w:r>
@@ -3717,6 +3737,7 @@
           <w:rFonts w:cs="TimesNewRomanPSMT"/>
           <w:sz w:val="16"/>
           <w:szCs w:val="16"/>
+          <w:lang w:val="en-US"/>
         </w:rPr>
         <w:t>lot.annexe_soussols</w:t>
       </w:r>
@@ -3726,6 +3747,7 @@
           <w:rFonts w:cs="TimesNewRomanPSMT"/>
           <w:sz w:val="16"/>
           <w:szCs w:val="16"/>
+          <w:lang w:val="en-US"/>
         </w:rPr>
         <w:t xml:space="preserve"> and '</w:t>
       </w:r>
@@ -3735,6 +3757,7 @@
           <w:rFonts w:cs="TimesNewRomanPSMT"/>
           <w:sz w:val="16"/>
           <w:szCs w:val="16"/>
+          <w:lang w:val="en-US"/>
         </w:rPr>
         <w:t>soussols</w:t>
       </w:r>
@@ -3744,6 +3767,7 @@
           <w:rFonts w:cs="TimesNewRomanPSMT"/>
           <w:sz w:val="16"/>
           <w:szCs w:val="16"/>
+          <w:lang w:val="en-US"/>
         </w:rPr>
         <w:t xml:space="preserve">' not in </w:t>
       </w:r>
@@ -3753,6 +3777,7 @@
           <w:rFonts w:cs="TimesNewRomanPSMT"/>
           <w:sz w:val="16"/>
           <w:szCs w:val="16"/>
+          <w:lang w:val="en-US"/>
         </w:rPr>
         <w:t>displayed_annexes</w:t>
       </w:r>
@@ -3762,6 +3787,7 @@
           <w:rFonts w:cs="TimesNewRomanPSMT"/>
           <w:sz w:val="16"/>
           <w:szCs w:val="16"/>
+          <w:lang w:val="en-US"/>
         </w:rPr>
         <w:t xml:space="preserve"> %}</w:t>
       </w:r>
@@ -3774,13 +3800,15 @@
           <w:rFonts w:cs="TimesNewRomanPSMT"/>
           <w:sz w:val="16"/>
           <w:szCs w:val="16"/>
-        </w:rPr>
-      </w:pPr>
-      <w:r>
-        <w:rPr>
-          <w:rFonts w:cs="TimesNewRomanPSMT"/>
-          <w:sz w:val="16"/>
-          <w:szCs w:val="16"/>
+          <w:lang w:val="en-US"/>
+        </w:rPr>
+      </w:pPr>
+      <w:r>
+        <w:rPr>
+          <w:rFonts w:cs="TimesNewRomanPSMT"/>
+          <w:sz w:val="16"/>
+          <w:szCs w:val="16"/>
+          <w:lang w:val="en-US"/>
         </w:rPr>
         <w:t xml:space="preserve">{{ </w:t>
       </w:r>
@@ -3790,6 +3818,7 @@
           <w:rFonts w:cs="TimesNewRomanPSMT"/>
           <w:sz w:val="16"/>
           <w:szCs w:val="16"/>
+          <w:lang w:val="en-US"/>
         </w:rPr>
         <w:t>displayed_annexes.append</w:t>
       </w:r>
@@ -3799,6 +3828,7 @@
           <w:rFonts w:cs="TimesNewRomanPSMT"/>
           <w:sz w:val="16"/>
           <w:szCs w:val="16"/>
+          <w:lang w:val="en-US"/>
         </w:rPr>
         <w:t>('</w:t>
       </w:r>
@@ -3808,6 +3838,7 @@
           <w:rFonts w:cs="TimesNewRomanPSMT"/>
           <w:sz w:val="16"/>
           <w:szCs w:val="16"/>
+          <w:lang w:val="en-US"/>
         </w:rPr>
         <w:t>soussols</w:t>
       </w:r>
@@ -3817,6 +3848,7 @@
           <w:rFonts w:cs="TimesNewRomanPSMT"/>
           <w:sz w:val="16"/>
           <w:szCs w:val="16"/>
+          <w:lang w:val="en-US"/>
         </w:rPr>
         <w:t>') or '' }}</w:t>
       </w:r>
@@ -3825,6 +3857,9 @@
       <w:pPr>
         <w:ind w:firstLine="708"/>
         <w:jc w:val="both"/>
+        <w:rPr>
+          <w:lang w:val="en-US"/>
+        </w:rPr>
       </w:pPr>
       <w:r>
         <w:fldChar w:fldCharType="begin">
@@ -3844,6 +3879,7 @@
         <w:rPr>
           <w:sz w:val="16"/>
           <w:szCs w:val="16"/>
+          <w:lang w:val="en-US"/>
         </w:rPr>
         <w:instrText xml:space="preserve"> FORMCHECKBOX </w:instrText>
       </w:r>
@@ -3876,6 +3912,7 @@
       <w:r>
         <w:rPr>
           <w:rFonts w:cs="TimesNewRomanPSMT"/>
+          <w:lang w:val="en-US"/>
         </w:rPr>
         <w:t xml:space="preserve"> Sous-sols</w:t>
       </w:r>
@@ -3884,6 +3921,7 @@
           <w:rFonts w:cs="TimesNewRomanPSMT"/>
           <w:sz w:val="16"/>
           <w:szCs w:val="16"/>
+          <w:lang w:val="en-US"/>
         </w:rPr>
         <w:t xml:space="preserve"> </w:t>
       </w:r>
@@ -3892,32 +3930,18 @@
       <w:pPr>
         <w:ind w:firstLine="708"/>
         <w:jc w:val="both"/>
-      </w:pPr>
-      <w:r>
-        <w:rPr>
-          <w:rFonts w:cs="TimesNewRomanPSMT"/>
-          <w:sz w:val="16"/>
-          <w:szCs w:val="16"/>
-        </w:rPr>
-        <w:t xml:space="preserve">{%- </w:t>
-      </w:r>
-      <w:proofErr w:type="spellStart"/>
-      <w:r>
-        <w:rPr>
-          <w:rFonts w:cs="TimesNewRomanPSMT"/>
-          <w:sz w:val="16"/>
-          <w:szCs w:val="16"/>
-        </w:rPr>
-        <w:t>endif</w:t>
-      </w:r>
-      <w:proofErr w:type="spellEnd"/>
-      <w:r>
-        <w:rPr>
-          <w:rFonts w:cs="TimesNewRomanPSMT"/>
-          <w:sz w:val="16"/>
-          <w:szCs w:val="16"/>
-        </w:rPr>
-        <w:t xml:space="preserve"> %} </w:t>
+        <w:rPr>
+          <w:lang w:val="en-US"/>
+        </w:rPr>
+      </w:pPr>
+      <w:r>
+        <w:rPr>
+          <w:rFonts w:cs="TimesNewRomanPSMT"/>
+          <w:sz w:val="16"/>
+          <w:szCs w:val="16"/>
+          <w:lang w:val="en-US"/>
+        </w:rPr>
+        <w:t xml:space="preserve">{%- endif %} </w:t>
       </w:r>
     </w:p>
     <w:p>
@@ -3928,13 +3952,15 @@
           <w:rFonts w:cs="TimesNewRomanPSMT"/>
           <w:sz w:val="16"/>
           <w:szCs w:val="16"/>
-        </w:rPr>
-      </w:pPr>
-      <w:r>
-        <w:rPr>
-          <w:rFonts w:cs="TimesNewRomanPSMT"/>
-          <w:sz w:val="16"/>
-          <w:szCs w:val="16"/>
+          <w:lang w:val="en-US"/>
+        </w:rPr>
+      </w:pPr>
+      <w:r>
+        <w:rPr>
+          <w:rFonts w:cs="TimesNewRomanPSMT"/>
+          <w:sz w:val="16"/>
+          <w:szCs w:val="16"/>
+          <w:lang w:val="en-US"/>
         </w:rPr>
         <w:t xml:space="preserve">{%- if </w:t>
       </w:r>
@@ -3944,6 +3970,7 @@
           <w:rFonts w:cs="TimesNewRomanPSMT"/>
           <w:sz w:val="16"/>
           <w:szCs w:val="16"/>
+          <w:lang w:val="en-US"/>
         </w:rPr>
         <w:t>lot.annexe_remises</w:t>
       </w:r>
@@ -3953,6 +3980,7 @@
           <w:rFonts w:cs="TimesNewRomanPSMT"/>
           <w:sz w:val="16"/>
           <w:szCs w:val="16"/>
+          <w:lang w:val="en-US"/>
         </w:rPr>
         <w:t xml:space="preserve"> and 'remises' not in </w:t>
       </w:r>
@@ -3962,6 +3990,7 @@
           <w:rFonts w:cs="TimesNewRomanPSMT"/>
           <w:sz w:val="16"/>
           <w:szCs w:val="16"/>
+          <w:lang w:val="en-US"/>
         </w:rPr>
         <w:t>displayed_annexes</w:t>
       </w:r>
@@ -3971,6 +4000,7 @@
           <w:rFonts w:cs="TimesNewRomanPSMT"/>
           <w:sz w:val="16"/>
           <w:szCs w:val="16"/>
+          <w:lang w:val="en-US"/>
         </w:rPr>
         <w:t xml:space="preserve"> %}</w:t>
       </w:r>
@@ -3983,13 +4013,15 @@
           <w:rFonts w:cs="TimesNewRomanPSMT"/>
           <w:sz w:val="16"/>
           <w:szCs w:val="16"/>
-        </w:rPr>
-      </w:pPr>
-      <w:r>
-        <w:rPr>
-          <w:rFonts w:cs="TimesNewRomanPSMT"/>
-          <w:sz w:val="16"/>
-          <w:szCs w:val="16"/>
+          <w:lang w:val="en-US"/>
+        </w:rPr>
+      </w:pPr>
+      <w:r>
+        <w:rPr>
+          <w:rFonts w:cs="TimesNewRomanPSMT"/>
+          <w:sz w:val="16"/>
+          <w:szCs w:val="16"/>
+          <w:lang w:val="en-US"/>
         </w:rPr>
         <w:t xml:space="preserve">    {{ </w:t>
       </w:r>
@@ -3999,6 +4031,7 @@
           <w:rFonts w:cs="TimesNewRomanPSMT"/>
           <w:sz w:val="16"/>
           <w:szCs w:val="16"/>
+          <w:lang w:val="en-US"/>
         </w:rPr>
         <w:t>displayed_annexes.append</w:t>
       </w:r>
@@ -4008,6 +4041,7 @@
           <w:rFonts w:cs="TimesNewRomanPSMT"/>
           <w:sz w:val="16"/>
           <w:szCs w:val="16"/>
+          <w:lang w:val="en-US"/>
         </w:rPr>
         <w:t>('remises') or '' }}</w:t>
       </w:r>
@@ -4016,6 +4050,9 @@
       <w:pPr>
         <w:ind w:firstLine="708"/>
         <w:jc w:val="both"/>
+        <w:rPr>
+          <w:lang w:val="en-US"/>
+        </w:rPr>
       </w:pPr>
       <w:r>
         <w:fldChar w:fldCharType="begin">
@@ -4035,6 +4072,7 @@
         <w:rPr>
           <w:sz w:val="16"/>
           <w:szCs w:val="16"/>
+          <w:lang w:val="en-US"/>
         </w:rPr>
         <w:instrText xml:space="preserve"> FORMCHECKBOX </w:instrText>
       </w:r>
@@ -4069,12 +4107,14 @@
           <w:rFonts w:cs="TimesNewRomanPSMT"/>
           <w:sz w:val="16"/>
           <w:szCs w:val="16"/>
+          <w:lang w:val="en-US"/>
         </w:rPr>
         <w:t xml:space="preserve"> </w:t>
       </w:r>
       <w:r>
         <w:rPr>
           <w:rFonts w:cs="TimesNewRomanPSMT"/>
+          <w:lang w:val="en-US"/>
         </w:rPr>
         <w:t>Remise</w:t>
       </w:r>
@@ -4083,32 +4123,18 @@
       <w:pPr>
         <w:ind w:firstLine="708"/>
         <w:jc w:val="both"/>
-      </w:pPr>
-      <w:r>
-        <w:rPr>
-          <w:rFonts w:cs="TimesNewRomanPSMT"/>
-          <w:sz w:val="16"/>
-          <w:szCs w:val="16"/>
-        </w:rPr>
-        <w:t xml:space="preserve">{%- </w:t>
-      </w:r>
-      <w:proofErr w:type="spellStart"/>
-      <w:r>
-        <w:rPr>
-          <w:rFonts w:cs="TimesNewRomanPSMT"/>
-          <w:sz w:val="16"/>
-          <w:szCs w:val="16"/>
-        </w:rPr>
-        <w:t>endif</w:t>
-      </w:r>
-      <w:proofErr w:type="spellEnd"/>
-      <w:r>
-        <w:rPr>
-          <w:rFonts w:cs="TimesNewRomanPSMT"/>
-          <w:sz w:val="16"/>
-          <w:szCs w:val="16"/>
-        </w:rPr>
-        <w:t xml:space="preserve"> %} </w:t>
+        <w:rPr>
+          <w:lang w:val="en-US"/>
+        </w:rPr>
+      </w:pPr>
+      <w:r>
+        <w:rPr>
+          <w:rFonts w:cs="TimesNewRomanPSMT"/>
+          <w:sz w:val="16"/>
+          <w:szCs w:val="16"/>
+          <w:lang w:val="en-US"/>
+        </w:rPr>
+        <w:t xml:space="preserve">{%- endif %} </w:t>
       </w:r>
     </w:p>
     <w:p>
@@ -4119,13 +4145,15 @@
           <w:rFonts w:cs="TimesNewRomanPSMT"/>
           <w:sz w:val="16"/>
           <w:szCs w:val="16"/>
-        </w:rPr>
-      </w:pPr>
-      <w:r>
-        <w:rPr>
-          <w:rFonts w:cs="TimesNewRomanPSMT"/>
-          <w:sz w:val="16"/>
-          <w:szCs w:val="16"/>
+          <w:lang w:val="en-US"/>
+        </w:rPr>
+      </w:pPr>
+      <w:r>
+        <w:rPr>
+          <w:rFonts w:cs="TimesNewRomanPSMT"/>
+          <w:sz w:val="16"/>
+          <w:szCs w:val="16"/>
+          <w:lang w:val="en-US"/>
         </w:rPr>
         <w:t xml:space="preserve">{%- if </w:t>
       </w:r>
@@ -4135,6 +4163,7 @@
           <w:rFonts w:cs="TimesNewRomanPSMT"/>
           <w:sz w:val="16"/>
           <w:szCs w:val="16"/>
+          <w:lang w:val="en-US"/>
         </w:rPr>
         <w:t>lot.annexe_ateliers</w:t>
       </w:r>
@@ -4144,6 +4173,7 @@
           <w:rFonts w:cs="TimesNewRomanPSMT"/>
           <w:sz w:val="16"/>
           <w:szCs w:val="16"/>
+          <w:lang w:val="en-US"/>
         </w:rPr>
         <w:t xml:space="preserve"> and 'ateliers' not in </w:t>
       </w:r>
@@ -4153,6 +4183,7 @@
           <w:rFonts w:cs="TimesNewRomanPSMT"/>
           <w:sz w:val="16"/>
           <w:szCs w:val="16"/>
+          <w:lang w:val="en-US"/>
         </w:rPr>
         <w:t>displayed_annexes</w:t>
       </w:r>
@@ -4162,6 +4193,7 @@
           <w:rFonts w:cs="TimesNewRomanPSMT"/>
           <w:sz w:val="16"/>
           <w:szCs w:val="16"/>
+          <w:lang w:val="en-US"/>
         </w:rPr>
         <w:t xml:space="preserve"> %}</w:t>
       </w:r>
@@ -4174,13 +4206,15 @@
           <w:rFonts w:cs="TimesNewRomanPSMT"/>
           <w:sz w:val="16"/>
           <w:szCs w:val="16"/>
-        </w:rPr>
-      </w:pPr>
-      <w:r>
-        <w:rPr>
-          <w:rFonts w:cs="TimesNewRomanPSMT"/>
-          <w:sz w:val="16"/>
-          <w:szCs w:val="16"/>
+          <w:lang w:val="en-US"/>
+        </w:rPr>
+      </w:pPr>
+      <w:r>
+        <w:rPr>
+          <w:rFonts w:cs="TimesNewRomanPSMT"/>
+          <w:sz w:val="16"/>
+          <w:szCs w:val="16"/>
+          <w:lang w:val="en-US"/>
         </w:rPr>
         <w:t xml:space="preserve">   {{ </w:t>
       </w:r>
@@ -4190,6 +4224,7 @@
           <w:rFonts w:cs="TimesNewRomanPSMT"/>
           <w:sz w:val="16"/>
           <w:szCs w:val="16"/>
+          <w:lang w:val="en-US"/>
         </w:rPr>
         <w:t>displayed_annexes.append</w:t>
       </w:r>
@@ -4199,6 +4234,7 @@
           <w:rFonts w:cs="TimesNewRomanPSMT"/>
           <w:sz w:val="16"/>
           <w:szCs w:val="16"/>
+          <w:lang w:val="en-US"/>
         </w:rPr>
         <w:t>('ateliers') or '' }}</w:t>
       </w:r>
@@ -4207,12 +4243,16 @@
       <w:pPr>
         <w:ind w:firstLine="708"/>
         <w:jc w:val="both"/>
-      </w:pPr>
-      <w:r>
-        <w:rPr>
-          <w:rFonts w:cs="TimesNewRomanPSMT"/>
-          <w:sz w:val="16"/>
-          <w:szCs w:val="16"/>
+        <w:rPr>
+          <w:lang w:val="en-US"/>
+        </w:rPr>
+      </w:pPr>
+      <w:r>
+        <w:rPr>
+          <w:rFonts w:cs="TimesNewRomanPSMT"/>
+          <w:sz w:val="16"/>
+          <w:szCs w:val="16"/>
+          <w:lang w:val="en-US"/>
         </w:rPr>
         <w:t xml:space="preserve"> </w:t>
       </w:r>
@@ -4234,6 +4274,7 @@
         <w:rPr>
           <w:sz w:val="16"/>
           <w:szCs w:val="16"/>
+          <w:lang w:val="en-US"/>
         </w:rPr>
         <w:instrText xml:space="preserve"> FORMCHECKBOX </w:instrText>
       </w:r>
@@ -4268,12 +4309,14 @@
           <w:rFonts w:cs="TimesNewRomanPSMT"/>
           <w:sz w:val="16"/>
           <w:szCs w:val="16"/>
+          <w:lang w:val="en-US"/>
         </w:rPr>
         <w:t xml:space="preserve"> </w:t>
       </w:r>
       <w:r>
         <w:rPr>
           <w:rFonts w:cs="TimesNewRomanPSMT"/>
+          <w:lang w:val="en-US"/>
         </w:rPr>
         <w:t>Ateliers</w:t>
       </w:r>
@@ -4282,32 +4325,18 @@
       <w:pPr>
         <w:ind w:firstLine="708"/>
         <w:jc w:val="both"/>
-      </w:pPr>
-      <w:r>
-        <w:rPr>
-          <w:rFonts w:cs="TimesNewRomanPSMT"/>
-          <w:sz w:val="16"/>
-          <w:szCs w:val="16"/>
-        </w:rPr>
-        <w:t xml:space="preserve">{%- </w:t>
-      </w:r>
-      <w:proofErr w:type="spellStart"/>
-      <w:r>
-        <w:rPr>
-          <w:rFonts w:cs="TimesNewRomanPSMT"/>
-          <w:sz w:val="16"/>
-          <w:szCs w:val="16"/>
-        </w:rPr>
-        <w:t>endif</w:t>
-      </w:r>
-      <w:proofErr w:type="spellEnd"/>
-      <w:r>
-        <w:rPr>
-          <w:rFonts w:cs="TimesNewRomanPSMT"/>
-          <w:sz w:val="16"/>
-          <w:szCs w:val="16"/>
-        </w:rPr>
-        <w:t xml:space="preserve"> %} </w:t>
+        <w:rPr>
+          <w:lang w:val="en-US"/>
+        </w:rPr>
+      </w:pPr>
+      <w:r>
+        <w:rPr>
+          <w:rFonts w:cs="TimesNewRomanPSMT"/>
+          <w:sz w:val="16"/>
+          <w:szCs w:val="16"/>
+          <w:lang w:val="en-US"/>
+        </w:rPr>
+        <w:t xml:space="preserve">{%- endif %} </w:t>
       </w:r>
     </w:p>
     <w:p>
@@ -4318,13 +4347,15 @@
           <w:rFonts w:cs="TimesNewRomanPSMT"/>
           <w:sz w:val="16"/>
           <w:szCs w:val="16"/>
-        </w:rPr>
-      </w:pPr>
-      <w:r>
-        <w:rPr>
-          <w:rFonts w:cs="TimesNewRomanPSMT"/>
-          <w:sz w:val="16"/>
-          <w:szCs w:val="16"/>
+          <w:lang w:val="en-US"/>
+        </w:rPr>
+      </w:pPr>
+      <w:r>
+        <w:rPr>
+          <w:rFonts w:cs="TimesNewRomanPSMT"/>
+          <w:sz w:val="16"/>
+          <w:szCs w:val="16"/>
+          <w:lang w:val="en-US"/>
         </w:rPr>
         <w:t xml:space="preserve">{%- if </w:t>
       </w:r>
@@ -4334,6 +4365,7 @@
           <w:rFonts w:cs="TimesNewRomanPSMT"/>
           <w:sz w:val="16"/>
           <w:szCs w:val="16"/>
+          <w:lang w:val="en-US"/>
         </w:rPr>
         <w:t>lot.annexe_sechoirs</w:t>
       </w:r>
@@ -4343,6 +4375,7 @@
           <w:rFonts w:cs="TimesNewRomanPSMT"/>
           <w:sz w:val="16"/>
           <w:szCs w:val="16"/>
+          <w:lang w:val="en-US"/>
         </w:rPr>
         <w:t xml:space="preserve"> and '</w:t>
       </w:r>
@@ -4352,6 +4385,7 @@
           <w:rFonts w:cs="TimesNewRomanPSMT"/>
           <w:sz w:val="16"/>
           <w:szCs w:val="16"/>
+          <w:lang w:val="en-US"/>
         </w:rPr>
         <w:t>sechoirs</w:t>
       </w:r>
@@ -4361,6 +4395,7 @@
           <w:rFonts w:cs="TimesNewRomanPSMT"/>
           <w:sz w:val="16"/>
           <w:szCs w:val="16"/>
+          <w:lang w:val="en-US"/>
         </w:rPr>
         <w:t xml:space="preserve">' not in </w:t>
       </w:r>
@@ -4370,6 +4405,7 @@
           <w:rFonts w:cs="TimesNewRomanPSMT"/>
           <w:sz w:val="16"/>
           <w:szCs w:val="16"/>
+          <w:lang w:val="en-US"/>
         </w:rPr>
         <w:t>displayed_annexes</w:t>
       </w:r>
@@ -4379,6 +4415,7 @@
           <w:rFonts w:cs="TimesNewRomanPSMT"/>
           <w:sz w:val="16"/>
           <w:szCs w:val="16"/>
+          <w:lang w:val="en-US"/>
         </w:rPr>
         <w:t xml:space="preserve"> %}</w:t>
       </w:r>
@@ -4391,13 +4428,15 @@
           <w:rFonts w:cs="TimesNewRomanPSMT"/>
           <w:sz w:val="16"/>
           <w:szCs w:val="16"/>
-        </w:rPr>
-      </w:pPr>
-      <w:r>
-        <w:rPr>
-          <w:rFonts w:cs="TimesNewRomanPSMT"/>
-          <w:sz w:val="16"/>
-          <w:szCs w:val="16"/>
+          <w:lang w:val="en-US"/>
+        </w:rPr>
+      </w:pPr>
+      <w:r>
+        <w:rPr>
+          <w:rFonts w:cs="TimesNewRomanPSMT"/>
+          <w:sz w:val="16"/>
+          <w:szCs w:val="16"/>
+          <w:lang w:val="en-US"/>
         </w:rPr>
         <w:t xml:space="preserve">{{ </w:t>
       </w:r>
@@ -4407,6 +4446,7 @@
           <w:rFonts w:cs="TimesNewRomanPSMT"/>
           <w:sz w:val="16"/>
           <w:szCs w:val="16"/>
+          <w:lang w:val="en-US"/>
         </w:rPr>
         <w:t>displayed_annexes.append</w:t>
       </w:r>
@@ -4416,6 +4456,7 @@
           <w:rFonts w:cs="TimesNewRomanPSMT"/>
           <w:sz w:val="16"/>
           <w:szCs w:val="16"/>
+          <w:lang w:val="en-US"/>
         </w:rPr>
         <w:t>('</w:t>
       </w:r>
@@ -4425,6 +4466,7 @@
           <w:rFonts w:cs="TimesNewRomanPSMT"/>
           <w:sz w:val="16"/>
           <w:szCs w:val="16"/>
+          <w:lang w:val="en-US"/>
         </w:rPr>
         <w:t>sechoirs</w:t>
       </w:r>
@@ -4434,6 +4476,7 @@
           <w:rFonts w:cs="TimesNewRomanPSMT"/>
           <w:sz w:val="16"/>
           <w:szCs w:val="16"/>
+          <w:lang w:val="en-US"/>
         </w:rPr>
         <w:t xml:space="preserve">') or '' }} </w:t>
       </w:r>
@@ -4442,6 +4485,9 @@
       <w:pPr>
         <w:ind w:firstLine="708"/>
         <w:jc w:val="both"/>
+        <w:rPr>
+          <w:lang w:val="en-US"/>
+        </w:rPr>
       </w:pPr>
       <w:r>
         <w:fldChar w:fldCharType="begin">
@@ -4461,6 +4507,7 @@
         <w:rPr>
           <w:sz w:val="16"/>
           <w:szCs w:val="16"/>
+          <w:lang w:val="en-US"/>
         </w:rPr>
         <w:instrText xml:space="preserve"> FORMCHECKBOX </w:instrText>
       </w:r>
@@ -4495,46 +4542,36 @@
           <w:rFonts w:cs="TimesNewRomanPSMT"/>
           <w:sz w:val="16"/>
           <w:szCs w:val="16"/>
+          <w:lang w:val="en-US"/>
         </w:rPr>
         <w:t xml:space="preserve"> </w:t>
       </w:r>
-      <w:r>
-        <w:rPr>
-          <w:rFonts w:cs="TimesNewRomanPSMT"/>
+      <w:proofErr w:type="spellStart"/>
+      <w:r>
+        <w:rPr>
+          <w:rFonts w:cs="TimesNewRomanPSMT"/>
+          <w:lang w:val="en-US"/>
         </w:rPr>
         <w:t>Séchoirs</w:t>
       </w:r>
+      <w:proofErr w:type="spellEnd"/>
     </w:p>
     <w:p>
       <w:pPr>
         <w:ind w:firstLine="708"/>
         <w:jc w:val="both"/>
-      </w:pPr>
-      <w:r>
-        <w:rPr>
-          <w:rFonts w:cs="TimesNewRomanPSMT"/>
-          <w:sz w:val="16"/>
-          <w:szCs w:val="16"/>
-        </w:rPr>
-        <w:t xml:space="preserve">{%- </w:t>
-      </w:r>
-      <w:proofErr w:type="spellStart"/>
-      <w:r>
-        <w:rPr>
-          <w:rFonts w:cs="TimesNewRomanPSMT"/>
-          <w:sz w:val="16"/>
-          <w:szCs w:val="16"/>
-        </w:rPr>
-        <w:t>endif</w:t>
-      </w:r>
-      <w:proofErr w:type="spellEnd"/>
-      <w:r>
-        <w:rPr>
-          <w:rFonts w:cs="TimesNewRomanPSMT"/>
-          <w:sz w:val="16"/>
-          <w:szCs w:val="16"/>
-        </w:rPr>
-        <w:t xml:space="preserve"> %} </w:t>
+        <w:rPr>
+          <w:lang w:val="en-US"/>
+        </w:rPr>
+      </w:pPr>
+      <w:r>
+        <w:rPr>
+          <w:rFonts w:cs="TimesNewRomanPSMT"/>
+          <w:sz w:val="16"/>
+          <w:szCs w:val="16"/>
+          <w:lang w:val="en-US"/>
+        </w:rPr>
+        <w:t xml:space="preserve">{%- endif %} </w:t>
       </w:r>
     </w:p>
     <w:p>
@@ -4545,13 +4582,15 @@
           <w:rFonts w:cs="TimesNewRomanPSMT"/>
           <w:sz w:val="16"/>
           <w:szCs w:val="16"/>
-        </w:rPr>
-      </w:pPr>
-      <w:r>
-        <w:rPr>
-          <w:rFonts w:cs="TimesNewRomanPSMT"/>
-          <w:sz w:val="16"/>
-          <w:szCs w:val="16"/>
+          <w:lang w:val="en-US"/>
+        </w:rPr>
+      </w:pPr>
+      <w:r>
+        <w:rPr>
+          <w:rFonts w:cs="TimesNewRomanPSMT"/>
+          <w:sz w:val="16"/>
+          <w:szCs w:val="16"/>
+          <w:lang w:val="en-US"/>
         </w:rPr>
         <w:t xml:space="preserve">{%- if </w:t>
       </w:r>
@@ -4561,6 +4600,7 @@
           <w:rFonts w:cs="TimesNewRomanPSMT"/>
           <w:sz w:val="16"/>
           <w:szCs w:val="16"/>
+          <w:lang w:val="en-US"/>
         </w:rPr>
         <w:t>lot.annexe_celliers</w:t>
       </w:r>
@@ -4570,15 +4610,37 @@
           <w:rFonts w:cs="TimesNewRomanPSMT"/>
           <w:sz w:val="16"/>
           <w:szCs w:val="16"/>
-        </w:rPr>
-        <w:t xml:space="preserve"> and 'celliers' not in </w:t>
-      </w:r>
-      <w:proofErr w:type="spellStart"/>
-      <w:r>
-        <w:rPr>
-          <w:rFonts w:cs="TimesNewRomanPSMT"/>
-          <w:sz w:val="16"/>
-          <w:szCs w:val="16"/>
+          <w:lang w:val="en-US"/>
+        </w:rPr>
+        <w:t xml:space="preserve"> and '</w:t>
+      </w:r>
+      <w:proofErr w:type="spellStart"/>
+      <w:r>
+        <w:rPr>
+          <w:rFonts w:cs="TimesNewRomanPSMT"/>
+          <w:sz w:val="16"/>
+          <w:szCs w:val="16"/>
+          <w:lang w:val="en-US"/>
+        </w:rPr>
+        <w:t>celliers'</w:t>
+      </w:r>
+      <w:proofErr w:type="spellEnd"/>
+      <w:r>
+        <w:rPr>
+          <w:rFonts w:cs="TimesNewRomanPSMT"/>
+          <w:sz w:val="16"/>
+          <w:szCs w:val="16"/>
+          <w:lang w:val="en-US"/>
+        </w:rPr>
+        <w:t xml:space="preserve"> not in </w:t>
+      </w:r>
+      <w:proofErr w:type="spellStart"/>
+      <w:r>
+        <w:rPr>
+          <w:rFonts w:cs="TimesNewRomanPSMT"/>
+          <w:sz w:val="16"/>
+          <w:szCs w:val="16"/>
+          <w:lang w:val="en-US"/>
         </w:rPr>
         <w:t>displayed_annexes</w:t>
       </w:r>
@@ -4588,6 +4650,7 @@
           <w:rFonts w:cs="TimesNewRomanPSMT"/>
           <w:sz w:val="16"/>
           <w:szCs w:val="16"/>
+          <w:lang w:val="en-US"/>
         </w:rPr>
         <w:t xml:space="preserve"> %}</w:t>
       </w:r>
@@ -4600,13 +4663,15 @@
           <w:rFonts w:cs="TimesNewRomanPSMT"/>
           <w:sz w:val="16"/>
           <w:szCs w:val="16"/>
-        </w:rPr>
-      </w:pPr>
-      <w:r>
-        <w:rPr>
-          <w:rFonts w:cs="TimesNewRomanPSMT"/>
-          <w:sz w:val="16"/>
-          <w:szCs w:val="16"/>
+          <w:lang w:val="en-US"/>
+        </w:rPr>
+      </w:pPr>
+      <w:r>
+        <w:rPr>
+          <w:rFonts w:cs="TimesNewRomanPSMT"/>
+          <w:sz w:val="16"/>
+          <w:szCs w:val="16"/>
+          <w:lang w:val="en-US"/>
         </w:rPr>
         <w:t xml:space="preserve">{{ </w:t>
       </w:r>
@@ -4616,6 +4681,7 @@
           <w:rFonts w:cs="TimesNewRomanPSMT"/>
           <w:sz w:val="16"/>
           <w:szCs w:val="16"/>
+          <w:lang w:val="en-US"/>
         </w:rPr>
         <w:t>displayed_annexes.append</w:t>
       </w:r>
@@ -4625,8 +4691,29 @@
           <w:rFonts w:cs="TimesNewRomanPSMT"/>
           <w:sz w:val="16"/>
           <w:szCs w:val="16"/>
-        </w:rPr>
-        <w:t>('celliers') or '' }}</w:t>
+          <w:lang w:val="en-US"/>
+        </w:rPr>
+        <w:t>('</w:t>
+      </w:r>
+      <w:proofErr w:type="spellStart"/>
+      <w:r>
+        <w:rPr>
+          <w:rFonts w:cs="TimesNewRomanPSMT"/>
+          <w:sz w:val="16"/>
+          <w:szCs w:val="16"/>
+          <w:lang w:val="en-US"/>
+        </w:rPr>
+        <w:t>celliers'</w:t>
+      </w:r>
+      <w:proofErr w:type="spellEnd"/>
+      <w:r>
+        <w:rPr>
+          <w:rFonts w:cs="TimesNewRomanPSMT"/>
+          <w:sz w:val="16"/>
+          <w:szCs w:val="16"/>
+          <w:lang w:val="en-US"/>
+        </w:rPr>
+        <w:t>) or '' }}</w:t>
       </w:r>
     </w:p>
     <w:p>
@@ -4639,6 +4726,7 @@
           <w:rFonts w:cs="TimesNewRomanPSMT"/>
           <w:sz w:val="16"/>
           <w:szCs w:val="16"/>
+          <w:lang w:val="en-US"/>
         </w:rPr>
         <w:t xml:space="preserve"> </w:t>
       </w:r>
@@ -4744,13 +4832,15 @@
           <w:rFonts w:cs="TimesNewRomanPSMT"/>
           <w:sz w:val="16"/>
           <w:szCs w:val="16"/>
-        </w:rPr>
-      </w:pPr>
-      <w:r>
-        <w:rPr>
-          <w:rFonts w:cs="TimesNewRomanPSMT"/>
-          <w:sz w:val="16"/>
-          <w:szCs w:val="16"/>
+          <w:lang w:val="en-US"/>
+        </w:rPr>
+      </w:pPr>
+      <w:r>
+        <w:rPr>
+          <w:rFonts w:cs="TimesNewRomanPSMT"/>
+          <w:sz w:val="16"/>
+          <w:szCs w:val="16"/>
+          <w:lang w:val="en-US"/>
         </w:rPr>
         <w:t xml:space="preserve">{%- if </w:t>
       </w:r>
@@ -4760,6 +4850,7 @@
           <w:rFonts w:cs="TimesNewRomanPSMT"/>
           <w:sz w:val="16"/>
           <w:szCs w:val="16"/>
+          <w:lang w:val="en-US"/>
         </w:rPr>
         <w:t>lot.annexe_resserres</w:t>
       </w:r>
@@ -4769,15 +4860,37 @@
           <w:rFonts w:cs="TimesNewRomanPSMT"/>
           <w:sz w:val="16"/>
           <w:szCs w:val="16"/>
-        </w:rPr>
-        <w:t xml:space="preserve"> and 'resserres' not in </w:t>
-      </w:r>
-      <w:proofErr w:type="spellStart"/>
-      <w:r>
-        <w:rPr>
-          <w:rFonts w:cs="TimesNewRomanPSMT"/>
-          <w:sz w:val="16"/>
-          <w:szCs w:val="16"/>
+          <w:lang w:val="en-US"/>
+        </w:rPr>
+        <w:t xml:space="preserve"> and '</w:t>
+      </w:r>
+      <w:proofErr w:type="spellStart"/>
+      <w:r>
+        <w:rPr>
+          <w:rFonts w:cs="TimesNewRomanPSMT"/>
+          <w:sz w:val="16"/>
+          <w:szCs w:val="16"/>
+          <w:lang w:val="en-US"/>
+        </w:rPr>
+        <w:t>resserres</w:t>
+      </w:r>
+      <w:proofErr w:type="spellEnd"/>
+      <w:r>
+        <w:rPr>
+          <w:rFonts w:cs="TimesNewRomanPSMT"/>
+          <w:sz w:val="16"/>
+          <w:szCs w:val="16"/>
+          <w:lang w:val="en-US"/>
+        </w:rPr>
+        <w:t xml:space="preserve">' not in </w:t>
+      </w:r>
+      <w:proofErr w:type="spellStart"/>
+      <w:r>
+        <w:rPr>
+          <w:rFonts w:cs="TimesNewRomanPSMT"/>
+          <w:sz w:val="16"/>
+          <w:szCs w:val="16"/>
+          <w:lang w:val="en-US"/>
         </w:rPr>
         <w:t>displayed_annexes</w:t>
       </w:r>
@@ -4787,6 +4900,7 @@
           <w:rFonts w:cs="TimesNewRomanPSMT"/>
           <w:sz w:val="16"/>
           <w:szCs w:val="16"/>
+          <w:lang w:val="en-US"/>
         </w:rPr>
         <w:t xml:space="preserve"> %}</w:t>
       </w:r>
@@ -4799,13 +4913,15 @@
           <w:rFonts w:cs="TimesNewRomanPSMT"/>
           <w:sz w:val="16"/>
           <w:szCs w:val="16"/>
-        </w:rPr>
-      </w:pPr>
-      <w:r>
-        <w:rPr>
-          <w:rFonts w:cs="TimesNewRomanPSMT"/>
-          <w:sz w:val="16"/>
-          <w:szCs w:val="16"/>
+          <w:lang w:val="en-US"/>
+        </w:rPr>
+      </w:pPr>
+      <w:r>
+        <w:rPr>
+          <w:rFonts w:cs="TimesNewRomanPSMT"/>
+          <w:sz w:val="16"/>
+          <w:szCs w:val="16"/>
+          <w:lang w:val="en-US"/>
         </w:rPr>
         <w:t xml:space="preserve">{{ </w:t>
       </w:r>
@@ -4815,6 +4931,7 @@
           <w:rFonts w:cs="TimesNewRomanPSMT"/>
           <w:sz w:val="16"/>
           <w:szCs w:val="16"/>
+          <w:lang w:val="en-US"/>
         </w:rPr>
         <w:t>displayed_annexes.append</w:t>
       </w:r>
@@ -4824,20 +4941,45 @@
           <w:rFonts w:cs="TimesNewRomanPSMT"/>
           <w:sz w:val="16"/>
           <w:szCs w:val="16"/>
-        </w:rPr>
-        <w:t>('resserres') or '' }}</w:t>
+          <w:lang w:val="en-US"/>
+        </w:rPr>
+        <w:t>('</w:t>
+      </w:r>
+      <w:proofErr w:type="spellStart"/>
+      <w:r>
+        <w:rPr>
+          <w:rFonts w:cs="TimesNewRomanPSMT"/>
+          <w:sz w:val="16"/>
+          <w:szCs w:val="16"/>
+          <w:lang w:val="en-US"/>
+        </w:rPr>
+        <w:t>resserres</w:t>
+      </w:r>
+      <w:proofErr w:type="spellEnd"/>
+      <w:r>
+        <w:rPr>
+          <w:rFonts w:cs="TimesNewRomanPSMT"/>
+          <w:sz w:val="16"/>
+          <w:szCs w:val="16"/>
+          <w:lang w:val="en-US"/>
+        </w:rPr>
+        <w:t>') or '' }}</w:t>
       </w:r>
     </w:p>
     <w:p>
       <w:pPr>
         <w:ind w:firstLine="708"/>
         <w:jc w:val="both"/>
-      </w:pPr>
-      <w:r>
-        <w:rPr>
-          <w:rFonts w:cs="TimesNewRomanPSMT"/>
-          <w:sz w:val="16"/>
-          <w:szCs w:val="16"/>
+        <w:rPr>
+          <w:lang w:val="en-US"/>
+        </w:rPr>
+      </w:pPr>
+      <w:r>
+        <w:rPr>
+          <w:rFonts w:cs="TimesNewRomanPSMT"/>
+          <w:sz w:val="16"/>
+          <w:szCs w:val="16"/>
+          <w:lang w:val="en-US"/>
         </w:rPr>
         <w:t xml:space="preserve"> </w:t>
       </w:r>
@@ -4859,6 +5001,7 @@
         <w:rPr>
           <w:sz w:val="16"/>
           <w:szCs w:val="16"/>
+          <w:lang w:val="en-US"/>
         </w:rPr>
         <w:instrText xml:space="preserve"> FORMCHECKBOX </w:instrText>
       </w:r>
@@ -4893,46 +5036,36 @@
           <w:rFonts w:cs="TimesNewRomanPSMT"/>
           <w:sz w:val="16"/>
           <w:szCs w:val="16"/>
+          <w:lang w:val="en-US"/>
         </w:rPr>
         <w:t xml:space="preserve"> </w:t>
       </w:r>
-      <w:r>
-        <w:rPr>
-          <w:rFonts w:cs="TimesNewRomanPSMT"/>
+      <w:proofErr w:type="spellStart"/>
+      <w:r>
+        <w:rPr>
+          <w:rFonts w:cs="TimesNewRomanPSMT"/>
+          <w:lang w:val="en-US"/>
         </w:rPr>
         <w:t>Resserres</w:t>
       </w:r>
+      <w:proofErr w:type="spellEnd"/>
     </w:p>
     <w:p>
       <w:pPr>
         <w:ind w:firstLine="708"/>
         <w:jc w:val="both"/>
-      </w:pPr>
-      <w:r>
-        <w:rPr>
-          <w:rFonts w:cs="TimesNewRomanPSMT"/>
-          <w:sz w:val="16"/>
-          <w:szCs w:val="16"/>
-        </w:rPr>
-        <w:t xml:space="preserve">{%- </w:t>
-      </w:r>
-      <w:proofErr w:type="spellStart"/>
-      <w:r>
-        <w:rPr>
-          <w:rFonts w:cs="TimesNewRomanPSMT"/>
-          <w:sz w:val="16"/>
-          <w:szCs w:val="16"/>
-        </w:rPr>
-        <w:t>endif</w:t>
-      </w:r>
-      <w:proofErr w:type="spellEnd"/>
-      <w:r>
-        <w:rPr>
-          <w:rFonts w:cs="TimesNewRomanPSMT"/>
-          <w:sz w:val="16"/>
-          <w:szCs w:val="16"/>
-        </w:rPr>
-        <w:t xml:space="preserve"> %} </w:t>
+        <w:rPr>
+          <w:lang w:val="en-US"/>
+        </w:rPr>
+      </w:pPr>
+      <w:r>
+        <w:rPr>
+          <w:rFonts w:cs="TimesNewRomanPSMT"/>
+          <w:sz w:val="16"/>
+          <w:szCs w:val="16"/>
+          <w:lang w:val="en-US"/>
+        </w:rPr>
+        <w:t xml:space="preserve">{%- endif %} </w:t>
       </w:r>
     </w:p>
     <w:p>
@@ -4943,13 +5076,15 @@
           <w:rFonts w:cs="TimesNewRomanPSMT"/>
           <w:sz w:val="16"/>
           <w:szCs w:val="16"/>
-        </w:rPr>
-      </w:pPr>
-      <w:r>
-        <w:rPr>
-          <w:rFonts w:cs="TimesNewRomanPSMT"/>
-          <w:sz w:val="16"/>
-          <w:szCs w:val="16"/>
+          <w:lang w:val="en-US"/>
+        </w:rPr>
+      </w:pPr>
+      <w:r>
+        <w:rPr>
+          <w:rFonts w:cs="TimesNewRomanPSMT"/>
+          <w:sz w:val="16"/>
+          <w:szCs w:val="16"/>
+          <w:lang w:val="en-US"/>
         </w:rPr>
         <w:t xml:space="preserve">{%- if </w:t>
       </w:r>
@@ -4959,6 +5094,7 @@
           <w:rFonts w:cs="TimesNewRomanPSMT"/>
           <w:sz w:val="16"/>
           <w:szCs w:val="16"/>
+          <w:lang w:val="en-US"/>
         </w:rPr>
         <w:t>lot.annexe_combles</w:t>
       </w:r>
@@ -4968,6 +5104,7 @@
           <w:rFonts w:cs="TimesNewRomanPSMT"/>
           <w:sz w:val="16"/>
           <w:szCs w:val="16"/>
+          <w:lang w:val="en-US"/>
         </w:rPr>
         <w:t xml:space="preserve"> and 'combles' not in </w:t>
       </w:r>
@@ -4977,6 +5114,7 @@
           <w:rFonts w:cs="TimesNewRomanPSMT"/>
           <w:sz w:val="16"/>
           <w:szCs w:val="16"/>
+          <w:lang w:val="en-US"/>
         </w:rPr>
         <w:t>displayed_annexes</w:t>
       </w:r>
@@ -4986,6 +5124,7 @@
           <w:rFonts w:cs="TimesNewRomanPSMT"/>
           <w:sz w:val="16"/>
           <w:szCs w:val="16"/>
+          <w:lang w:val="en-US"/>
         </w:rPr>
         <w:t xml:space="preserve"> %}</w:t>
       </w:r>
@@ -4998,13 +5137,15 @@
           <w:rFonts w:cs="TimesNewRomanPSMT"/>
           <w:sz w:val="16"/>
           <w:szCs w:val="16"/>
-        </w:rPr>
-      </w:pPr>
-      <w:r>
-        <w:rPr>
-          <w:rFonts w:cs="TimesNewRomanPSMT"/>
-          <w:sz w:val="16"/>
-          <w:szCs w:val="16"/>
+          <w:lang w:val="en-US"/>
+        </w:rPr>
+      </w:pPr>
+      <w:r>
+        <w:rPr>
+          <w:rFonts w:cs="TimesNewRomanPSMT"/>
+          <w:sz w:val="16"/>
+          <w:szCs w:val="16"/>
+          <w:lang w:val="en-US"/>
         </w:rPr>
         <w:t xml:space="preserve">{{ </w:t>
       </w:r>
@@ -5014,6 +5155,7 @@
           <w:rFonts w:cs="TimesNewRomanPSMT"/>
           <w:sz w:val="16"/>
           <w:szCs w:val="16"/>
+          <w:lang w:val="en-US"/>
         </w:rPr>
         <w:t>displayed_annexes.append</w:t>
       </w:r>
@@ -5023,6 +5165,7 @@
           <w:rFonts w:cs="TimesNewRomanPSMT"/>
           <w:sz w:val="16"/>
           <w:szCs w:val="16"/>
+          <w:lang w:val="en-US"/>
         </w:rPr>
         <w:t>('combles') or '' }}</w:t>
       </w:r>
@@ -5037,6 +5180,7 @@
           <w:rFonts w:cs="TimesNewRomanPSMT"/>
           <w:sz w:val="16"/>
           <w:szCs w:val="16"/>
+          <w:lang w:val="en-US"/>
         </w:rPr>
         <w:t xml:space="preserve"> </w:t>
       </w:r>
@@ -5142,13 +5286,15 @@
           <w:rFonts w:cs="TimesNewRomanPSMT"/>
           <w:sz w:val="16"/>
           <w:szCs w:val="16"/>
-        </w:rPr>
-      </w:pPr>
-      <w:r>
-        <w:rPr>
-          <w:rFonts w:cs="TimesNewRomanPSMT"/>
-          <w:sz w:val="16"/>
-          <w:szCs w:val="16"/>
+          <w:lang w:val="en-US"/>
+        </w:rPr>
+      </w:pPr>
+      <w:r>
+        <w:rPr>
+          <w:rFonts w:cs="TimesNewRomanPSMT"/>
+          <w:sz w:val="16"/>
+          <w:szCs w:val="16"/>
+          <w:lang w:val="en-US"/>
         </w:rPr>
         <w:t xml:space="preserve">{%- if </w:t>
       </w:r>
@@ -5158,6 +5304,7 @@
           <w:rFonts w:cs="TimesNewRomanPSMT"/>
           <w:sz w:val="16"/>
           <w:szCs w:val="16"/>
+          <w:lang w:val="en-US"/>
         </w:rPr>
         <w:t>lot.annexe_balcons</w:t>
       </w:r>
@@ -5167,15 +5314,37 @@
           <w:rFonts w:cs="TimesNewRomanPSMT"/>
           <w:sz w:val="16"/>
           <w:szCs w:val="16"/>
-        </w:rPr>
-        <w:t xml:space="preserve"> and 'balcons' not in </w:t>
-      </w:r>
-      <w:proofErr w:type="spellStart"/>
-      <w:r>
-        <w:rPr>
-          <w:rFonts w:cs="TimesNewRomanPSMT"/>
-          <w:sz w:val="16"/>
-          <w:szCs w:val="16"/>
+          <w:lang w:val="en-US"/>
+        </w:rPr>
+        <w:t xml:space="preserve"> and '</w:t>
+      </w:r>
+      <w:proofErr w:type="spellStart"/>
+      <w:r>
+        <w:rPr>
+          <w:rFonts w:cs="TimesNewRomanPSMT"/>
+          <w:sz w:val="16"/>
+          <w:szCs w:val="16"/>
+          <w:lang w:val="en-US"/>
+        </w:rPr>
+        <w:t>balcons</w:t>
+      </w:r>
+      <w:proofErr w:type="spellEnd"/>
+      <w:r>
+        <w:rPr>
+          <w:rFonts w:cs="TimesNewRomanPSMT"/>
+          <w:sz w:val="16"/>
+          <w:szCs w:val="16"/>
+          <w:lang w:val="en-US"/>
+        </w:rPr>
+        <w:t xml:space="preserve">' not in </w:t>
+      </w:r>
+      <w:proofErr w:type="spellStart"/>
+      <w:r>
+        <w:rPr>
+          <w:rFonts w:cs="TimesNewRomanPSMT"/>
+          <w:sz w:val="16"/>
+          <w:szCs w:val="16"/>
+          <w:lang w:val="en-US"/>
         </w:rPr>
         <w:t>displayed_annexes</w:t>
       </w:r>
@@ -5185,6 +5354,7 @@
           <w:rFonts w:cs="TimesNewRomanPSMT"/>
           <w:sz w:val="16"/>
           <w:szCs w:val="16"/>
+          <w:lang w:val="en-US"/>
         </w:rPr>
         <w:t xml:space="preserve"> %}</w:t>
       </w:r>
@@ -5197,13 +5367,15 @@
           <w:rFonts w:cs="TimesNewRomanPSMT"/>
           <w:sz w:val="16"/>
           <w:szCs w:val="16"/>
-        </w:rPr>
-      </w:pPr>
-      <w:r>
-        <w:rPr>
-          <w:rFonts w:cs="TimesNewRomanPSMT"/>
-          <w:sz w:val="16"/>
-          <w:szCs w:val="16"/>
+          <w:lang w:val="en-US"/>
+        </w:rPr>
+      </w:pPr>
+      <w:r>
+        <w:rPr>
+          <w:rFonts w:cs="TimesNewRomanPSMT"/>
+          <w:sz w:val="16"/>
+          <w:szCs w:val="16"/>
+          <w:lang w:val="en-US"/>
         </w:rPr>
         <w:t xml:space="preserve">{{ </w:t>
       </w:r>
@@ -5213,6 +5385,7 @@
           <w:rFonts w:cs="TimesNewRomanPSMT"/>
           <w:sz w:val="16"/>
           <w:szCs w:val="16"/>
+          <w:lang w:val="en-US"/>
         </w:rPr>
         <w:t>displayed_annexes.append</w:t>
       </w:r>
@@ -5222,20 +5395,45 @@
           <w:rFonts w:cs="TimesNewRomanPSMT"/>
           <w:sz w:val="16"/>
           <w:szCs w:val="16"/>
-        </w:rPr>
-        <w:t>('balcons') or '' }}</w:t>
+          <w:lang w:val="en-US"/>
+        </w:rPr>
+        <w:t>('</w:t>
+      </w:r>
+      <w:proofErr w:type="spellStart"/>
+      <w:r>
+        <w:rPr>
+          <w:rFonts w:cs="TimesNewRomanPSMT"/>
+          <w:sz w:val="16"/>
+          <w:szCs w:val="16"/>
+          <w:lang w:val="en-US"/>
+        </w:rPr>
+        <w:t>balcons</w:t>
+      </w:r>
+      <w:proofErr w:type="spellEnd"/>
+      <w:r>
+        <w:rPr>
+          <w:rFonts w:cs="TimesNewRomanPSMT"/>
+          <w:sz w:val="16"/>
+          <w:szCs w:val="16"/>
+          <w:lang w:val="en-US"/>
+        </w:rPr>
+        <w:t>') or '' }}</w:t>
       </w:r>
     </w:p>
     <w:p>
       <w:pPr>
         <w:ind w:firstLine="708"/>
         <w:jc w:val="both"/>
-      </w:pPr>
-      <w:r>
-        <w:rPr>
-          <w:rFonts w:cs="TimesNewRomanPSMT"/>
-          <w:sz w:val="16"/>
-          <w:szCs w:val="16"/>
+        <w:rPr>
+          <w:lang w:val="en-US"/>
+        </w:rPr>
+      </w:pPr>
+      <w:r>
+        <w:rPr>
+          <w:rFonts w:cs="TimesNewRomanPSMT"/>
+          <w:sz w:val="16"/>
+          <w:szCs w:val="16"/>
+          <w:lang w:val="en-US"/>
         </w:rPr>
         <w:t xml:space="preserve"> </w:t>
       </w:r>
@@ -5257,6 +5455,7 @@
         <w:rPr>
           <w:sz w:val="16"/>
           <w:szCs w:val="16"/>
+          <w:lang w:val="en-US"/>
         </w:rPr>
         <w:instrText xml:space="preserve"> FORMCHECKBOX </w:instrText>
       </w:r>
@@ -5291,46 +5490,36 @@
           <w:rFonts w:cs="TimesNewRomanPSMT"/>
           <w:sz w:val="16"/>
           <w:szCs w:val="16"/>
+          <w:lang w:val="en-US"/>
         </w:rPr>
         <w:t xml:space="preserve"> </w:t>
       </w:r>
-      <w:r>
-        <w:rPr>
-          <w:rFonts w:cs="TimesNewRomanPSMT"/>
+      <w:proofErr w:type="spellStart"/>
+      <w:r>
+        <w:rPr>
+          <w:rFonts w:cs="TimesNewRomanPSMT"/>
+          <w:lang w:val="en-US"/>
         </w:rPr>
         <w:t>Balcons</w:t>
       </w:r>
+      <w:proofErr w:type="spellEnd"/>
     </w:p>
     <w:p>
       <w:pPr>
         <w:ind w:firstLine="708"/>
         <w:jc w:val="both"/>
-      </w:pPr>
-      <w:r>
-        <w:rPr>
-          <w:rFonts w:cs="TimesNewRomanPSMT"/>
-          <w:sz w:val="16"/>
-          <w:szCs w:val="16"/>
-        </w:rPr>
-        <w:t xml:space="preserve">{%- </w:t>
-      </w:r>
-      <w:proofErr w:type="spellStart"/>
-      <w:r>
-        <w:rPr>
-          <w:rFonts w:cs="TimesNewRomanPSMT"/>
-          <w:sz w:val="16"/>
-          <w:szCs w:val="16"/>
-        </w:rPr>
-        <w:t>endif</w:t>
-      </w:r>
-      <w:proofErr w:type="spellEnd"/>
-      <w:r>
-        <w:rPr>
-          <w:rFonts w:cs="TimesNewRomanPSMT"/>
-          <w:sz w:val="16"/>
-          <w:szCs w:val="16"/>
-        </w:rPr>
-        <w:t xml:space="preserve"> %} </w:t>
+        <w:rPr>
+          <w:lang w:val="en-US"/>
+        </w:rPr>
+      </w:pPr>
+      <w:r>
+        <w:rPr>
+          <w:rFonts w:cs="TimesNewRomanPSMT"/>
+          <w:sz w:val="16"/>
+          <w:szCs w:val="16"/>
+          <w:lang w:val="en-US"/>
+        </w:rPr>
+        <w:t xml:space="preserve">{%- endif %} </w:t>
       </w:r>
     </w:p>
     <w:p>
@@ -5341,13 +5530,15 @@
           <w:rFonts w:cs="TimesNewRomanPSMT"/>
           <w:sz w:val="16"/>
           <w:szCs w:val="16"/>
-        </w:rPr>
-      </w:pPr>
-      <w:r>
-        <w:rPr>
-          <w:rFonts w:cs="TimesNewRomanPSMT"/>
-          <w:sz w:val="16"/>
-          <w:szCs w:val="16"/>
+          <w:lang w:val="en-US"/>
+        </w:rPr>
+      </w:pPr>
+      <w:r>
+        <w:rPr>
+          <w:rFonts w:cs="TimesNewRomanPSMT"/>
+          <w:sz w:val="16"/>
+          <w:szCs w:val="16"/>
+          <w:lang w:val="en-US"/>
         </w:rPr>
         <w:t xml:space="preserve">{%- if </w:t>
       </w:r>
@@ -5357,6 +5548,7 @@
           <w:rFonts w:cs="TimesNewRomanPSMT"/>
           <w:sz w:val="16"/>
           <w:szCs w:val="16"/>
+          <w:lang w:val="en-US"/>
         </w:rPr>
         <w:t>lot.annexe_loggias</w:t>
       </w:r>
@@ -5366,6 +5558,7 @@
           <w:rFonts w:cs="TimesNewRomanPSMT"/>
           <w:sz w:val="16"/>
           <w:szCs w:val="16"/>
+          <w:lang w:val="en-US"/>
         </w:rPr>
         <w:t xml:space="preserve"> and 'loggias' not in </w:t>
       </w:r>
@@ -5375,6 +5568,7 @@
           <w:rFonts w:cs="TimesNewRomanPSMT"/>
           <w:sz w:val="16"/>
           <w:szCs w:val="16"/>
+          <w:lang w:val="en-US"/>
         </w:rPr>
         <w:t>displayed_annexes</w:t>
       </w:r>
@@ -5384,6 +5578,7 @@
           <w:rFonts w:cs="TimesNewRomanPSMT"/>
           <w:sz w:val="16"/>
           <w:szCs w:val="16"/>
+          <w:lang w:val="en-US"/>
         </w:rPr>
         <w:t xml:space="preserve"> %}</w:t>
       </w:r>
@@ -5396,13 +5591,15 @@
           <w:rFonts w:cs="TimesNewRomanPSMT"/>
           <w:sz w:val="16"/>
           <w:szCs w:val="16"/>
-        </w:rPr>
-      </w:pPr>
-      <w:r>
-        <w:rPr>
-          <w:rFonts w:cs="TimesNewRomanPSMT"/>
-          <w:sz w:val="16"/>
-          <w:szCs w:val="16"/>
+          <w:lang w:val="en-US"/>
+        </w:rPr>
+      </w:pPr>
+      <w:r>
+        <w:rPr>
+          <w:rFonts w:cs="TimesNewRomanPSMT"/>
+          <w:sz w:val="16"/>
+          <w:szCs w:val="16"/>
+          <w:lang w:val="en-US"/>
         </w:rPr>
         <w:t xml:space="preserve">{{ </w:t>
       </w:r>
@@ -5412,6 +5609,7 @@
           <w:rFonts w:cs="TimesNewRomanPSMT"/>
           <w:sz w:val="16"/>
           <w:szCs w:val="16"/>
+          <w:lang w:val="en-US"/>
         </w:rPr>
         <w:t>displayed_annexes.append</w:t>
       </w:r>
@@ -5421,6 +5619,7 @@
           <w:rFonts w:cs="TimesNewRomanPSMT"/>
           <w:sz w:val="16"/>
           <w:szCs w:val="16"/>
+          <w:lang w:val="en-US"/>
         </w:rPr>
         <w:t>('loggias') or '' }}</w:t>
       </w:r>
@@ -5429,12 +5628,16 @@
       <w:pPr>
         <w:ind w:firstLine="708"/>
         <w:jc w:val="both"/>
-      </w:pPr>
-      <w:r>
-        <w:rPr>
-          <w:rFonts w:cs="TimesNewRomanPSMT"/>
-          <w:sz w:val="16"/>
-          <w:szCs w:val="16"/>
+        <w:rPr>
+          <w:lang w:val="en-US"/>
+        </w:rPr>
+      </w:pPr>
+      <w:r>
+        <w:rPr>
+          <w:rFonts w:cs="TimesNewRomanPSMT"/>
+          <w:sz w:val="16"/>
+          <w:szCs w:val="16"/>
+          <w:lang w:val="en-US"/>
         </w:rPr>
         <w:t xml:space="preserve"> </w:t>
       </w:r>
@@ -5456,6 +5659,7 @@
         <w:rPr>
           <w:sz w:val="16"/>
           <w:szCs w:val="16"/>
+          <w:lang w:val="en-US"/>
         </w:rPr>
         <w:instrText xml:space="preserve"> FORMCHECKBOX </w:instrText>
       </w:r>
@@ -5490,46 +5694,43 @@
           <w:rFonts w:cs="TimesNewRomanPSMT"/>
           <w:sz w:val="16"/>
           <w:szCs w:val="16"/>
+          <w:lang w:val="en-US"/>
         </w:rPr>
         <w:t xml:space="preserve"> </w:t>
       </w:r>
       <w:r>
         <w:rPr>
           <w:rFonts w:cs="TimesNewRomanPSMT"/>
-        </w:rPr>
-        <w:t>Loggias et Vérandas</w:t>
-      </w:r>
+          <w:lang w:val="en-US"/>
+        </w:rPr>
+        <w:t xml:space="preserve">Loggias et </w:t>
+      </w:r>
+      <w:proofErr w:type="spellStart"/>
+      <w:r>
+        <w:rPr>
+          <w:rFonts w:cs="TimesNewRomanPSMT"/>
+          <w:lang w:val="en-US"/>
+        </w:rPr>
+        <w:t>Vérandas</w:t>
+      </w:r>
+      <w:proofErr w:type="spellEnd"/>
     </w:p>
     <w:p>
       <w:pPr>
         <w:ind w:firstLine="708"/>
         <w:jc w:val="both"/>
-      </w:pPr>
-      <w:r>
-        <w:rPr>
-          <w:rFonts w:cs="TimesNewRomanPSMT"/>
-          <w:sz w:val="16"/>
-          <w:szCs w:val="16"/>
-        </w:rPr>
-        <w:t xml:space="preserve">{%- </w:t>
-      </w:r>
-      <w:proofErr w:type="spellStart"/>
-      <w:r>
-        <w:rPr>
-          <w:rFonts w:cs="TimesNewRomanPSMT"/>
-          <w:sz w:val="16"/>
-          <w:szCs w:val="16"/>
-        </w:rPr>
-        <w:t>endif</w:t>
-      </w:r>
-      <w:proofErr w:type="spellEnd"/>
-      <w:r>
-        <w:rPr>
-          <w:rFonts w:cs="TimesNewRomanPSMT"/>
-          <w:sz w:val="16"/>
-          <w:szCs w:val="16"/>
-        </w:rPr>
-        <w:t xml:space="preserve"> %} </w:t>
+        <w:rPr>
+          <w:lang w:val="en-US"/>
+        </w:rPr>
+      </w:pPr>
+      <w:r>
+        <w:rPr>
+          <w:rFonts w:cs="TimesNewRomanPSMT"/>
+          <w:sz w:val="16"/>
+          <w:szCs w:val="16"/>
+          <w:lang w:val="en-US"/>
+        </w:rPr>
+        <w:t xml:space="preserve">{%- endif %} </w:t>
       </w:r>
     </w:p>
     <w:p>
@@ -5540,13 +5741,15 @@
           <w:rFonts w:cs="TimesNewRomanPSMT"/>
           <w:sz w:val="16"/>
           <w:szCs w:val="16"/>
-        </w:rPr>
-      </w:pPr>
-      <w:r>
-        <w:rPr>
-          <w:rFonts w:cs="TimesNewRomanPSMT"/>
-          <w:sz w:val="16"/>
-          <w:szCs w:val="16"/>
+          <w:lang w:val="en-US"/>
+        </w:rPr>
+      </w:pPr>
+      <w:r>
+        <w:rPr>
+          <w:rFonts w:cs="TimesNewRomanPSMT"/>
+          <w:sz w:val="16"/>
+          <w:szCs w:val="16"/>
+          <w:lang w:val="en-US"/>
         </w:rPr>
         <w:t xml:space="preserve">{%- if </w:t>
       </w:r>
@@ -5556,6 +5759,7 @@
           <w:rFonts w:cs="TimesNewRomanPSMT"/>
           <w:sz w:val="16"/>
           <w:szCs w:val="16"/>
+          <w:lang w:val="en-US"/>
         </w:rPr>
         <w:t>lot.annexe_terrasses</w:t>
       </w:r>
@@ -5565,6 +5769,7 @@
           <w:rFonts w:cs="TimesNewRomanPSMT"/>
           <w:sz w:val="16"/>
           <w:szCs w:val="16"/>
+          <w:lang w:val="en-US"/>
         </w:rPr>
         <w:t xml:space="preserve"> and 'terrasses' not in </w:t>
       </w:r>
@@ -5574,6 +5779,7 @@
           <w:rFonts w:cs="TimesNewRomanPSMT"/>
           <w:sz w:val="16"/>
           <w:szCs w:val="16"/>
+          <w:lang w:val="en-US"/>
         </w:rPr>
         <w:t>displayed_annexes</w:t>
       </w:r>
@@ -5583,6 +5789,7 @@
           <w:rFonts w:cs="TimesNewRomanPSMT"/>
           <w:sz w:val="16"/>
           <w:szCs w:val="16"/>
+          <w:lang w:val="en-US"/>
         </w:rPr>
         <w:t xml:space="preserve"> %}</w:t>
       </w:r>
@@ -5595,13 +5802,15 @@
           <w:rFonts w:cs="TimesNewRomanPSMT"/>
           <w:sz w:val="16"/>
           <w:szCs w:val="16"/>
-        </w:rPr>
-      </w:pPr>
-      <w:r>
-        <w:rPr>
-          <w:rFonts w:cs="TimesNewRomanPSMT"/>
-          <w:sz w:val="16"/>
-          <w:szCs w:val="16"/>
+          <w:lang w:val="en-US"/>
+        </w:rPr>
+      </w:pPr>
+      <w:r>
+        <w:rPr>
+          <w:rFonts w:cs="TimesNewRomanPSMT"/>
+          <w:sz w:val="16"/>
+          <w:szCs w:val="16"/>
+          <w:lang w:val="en-US"/>
         </w:rPr>
         <w:t xml:space="preserve">{{ </w:t>
       </w:r>
@@ -5611,6 +5820,7 @@
           <w:rFonts w:cs="TimesNewRomanPSMT"/>
           <w:sz w:val="16"/>
           <w:szCs w:val="16"/>
+          <w:lang w:val="en-US"/>
         </w:rPr>
         <w:t>displayed_annexes.append</w:t>
       </w:r>
@@ -5620,6 +5830,7 @@
           <w:rFonts w:cs="TimesNewRomanPSMT"/>
           <w:sz w:val="16"/>
           <w:szCs w:val="16"/>
+          <w:lang w:val="en-US"/>
         </w:rPr>
         <w:t>('terrasses') or '' }}</w:t>
       </w:r>
@@ -5634,6 +5845,7 @@
           <w:rFonts w:cs="TimesNewRomanPSMT"/>
           <w:sz w:val="16"/>
           <w:szCs w:val="16"/>
+          <w:lang w:val="en-US"/>
         </w:rPr>
         <w:t xml:space="preserve"> </w:t>
       </w:r>
@@ -6928,7 +7140,6 @@
         <w:rPr>
           <w:rFonts w:cs="TimesNewRomanPSMT"/>
           <w:sz w:val="20"/>
-          <w:lang w:val="en-US"/>
         </w:rPr>
         <w:t xml:space="preserve">{% if </w:t>
       </w:r>
@@ -6937,7 +7148,6 @@
         <w:rPr>
           <w:rFonts w:cs="TimesNewRomanPSMT"/>
           <w:sz w:val="20"/>
-          <w:lang w:val="en-US"/>
         </w:rPr>
         <w:t>logements_sans_loyer</w:t>
       </w:r>
@@ -6946,7 +7156,6 @@
         <w:rPr>
           <w:rFonts w:cs="TimesNewRomanPSMT"/>
           <w:sz w:val="20"/>
-          <w:lang w:val="en-US"/>
         </w:rPr>
         <w:t xml:space="preserve"> %}</w:t>
       </w:r>
@@ -6957,7 +7166,6 @@
         <w:rPr>
           <w:rFonts w:cs="TimesNewRomanPSMT"/>
           <w:sz w:val="20"/>
-          <w:lang w:val="en-US"/>
         </w:rPr>
       </w:pPr>
     </w:p>
@@ -8721,7 +8929,6 @@
         <w:rPr>
           <w:rFonts w:cs="TimesNewRomanPSMT"/>
           <w:sz w:val="20"/>
-          <w:lang w:val="en-US"/>
         </w:rPr>
         <w:t xml:space="preserve">{% if </w:t>
       </w:r>
@@ -8730,7 +8937,6 @@
         <w:rPr>
           <w:rFonts w:cs="TimesNewRomanPSMT"/>
           <w:sz w:val="20"/>
-          <w:lang w:val="en-US"/>
         </w:rPr>
         <w:t>logements_corrigee_sans_loyer</w:t>
       </w:r>
@@ -8739,7 +8945,6 @@
         <w:rPr>
           <w:rFonts w:cs="TimesNewRomanPSMT"/>
           <w:sz w:val="20"/>
-          <w:lang w:val="en-US"/>
         </w:rPr>
         <w:t xml:space="preserve"> %}</w:t>
       </w:r>
@@ -8750,7 +8955,6 @@
         <w:rPr>
           <w:rFonts w:cs="TimesNewRomanPSMT"/>
           <w:sz w:val="20"/>
-          <w:lang w:val="en-US"/>
         </w:rPr>
       </w:pPr>
     </w:p>
@@ -10461,13 +10665,11 @@
       <w:pPr>
         <w:rPr>
           <w:rFonts w:cs="TimesNewRomanPSMT"/>
-          <w:lang w:val="en-US"/>
-        </w:rPr>
-      </w:pPr>
-      <w:r>
-        <w:rPr>
-          <w:rFonts w:cs="TimesNewRomanPSMT"/>
-          <w:lang w:val="en-US"/>
+        </w:rPr>
+      </w:pPr>
+      <w:r>
+        <w:rPr>
+          <w:rFonts w:cs="TimesNewRomanPSMT"/>
         </w:rPr>
         <w:t xml:space="preserve">{% if </w:t>
       </w:r>
@@ -10475,7 +10677,6 @@
       <w:r>
         <w:rPr>
           <w:rFonts w:cs="TimesNewRomanPSMT"/>
-          <w:lang w:val="en-US"/>
         </w:rPr>
         <w:t>avenant_type_edd</w:t>
       </w:r>
@@ -10483,7 +10684,6 @@
       <w:r>
         <w:rPr>
           <w:rFonts w:cs="TimesNewRomanPSMT"/>
-          <w:lang w:val="en-US"/>
         </w:rPr>
         <w:t xml:space="preserve"> %}</w:t>
       </w:r>
@@ -10520,18 +10720,13 @@
       </w:pPr>
     </w:p>
     <w:p>
-      <w:pPr>
-        <w:rPr>
-          <w:lang w:val="en-US"/>
-        </w:rPr>
-      </w:pPr>
-      <w:r>
-        <w:rPr>
-          <w:rFonts w:cs="TimesNewRomanPSMT"/>
-          <w:lang w:val="en-US"/>
+      <w:r>
+        <w:rPr>
+          <w:rFonts w:cs="TimesNewRomanPSMT"/>
         </w:rPr>
         <w:t xml:space="preserve">{% if </w:t>
       </w:r>
+      <w:proofErr w:type="spellStart"/>
       <w:r>
         <w:rPr>
           <w:rFonts w:cs="TimesNewRomanPSMT"/>
@@ -10541,23 +10736,13 @@
       <w:r>
         <w:rPr>
           <w:rFonts w:cs="TimesNewRomanPSMT"/>
-          <w:lang w:val="en-US"/>
-        </w:rPr>
-        <w:t>.</w:t>
-      </w:r>
-      <w:proofErr w:type="spellStart"/>
-      <w:r>
-        <w:rPr>
-          <w:rFonts w:cs="TimesNewRomanPSMT"/>
-          <w:lang w:val="en-US"/>
-        </w:rPr>
-        <w:t>edd_volumetrique_text</w:t>
-      </w:r>
-      <w:proofErr w:type="spellEnd"/>
-      <w:r>
-        <w:rPr>
-          <w:rFonts w:cs="TimesNewRomanPSMT"/>
-          <w:lang w:val="en-US"/>
+        </w:rPr>
+        <w:t>.edd_volumetrique_text</w:t>
+      </w:r>
+      <w:proofErr w:type="spellEnd"/>
+      <w:r>
+        <w:rPr>
+          <w:rFonts w:cs="TimesNewRomanPSMT"/>
         </w:rPr>
         <w:t>()|</w:t>
       </w:r>
@@ -10565,7 +10750,6 @@
       <w:r>
         <w:rPr>
           <w:rFonts w:cs="TimesNewRomanPSMT"/>
-          <w:lang w:val="en-US"/>
         </w:rPr>
         <w:t>len</w:t>
       </w:r>
@@ -10573,24 +10757,18 @@
       <w:r>
         <w:rPr>
           <w:rFonts w:cs="TimesNewRomanPSMT"/>
-          <w:lang w:val="en-US"/>
         </w:rPr>
         <w:t xml:space="preserve"> %}</w:t>
       </w:r>
     </w:p>
     <w:p>
-      <w:pPr>
-        <w:rPr>
-          <w:lang w:val="en-US"/>
-        </w:rPr>
-      </w:pPr>
-      <w:r>
-        <w:rPr>
-          <w:rFonts w:cs="TimesNewRomanPSMT"/>
-          <w:lang w:val="en-US"/>
+      <w:r>
+        <w:rPr>
+          <w:rFonts w:cs="TimesNewRomanPSMT"/>
         </w:rPr>
         <w:t xml:space="preserve">{{ </w:t>
       </w:r>
+      <w:proofErr w:type="spellStart"/>
       <w:r>
         <w:rPr>
           <w:rFonts w:cs="TimesNewRomanPSMT"/>
@@ -10600,23 +10778,13 @@
       <w:r>
         <w:rPr>
           <w:rFonts w:cs="TimesNewRomanPSMT"/>
-          <w:lang w:val="en-US"/>
-        </w:rPr>
-        <w:t>.</w:t>
-      </w:r>
-      <w:proofErr w:type="spellStart"/>
-      <w:r>
-        <w:rPr>
-          <w:rFonts w:cs="TimesNewRomanPSMT"/>
-          <w:lang w:val="en-US"/>
-        </w:rPr>
-        <w:t>edd_volumetrique_text</w:t>
-      </w:r>
-      <w:proofErr w:type="spellEnd"/>
-      <w:r>
-        <w:rPr>
-          <w:rFonts w:cs="TimesNewRomanPSMT"/>
-          <w:lang w:val="en-US"/>
+        </w:rPr>
+        <w:t>.edd_volumetrique_text</w:t>
+      </w:r>
+      <w:proofErr w:type="spellEnd"/>
+      <w:r>
+        <w:rPr>
+          <w:rFonts w:cs="TimesNewRomanPSMT"/>
         </w:rPr>
         <w:t>() }}</w:t>
       </w:r>
@@ -10624,23 +10792,30 @@
       <w:bookmarkEnd w:id="50"/>
     </w:p>
     <w:p>
-      <w:pPr>
-        <w:rPr>
-          <w:lang w:val="en-US"/>
-        </w:rPr>
-      </w:pPr>
-      <w:r>
-        <w:rPr>
-          <w:rFonts w:cs="TimesNewRomanPSMT"/>
-          <w:lang w:val="en-US"/>
-        </w:rPr>
-        <w:t xml:space="preserve">{% endif %}{% for image in </w:t>
-      </w:r>
-      <w:proofErr w:type="spellStart"/>
-      <w:r>
-        <w:rPr>
-          <w:rFonts w:cs="TimesNewRomanPSMT"/>
-          <w:lang w:val="en-US"/>
+      <w:r>
+        <w:rPr>
+          <w:rFonts w:cs="TimesNewRomanPSMT"/>
+        </w:rPr>
+        <w:t xml:space="preserve">{% </w:t>
+      </w:r>
+      <w:proofErr w:type="spellStart"/>
+      <w:r>
+        <w:rPr>
+          <w:rFonts w:cs="TimesNewRomanPSMT"/>
+        </w:rPr>
+        <w:t>endif</w:t>
+      </w:r>
+      <w:proofErr w:type="spellEnd"/>
+      <w:r>
+        <w:rPr>
+          <w:rFonts w:cs="TimesNewRomanPSMT"/>
+        </w:rPr>
+        <w:t xml:space="preserve"> %}{% for image in </w:t>
+      </w:r>
+      <w:proofErr w:type="spellStart"/>
+      <w:r>
+        <w:rPr>
+          <w:rFonts w:cs="TimesNewRomanPSMT"/>
         </w:rPr>
         <w:t>edd_volumetrique_images</w:t>
       </w:r>
@@ -10648,35 +10823,22 @@
       <w:r>
         <w:rPr>
           <w:rFonts w:cs="TimesNewRomanPSMT"/>
-          <w:lang w:val="en-US"/>
         </w:rPr>
         <w:t xml:space="preserve"> %}</w:t>
       </w:r>
     </w:p>
     <w:p>
-      <w:pPr>
-        <w:rPr>
-          <w:lang w:val="en-US"/>
-        </w:rPr>
-      </w:pPr>
-      <w:r>
-        <w:rPr>
-          <w:rFonts w:cs="TimesNewRomanPSMT"/>
-          <w:lang w:val="en-US"/>
+      <w:r>
+        <w:rPr>
+          <w:rFonts w:cs="TimesNewRomanPSMT"/>
         </w:rPr>
         <w:t>{{image}}</w:t>
       </w:r>
     </w:p>
     <w:p>
-      <w:pPr>
-        <w:rPr>
-          <w:lang w:val="en-US"/>
-        </w:rPr>
-      </w:pPr>
-      <w:r>
-        <w:rPr>
-          <w:rFonts w:cs="TimesNewRomanPSMT"/>
-          <w:lang w:val="en-US"/>
+      <w:r>
+        <w:rPr>
+          <w:rFonts w:cs="TimesNewRomanPSMT"/>
         </w:rPr>
         <w:t xml:space="preserve">{% </w:t>
       </w:r>
@@ -10684,7 +10846,6 @@
       <w:r>
         <w:rPr>
           <w:rFonts w:cs="TimesNewRomanPSMT"/>
-          <w:lang w:val="en-US"/>
         </w:rPr>
         <w:t>endfor</w:t>
       </w:r>
@@ -10692,7 +10853,6 @@
       <w:r>
         <w:rPr>
           <w:rFonts w:cs="TimesNewRomanPSMT"/>
-          <w:lang w:val="en-US"/>
         </w:rPr>
         <w:t xml:space="preserve"> %}{% if </w:t>
       </w:r>
@@ -10700,7 +10860,6 @@
       <w:r>
         <w:rPr>
           <w:rFonts w:cs="TimesNewRomanPSMT"/>
-          <w:lang w:val="en-US"/>
         </w:rPr>
         <w:t>programme.mention_publication_edd_volumetrique</w:t>
       </w:r>
@@ -10708,7 +10867,6 @@
       <w:r>
         <w:rPr>
           <w:rFonts w:cs="TimesNewRomanPSMT"/>
-          <w:lang w:val="en-US"/>
         </w:rPr>
         <w:t xml:space="preserve"> %}</w:t>
       </w:r>
@@ -10736,18 +10894,27 @@
       </w:r>
     </w:p>
     <w:p>
-      <w:pPr>
-        <w:rPr>
-          <w:lang w:val="en-US"/>
-        </w:rPr>
-      </w:pPr>
-      <w:r>
-        <w:rPr>
-          <w:rFonts w:cs="TimesNewRomanPSMT"/>
-          <w:lang w:val="en-US"/>
-        </w:rPr>
-        <w:t xml:space="preserve">{% endif %}{% if </w:t>
-      </w:r>
+      <w:r>
+        <w:rPr>
+          <w:rFonts w:cs="TimesNewRomanPSMT"/>
+        </w:rPr>
+        <w:t xml:space="preserve">{% </w:t>
+      </w:r>
+      <w:proofErr w:type="spellStart"/>
+      <w:r>
+        <w:rPr>
+          <w:rFonts w:cs="TimesNewRomanPSMT"/>
+        </w:rPr>
+        <w:t>endif</w:t>
+      </w:r>
+      <w:proofErr w:type="spellEnd"/>
+      <w:r>
+        <w:rPr>
+          <w:rFonts w:cs="TimesNewRomanPSMT"/>
+        </w:rPr>
+        <w:t xml:space="preserve"> %}{% if </w:t>
+      </w:r>
+      <w:proofErr w:type="spellStart"/>
       <w:r>
         <w:rPr>
           <w:rFonts w:cs="TimesNewRomanPSMT"/>
@@ -10757,23 +10924,13 @@
       <w:r>
         <w:rPr>
           <w:rFonts w:cs="TimesNewRomanPSMT"/>
-          <w:lang w:val="en-US"/>
-        </w:rPr>
-        <w:t>.</w:t>
-      </w:r>
-      <w:proofErr w:type="spellStart"/>
-      <w:r>
-        <w:rPr>
-          <w:rFonts w:cs="TimesNewRomanPSMT"/>
-          <w:lang w:val="en-US"/>
-        </w:rPr>
-        <w:t>edd_classique_text</w:t>
-      </w:r>
-      <w:proofErr w:type="spellEnd"/>
-      <w:r>
-        <w:rPr>
-          <w:rFonts w:cs="TimesNewRomanPSMT"/>
-          <w:lang w:val="en-US"/>
+        </w:rPr>
+        <w:t>.edd_classique_text</w:t>
+      </w:r>
+      <w:proofErr w:type="spellEnd"/>
+      <w:r>
+        <w:rPr>
+          <w:rFonts w:cs="TimesNewRomanPSMT"/>
         </w:rPr>
         <w:t>()|</w:t>
       </w:r>
@@ -10781,7 +10938,6 @@
       <w:r>
         <w:rPr>
           <w:rFonts w:cs="TimesNewRomanPSMT"/>
-          <w:lang w:val="en-US"/>
         </w:rPr>
         <w:t>len</w:t>
       </w:r>
@@ -10789,24 +10945,18 @@
       <w:r>
         <w:rPr>
           <w:rFonts w:cs="TimesNewRomanPSMT"/>
-          <w:lang w:val="en-US"/>
         </w:rPr>
         <w:t xml:space="preserve"> %}</w:t>
       </w:r>
     </w:p>
     <w:p>
-      <w:pPr>
-        <w:rPr>
-          <w:lang w:val="en-US"/>
-        </w:rPr>
-      </w:pPr>
-      <w:r>
-        <w:rPr>
-          <w:rFonts w:cs="TimesNewRomanPSMT"/>
-          <w:lang w:val="en-US"/>
+      <w:r>
+        <w:rPr>
+          <w:rFonts w:cs="TimesNewRomanPSMT"/>
         </w:rPr>
         <w:t xml:space="preserve">{{ </w:t>
       </w:r>
+      <w:proofErr w:type="spellStart"/>
       <w:r>
         <w:rPr>
           <w:rFonts w:cs="TimesNewRomanPSMT"/>
@@ -10816,23 +10966,13 @@
       <w:r>
         <w:rPr>
           <w:rFonts w:cs="TimesNewRomanPSMT"/>
-          <w:lang w:val="en-US"/>
-        </w:rPr>
-        <w:t>.</w:t>
-      </w:r>
-      <w:proofErr w:type="spellStart"/>
-      <w:r>
-        <w:rPr>
-          <w:rFonts w:cs="TimesNewRomanPSMT"/>
-          <w:lang w:val="en-US"/>
-        </w:rPr>
-        <w:t>edd_classique_text</w:t>
-      </w:r>
-      <w:proofErr w:type="spellEnd"/>
-      <w:r>
-        <w:rPr>
-          <w:rFonts w:cs="TimesNewRomanPSMT"/>
-          <w:lang w:val="en-US"/>
+        </w:rPr>
+        <w:t>.edd_classique_text</w:t>
+      </w:r>
+      <w:proofErr w:type="spellEnd"/>
+      <w:r>
+        <w:rPr>
+          <w:rFonts w:cs="TimesNewRomanPSMT"/>
         </w:rPr>
         <w:t>() }}</w:t>
       </w:r>
@@ -11938,13 +12078,7 @@
         <w:rPr>
           <w:rFonts w:cs="TimesNewRomanPSMT"/>
         </w:rPr>
-        <w:t>Organisme financeur</w:t>
-      </w:r>
-      <w:r>
-        <w:rPr>
-          <w:rFonts w:cs="TimesNewRomanPSMT"/>
-        </w:rPr>
-        <w:t xml:space="preserve"> : {{ </w:t>
+        <w:t xml:space="preserve">Organisme financeur : {{ </w:t>
       </w:r>
       <w:proofErr w:type="spellStart"/>
       <w:r>
@@ -11968,7 +12102,6 @@
       <w:r>
         <w:rPr>
           <w:rFonts w:cs="TimesNewRomanPSMT"/>
-          <w:lang w:val="en-US"/>
         </w:rPr>
         <w:t xml:space="preserve">{% </w:t>
       </w:r>
@@ -11976,7 +12109,6 @@
       <w:r>
         <w:rPr>
           <w:rFonts w:cs="TimesNewRomanPSMT"/>
-          <w:lang w:val="en-US"/>
         </w:rPr>
         <w:t>endfor</w:t>
       </w:r>
@@ -11984,7 +12116,6 @@
       <w:r>
         <w:rPr>
           <w:rFonts w:cs="TimesNewRomanPSMT"/>
-          <w:lang w:val="en-US"/>
         </w:rPr>
         <w:t xml:space="preserve"> %}</w:t>
       </w:r>
@@ -12381,13 +12512,7 @@
         <w:rPr>
           <w:rFonts w:cs="TimesNewRomanPSMT"/>
         </w:rPr>
-        <w:t>Organisme financeur </w:t>
-      </w:r>
-      <w:r>
-        <w:rPr>
-          <w:rFonts w:cs="TimesNewRomanPSMT"/>
-        </w:rPr>
-        <w:t xml:space="preserve">: {{ </w:t>
+        <w:t xml:space="preserve">Organisme financeur : {{ </w:t>
       </w:r>
       <w:proofErr w:type="spellStart"/>
       <w:r>
@@ -13849,12 +13974,12 @@
     </w:p>
     <w:p/>
     <w:sectPr>
-      <w:headerReference w:type="even" r:id="rId7"/>
-      <w:headerReference w:type="default" r:id="rId8"/>
-      <w:footerReference w:type="even" r:id="rId9"/>
-      <w:footerReference w:type="default" r:id="rId10"/>
-      <w:headerReference w:type="first" r:id="rId11"/>
-      <w:footerReference w:type="first" r:id="rId12"/>
+      <w:headerReference w:type="even" r:id="rId8"/>
+      <w:headerReference w:type="default" r:id="rId9"/>
+      <w:footerReference w:type="even" r:id="rId10"/>
+      <w:footerReference w:type="default" r:id="rId11"/>
+      <w:headerReference w:type="first" r:id="rId12"/>
+      <w:footerReference w:type="first" r:id="rId13"/>
       <w:pgSz w:w="11906" w:h="16838"/>
       <w:pgMar w:top="1418" w:right="703" w:bottom="1418" w:left="2926" w:header="284" w:footer="720" w:gutter="0"/>
       <w:pgBorders>
@@ -14404,6 +14529,41 @@
 
 <file path=word/header3.xml><?xml version="1.0" encoding="utf-8"?>
 <w:hdr xmlns:wpc="http://schemas.microsoft.com/office/word/2010/wordprocessingCanvas" xmlns:cx="http://schemas.microsoft.com/office/drawing/2014/chartex" xmlns:cx1="http://schemas.microsoft.com/office/drawing/2015/9/8/chartex" xmlns:cx2="http://schemas.microsoft.com/office/drawing/2015/10/21/chartex" xmlns:cx3="http://schemas.microsoft.com/office/drawing/2016/5/9/chartex" xmlns:cx4="http://schemas.microsoft.com/office/drawing/2016/5/10/chartex" xmlns:cx5="http://schemas.microsoft.com/office/drawing/2016/5/11/chartex" xmlns:cx6="http://schemas.microsoft.com/office/drawing/2016/5/12/chartex" xmlns:cx7="http://schemas.microsoft.com/office/drawing/2016/5/13/chartex" xmlns:cx8="http://schemas.microsoft.com/office/drawing/2016/5/14/chartex" xmlns:mc="http://schemas.openxmlformats.org/markup-compatibility/2006" xmlns:aink="http://schemas.microsoft.com/office/drawing/2016/ink" xmlns:am3d="http://schemas.microsoft.com/office/drawing/2017/model3d" xmlns:o="urn:schemas-microsoft-com:office:office" xmlns:oel="http://schemas.microsoft.com/office/2019/extlst" xmlns:r="http://schemas.openxmlformats.org/officeDocument/2006/relationships" xmlns:m="http://schemas.openxmlformats.org/officeDocument/2006/math" xmlns:v="urn:schemas-microsoft-com:vml" xmlns:wp14="http://schemas.microsoft.com/office/word/2010/wordprocessingDrawing" xmlns:wp="http://schemas.openxmlformats.org/drawingml/2006/wordprocessingDrawing" xmlns:w10="urn:schemas-microsoft-com:office:word" xmlns:w="http://schemas.openxmlformats.org/wordprocessingml/2006/main" xmlns:w14="http://schemas.microsoft.com/office/word/2010/wordml" xmlns:w15="http://schemas.microsoft.com/office/word/2012/wordml" xmlns:w16cex="http://schemas.microsoft.com/office/word/2018/wordml/cex" xmlns:w16cid="http://schemas.microsoft.com/office/word/2016/wordml/cid" xmlns:w16="http://schemas.microsoft.com/office/word/2018/wordml" xmlns:w16du="http://schemas.microsoft.com/office/word/2023/wordml/word16du" xmlns:w16sdtdh="http://schemas.microsoft.com/office/word/2020/wordml/sdtdatahash" xmlns:w16sdtfl="http://schemas.microsoft.com/office/word/2024/wordml/sdtformatlock" xmlns:w16se="http://schemas.microsoft.com/office/word/2015/wordml/symex" xmlns:wpg="http://schemas.microsoft.com/office/word/2010/wordprocessingGroup" xmlns:wpi="http://schemas.microsoft.com/office/word/2010/wordprocessingInk" xmlns:wne="http://schemas.microsoft.com/office/word/2006/wordml" xmlns:wps="http://schemas.microsoft.com/office/word/2010/wordprocessingShape" mc:Ignorable="w14 w15 w16se w16cid w16 w16cex w16sdtdh w16sdtfl w16du wp14">
+  <w:p>
+    <w:pPr>
+      <w:rPr>
+        <w:sz w:val="22"/>
+        <w:szCs w:val="22"/>
+        <w:lang w:val="en-US"/>
+      </w:rPr>
+    </w:pPr>
+    <w:r>
+      <w:rPr>
+        <w:sz w:val="22"/>
+        <w:szCs w:val="22"/>
+        <w:lang w:val="en-US"/>
+      </w:rPr>
+      <w:t xml:space="preserve">{% if </w:t>
+    </w:r>
+    <w:proofErr w:type="spellStart"/>
+    <w:r>
+      <w:rPr>
+        <w:sz w:val="22"/>
+        <w:szCs w:val="22"/>
+        <w:lang w:val="en-US"/>
+      </w:rPr>
+      <w:t>can_be_published</w:t>
+    </w:r>
+    <w:proofErr w:type="spellEnd"/>
+    <w:r>
+      <w:rPr>
+        <w:sz w:val="22"/>
+        <w:szCs w:val="22"/>
+        <w:lang w:val="en-US"/>
+      </w:rPr>
+      <w:t xml:space="preserve"> %}</w:t>
+    </w:r>
+  </w:p>
   <w:tbl>
     <w:tblPr>
       <w:tblStyle w:val="Grilledutableau"/>
@@ -14436,6 +14596,7 @@
             <w:rPr>
               <w:sz w:val="12"/>
               <w:szCs w:val="12"/>
+              <w:lang w:val="en-US"/>
             </w:rPr>
           </w:pPr>
         </w:p>
@@ -14889,10 +15050,38 @@
             <w:t>TOTAL</w:t>
           </w:r>
         </w:p>
-        <w:p/>
+        <w:p>
+          <w:pPr>
+            <w:pStyle w:val="En-tte"/>
+            <w:tabs>
+              <w:tab w:val="clear" w:pos="4536"/>
+              <w:tab w:val="clear" w:pos="9072"/>
+            </w:tabs>
+          </w:pPr>
+        </w:p>
       </w:tc>
     </w:tr>
   </w:tbl>
+  <w:p>
+    <w:pPr>
+      <w:pStyle w:val="En-tte"/>
+      <w:tabs>
+        <w:tab w:val="clear" w:pos="4536"/>
+        <w:tab w:val="clear" w:pos="9072"/>
+      </w:tabs>
+    </w:pPr>
+    <w:r>
+      <w:t xml:space="preserve">{% </w:t>
+    </w:r>
+    <w:proofErr w:type="spellStart"/>
+    <w:r>
+      <w:t>endif</w:t>
+    </w:r>
+    <w:proofErr w:type="spellEnd"/>
+    <w:r>
+      <w:t xml:space="preserve"> %}</w:t>
+    </w:r>
+  </w:p>
   <w:p>
     <w:pPr>
       <w:pStyle w:val="En-tte"/>
@@ -16965,6 +17154,7 @@
   <w:style w:type="paragraph" w:styleId="En-tte">
     <w:name w:val="header"/>
     <w:basedOn w:val="Normal"/>
+    <w:link w:val="En-tteCar"/>
     <w:pPr>
       <w:tabs>
         <w:tab w:val="center" w:pos="4536"/>
@@ -17512,6 +17702,16 @@
       </w:tblBorders>
     </w:tblPr>
   </w:style>
+  <w:style w:type="character" w:customStyle="1" w:styleId="En-tteCar">
+    <w:name w:val="En-tête Car"/>
+    <w:basedOn w:val="Policepardfaut"/>
+    <w:link w:val="En-tte"/>
+    <w:rsid w:val="002866DF"/>
+    <w:rPr>
+      <w:sz w:val="24"/>
+      <w:lang w:eastAsia="zh-CN"/>
+    </w:rPr>
+  </w:style>
 </w:styles>
 </file>
 
@@ -17808,4 +18008,16 @@
     </a:ext>
   </a:extLst>
 </a:theme>
+</file>
+
+<file path=customXml/item1.xml><?xml version="1.0" encoding="utf-8"?>
+<b:Sources xmlns:b="http://schemas.openxmlformats.org/officeDocument/2006/bibliography" xmlns="http://schemas.openxmlformats.org/officeDocument/2006/bibliography" SelectedStyle="\APASixthEditionOfficeOnline.xsl" StyleName="APA" Version="6"/>
+</file>
+
+<file path=customXml/itemProps1.xml><?xml version="1.0" encoding="utf-8"?>
+<ds:datastoreItem xmlns:ds="http://schemas.openxmlformats.org/officeDocument/2006/customXml" ds:itemID="{9805C05D-F7F7-4043-BC43-4E5E865F4A1D}">
+  <ds:schemaRefs>
+    <ds:schemaRef ds:uri="http://schemas.openxmlformats.org/officeDocument/2006/bibliography"/>
+  </ds:schemaRefs>
+</ds:datastoreItem>
 </file>
</xml_diff>

<commit_message>
AM306 - affichage dynamique de l'entete publication fonciere (#2204)
* affichage dynamique entete publication fonciere

* fix test

---------

Co-authored-by: adrien.abescat <adrien.abescat@sullly-group.fr>
Co-authored-by: adrien.abescat <adrien.abescat@sully-group.fr>
</commit_message>
<xml_diff>
--- a/documents/Avenant-template.docx
+++ b/documents/Avenant-template.docx
@@ -737,6 +737,7 @@
         <w:rPr>
           <w:rFonts w:cs="TimesNewRomanPSMT"/>
         </w:rPr>
+        <w:lastRenderedPageBreak/>
         <w:t>sont convenus de ce qui suit :</w:t>
       </w:r>
     </w:p>
@@ -3486,21 +3487,30 @@
     <w:p>
       <w:pPr>
         <w:jc w:val="both"/>
+        <w:rPr>
+          <w:lang w:val="en-US"/>
+        </w:rPr>
       </w:pPr>
       <w:bookmarkStart w:id="16" w:name="_Hlk213411565"/>
       <w:r>
+        <w:rPr>
+          <w:lang w:val="en-US"/>
+        </w:rPr>
         <w:t xml:space="preserve">{% set </w:t>
       </w:r>
       <w:proofErr w:type="spellStart"/>
       <w:r>
+        <w:rPr>
+          <w:lang w:val="en-US"/>
+        </w:rPr>
         <w:t>displayed_annexes</w:t>
       </w:r>
       <w:proofErr w:type="spellEnd"/>
       <w:r>
-        <w:t xml:space="preserve"> = [] %}</w:t>
-      </w:r>
-      <w:r>
-        <w:t>{% for lot in lots %}</w:t>
+        <w:rPr>
+          <w:lang w:val="en-US"/>
+        </w:rPr>
+        <w:t xml:space="preserve"> = [] %}{% for lot in lots %}</w:t>
       </w:r>
     </w:p>
     <w:p>
@@ -3509,18 +3519,26 @@
         <w:rPr>
           <w:sz w:val="16"/>
           <w:szCs w:val="16"/>
-        </w:rPr>
-      </w:pPr>
-      <w:r>
+          <w:lang w:val="en-US"/>
+        </w:rPr>
+      </w:pPr>
+      <w:r>
+        <w:rPr>
+          <w:lang w:val="en-US"/>
+        </w:rPr>
         <w:t xml:space="preserve">  </w:t>
       </w:r>
       <w:r>
+        <w:rPr>
+          <w:lang w:val="en-US"/>
+        </w:rPr>
         <w:tab/>
       </w:r>
       <w:r>
         <w:rPr>
           <w:sz w:val="16"/>
           <w:szCs w:val="16"/>
+          <w:lang w:val="en-US"/>
         </w:rPr>
         <w:t xml:space="preserve">{%- if </w:t>
       </w:r>
@@ -3529,6 +3547,7 @@
         <w:rPr>
           <w:sz w:val="16"/>
           <w:szCs w:val="16"/>
+          <w:lang w:val="en-US"/>
         </w:rPr>
         <w:t>lot.annexe_caves</w:t>
       </w:r>
@@ -3537,6 +3556,7 @@
         <w:rPr>
           <w:sz w:val="16"/>
           <w:szCs w:val="16"/>
+          <w:lang w:val="en-US"/>
         </w:rPr>
         <w:t xml:space="preserve"> and 'caves' not in </w:t>
       </w:r>
@@ -3545,6 +3565,7 @@
         <w:rPr>
           <w:sz w:val="16"/>
           <w:szCs w:val="16"/>
+          <w:lang w:val="en-US"/>
         </w:rPr>
         <w:t>displayed_annexes</w:t>
       </w:r>
@@ -3553,6 +3574,7 @@
         <w:rPr>
           <w:sz w:val="16"/>
           <w:szCs w:val="16"/>
+          <w:lang w:val="en-US"/>
         </w:rPr>
         <w:t xml:space="preserve"> %}</w:t>
       </w:r>
@@ -3565,13 +3587,15 @@
           <w:rFonts w:cs="TimesNewRomanPSMT"/>
           <w:sz w:val="16"/>
           <w:szCs w:val="16"/>
-        </w:rPr>
-      </w:pPr>
-      <w:r>
-        <w:rPr>
-          <w:rFonts w:cs="TimesNewRomanPSMT"/>
-          <w:sz w:val="16"/>
-          <w:szCs w:val="16"/>
+          <w:lang w:val="en-US"/>
+        </w:rPr>
+      </w:pPr>
+      <w:r>
+        <w:rPr>
+          <w:rFonts w:cs="TimesNewRomanPSMT"/>
+          <w:sz w:val="16"/>
+          <w:szCs w:val="16"/>
+          <w:lang w:val="en-US"/>
         </w:rPr>
         <w:t xml:space="preserve">{{ </w:t>
       </w:r>
@@ -3581,6 +3605,7 @@
           <w:rFonts w:cs="TimesNewRomanPSMT"/>
           <w:sz w:val="16"/>
           <w:szCs w:val="16"/>
+          <w:lang w:val="en-US"/>
         </w:rPr>
         <w:t>displayed_annexes.append</w:t>
       </w:r>
@@ -3590,6 +3615,7 @@
           <w:rFonts w:cs="TimesNewRomanPSMT"/>
           <w:sz w:val="16"/>
           <w:szCs w:val="16"/>
+          <w:lang w:val="en-US"/>
         </w:rPr>
         <w:t>('caves') or '' }}</w:t>
       </w:r>
@@ -3598,6 +3624,9 @@
       <w:pPr>
         <w:ind w:firstLine="708"/>
         <w:jc w:val="both"/>
+        <w:rPr>
+          <w:lang w:val="en-US"/>
+        </w:rPr>
       </w:pPr>
       <w:r>
         <w:fldChar w:fldCharType="begin">
@@ -3617,6 +3646,7 @@
         <w:rPr>
           <w:sz w:val="16"/>
           <w:szCs w:val="16"/>
+          <w:lang w:val="en-US"/>
         </w:rPr>
         <w:instrText xml:space="preserve"> FORMCHECKBOX </w:instrText>
       </w:r>
@@ -3649,6 +3679,7 @@
       <w:r>
         <w:rPr>
           <w:rFonts w:cs="TimesNewRomanPSMT"/>
+          <w:lang w:val="en-US"/>
         </w:rPr>
         <w:t xml:space="preserve"> Caves</w:t>
       </w:r>
@@ -3657,6 +3688,7 @@
           <w:rFonts w:cs="TimesNewRomanPSMT"/>
           <w:sz w:val="16"/>
           <w:szCs w:val="16"/>
+          <w:lang w:val="en-US"/>
         </w:rPr>
         <w:t xml:space="preserve"> </w:t>
       </w:r>
@@ -3665,32 +3697,18 @@
       <w:pPr>
         <w:ind w:firstLine="708"/>
         <w:jc w:val="both"/>
-      </w:pPr>
-      <w:r>
-        <w:rPr>
-          <w:rFonts w:cs="TimesNewRomanPSMT"/>
-          <w:sz w:val="16"/>
-          <w:szCs w:val="16"/>
-        </w:rPr>
-        <w:t xml:space="preserve">{%- </w:t>
-      </w:r>
-      <w:proofErr w:type="spellStart"/>
-      <w:r>
-        <w:rPr>
-          <w:rFonts w:cs="TimesNewRomanPSMT"/>
-          <w:sz w:val="16"/>
-          <w:szCs w:val="16"/>
-        </w:rPr>
-        <w:t>endif</w:t>
-      </w:r>
-      <w:proofErr w:type="spellEnd"/>
-      <w:r>
-        <w:rPr>
-          <w:rFonts w:cs="TimesNewRomanPSMT"/>
-          <w:sz w:val="16"/>
-          <w:szCs w:val="16"/>
-        </w:rPr>
-        <w:t xml:space="preserve"> %} </w:t>
+        <w:rPr>
+          <w:lang w:val="en-US"/>
+        </w:rPr>
+      </w:pPr>
+      <w:r>
+        <w:rPr>
+          <w:rFonts w:cs="TimesNewRomanPSMT"/>
+          <w:sz w:val="16"/>
+          <w:szCs w:val="16"/>
+          <w:lang w:val="en-US"/>
+        </w:rPr>
+        <w:t xml:space="preserve">{%- endif %} </w:t>
       </w:r>
     </w:p>
     <w:p>
@@ -3701,13 +3719,15 @@
           <w:rFonts w:cs="TimesNewRomanPSMT"/>
           <w:sz w:val="16"/>
           <w:szCs w:val="16"/>
-        </w:rPr>
-      </w:pPr>
-      <w:r>
-        <w:rPr>
-          <w:rFonts w:cs="TimesNewRomanPSMT"/>
-          <w:sz w:val="16"/>
-          <w:szCs w:val="16"/>
+          <w:lang w:val="en-US"/>
+        </w:rPr>
+      </w:pPr>
+      <w:r>
+        <w:rPr>
+          <w:rFonts w:cs="TimesNewRomanPSMT"/>
+          <w:sz w:val="16"/>
+          <w:szCs w:val="16"/>
+          <w:lang w:val="en-US"/>
         </w:rPr>
         <w:t xml:space="preserve">{%- if </w:t>
       </w:r>
@@ -3717,6 +3737,7 @@
           <w:rFonts w:cs="TimesNewRomanPSMT"/>
           <w:sz w:val="16"/>
           <w:szCs w:val="16"/>
+          <w:lang w:val="en-US"/>
         </w:rPr>
         <w:t>lot.annexe_soussols</w:t>
       </w:r>
@@ -3726,6 +3747,7 @@
           <w:rFonts w:cs="TimesNewRomanPSMT"/>
           <w:sz w:val="16"/>
           <w:szCs w:val="16"/>
+          <w:lang w:val="en-US"/>
         </w:rPr>
         <w:t xml:space="preserve"> and '</w:t>
       </w:r>
@@ -3735,6 +3757,7 @@
           <w:rFonts w:cs="TimesNewRomanPSMT"/>
           <w:sz w:val="16"/>
           <w:szCs w:val="16"/>
+          <w:lang w:val="en-US"/>
         </w:rPr>
         <w:t>soussols</w:t>
       </w:r>
@@ -3744,6 +3767,7 @@
           <w:rFonts w:cs="TimesNewRomanPSMT"/>
           <w:sz w:val="16"/>
           <w:szCs w:val="16"/>
+          <w:lang w:val="en-US"/>
         </w:rPr>
         <w:t xml:space="preserve">' not in </w:t>
       </w:r>
@@ -3753,6 +3777,7 @@
           <w:rFonts w:cs="TimesNewRomanPSMT"/>
           <w:sz w:val="16"/>
           <w:szCs w:val="16"/>
+          <w:lang w:val="en-US"/>
         </w:rPr>
         <w:t>displayed_annexes</w:t>
       </w:r>
@@ -3762,6 +3787,7 @@
           <w:rFonts w:cs="TimesNewRomanPSMT"/>
           <w:sz w:val="16"/>
           <w:szCs w:val="16"/>
+          <w:lang w:val="en-US"/>
         </w:rPr>
         <w:t xml:space="preserve"> %}</w:t>
       </w:r>
@@ -3774,13 +3800,15 @@
           <w:rFonts w:cs="TimesNewRomanPSMT"/>
           <w:sz w:val="16"/>
           <w:szCs w:val="16"/>
-        </w:rPr>
-      </w:pPr>
-      <w:r>
-        <w:rPr>
-          <w:rFonts w:cs="TimesNewRomanPSMT"/>
-          <w:sz w:val="16"/>
-          <w:szCs w:val="16"/>
+          <w:lang w:val="en-US"/>
+        </w:rPr>
+      </w:pPr>
+      <w:r>
+        <w:rPr>
+          <w:rFonts w:cs="TimesNewRomanPSMT"/>
+          <w:sz w:val="16"/>
+          <w:szCs w:val="16"/>
+          <w:lang w:val="en-US"/>
         </w:rPr>
         <w:t xml:space="preserve">{{ </w:t>
       </w:r>
@@ -3790,6 +3818,7 @@
           <w:rFonts w:cs="TimesNewRomanPSMT"/>
           <w:sz w:val="16"/>
           <w:szCs w:val="16"/>
+          <w:lang w:val="en-US"/>
         </w:rPr>
         <w:t>displayed_annexes.append</w:t>
       </w:r>
@@ -3799,6 +3828,7 @@
           <w:rFonts w:cs="TimesNewRomanPSMT"/>
           <w:sz w:val="16"/>
           <w:szCs w:val="16"/>
+          <w:lang w:val="en-US"/>
         </w:rPr>
         <w:t>('</w:t>
       </w:r>
@@ -3808,6 +3838,7 @@
           <w:rFonts w:cs="TimesNewRomanPSMT"/>
           <w:sz w:val="16"/>
           <w:szCs w:val="16"/>
+          <w:lang w:val="en-US"/>
         </w:rPr>
         <w:t>soussols</w:t>
       </w:r>
@@ -3817,6 +3848,7 @@
           <w:rFonts w:cs="TimesNewRomanPSMT"/>
           <w:sz w:val="16"/>
           <w:szCs w:val="16"/>
+          <w:lang w:val="en-US"/>
         </w:rPr>
         <w:t>') or '' }}</w:t>
       </w:r>
@@ -3825,6 +3857,9 @@
       <w:pPr>
         <w:ind w:firstLine="708"/>
         <w:jc w:val="both"/>
+        <w:rPr>
+          <w:lang w:val="en-US"/>
+        </w:rPr>
       </w:pPr>
       <w:r>
         <w:fldChar w:fldCharType="begin">
@@ -3844,6 +3879,7 @@
         <w:rPr>
           <w:sz w:val="16"/>
           <w:szCs w:val="16"/>
+          <w:lang w:val="en-US"/>
         </w:rPr>
         <w:instrText xml:space="preserve"> FORMCHECKBOX </w:instrText>
       </w:r>
@@ -3876,6 +3912,7 @@
       <w:r>
         <w:rPr>
           <w:rFonts w:cs="TimesNewRomanPSMT"/>
+          <w:lang w:val="en-US"/>
         </w:rPr>
         <w:t xml:space="preserve"> Sous-sols</w:t>
       </w:r>
@@ -3884,6 +3921,7 @@
           <w:rFonts w:cs="TimesNewRomanPSMT"/>
           <w:sz w:val="16"/>
           <w:szCs w:val="16"/>
+          <w:lang w:val="en-US"/>
         </w:rPr>
         <w:t xml:space="preserve"> </w:t>
       </w:r>
@@ -3892,32 +3930,18 @@
       <w:pPr>
         <w:ind w:firstLine="708"/>
         <w:jc w:val="both"/>
-      </w:pPr>
-      <w:r>
-        <w:rPr>
-          <w:rFonts w:cs="TimesNewRomanPSMT"/>
-          <w:sz w:val="16"/>
-          <w:szCs w:val="16"/>
-        </w:rPr>
-        <w:t xml:space="preserve">{%- </w:t>
-      </w:r>
-      <w:proofErr w:type="spellStart"/>
-      <w:r>
-        <w:rPr>
-          <w:rFonts w:cs="TimesNewRomanPSMT"/>
-          <w:sz w:val="16"/>
-          <w:szCs w:val="16"/>
-        </w:rPr>
-        <w:t>endif</w:t>
-      </w:r>
-      <w:proofErr w:type="spellEnd"/>
-      <w:r>
-        <w:rPr>
-          <w:rFonts w:cs="TimesNewRomanPSMT"/>
-          <w:sz w:val="16"/>
-          <w:szCs w:val="16"/>
-        </w:rPr>
-        <w:t xml:space="preserve"> %} </w:t>
+        <w:rPr>
+          <w:lang w:val="en-US"/>
+        </w:rPr>
+      </w:pPr>
+      <w:r>
+        <w:rPr>
+          <w:rFonts w:cs="TimesNewRomanPSMT"/>
+          <w:sz w:val="16"/>
+          <w:szCs w:val="16"/>
+          <w:lang w:val="en-US"/>
+        </w:rPr>
+        <w:t xml:space="preserve">{%- endif %} </w:t>
       </w:r>
     </w:p>
     <w:p>
@@ -3928,13 +3952,15 @@
           <w:rFonts w:cs="TimesNewRomanPSMT"/>
           <w:sz w:val="16"/>
           <w:szCs w:val="16"/>
-        </w:rPr>
-      </w:pPr>
-      <w:r>
-        <w:rPr>
-          <w:rFonts w:cs="TimesNewRomanPSMT"/>
-          <w:sz w:val="16"/>
-          <w:szCs w:val="16"/>
+          <w:lang w:val="en-US"/>
+        </w:rPr>
+      </w:pPr>
+      <w:r>
+        <w:rPr>
+          <w:rFonts w:cs="TimesNewRomanPSMT"/>
+          <w:sz w:val="16"/>
+          <w:szCs w:val="16"/>
+          <w:lang w:val="en-US"/>
         </w:rPr>
         <w:t xml:space="preserve">{%- if </w:t>
       </w:r>
@@ -3944,6 +3970,7 @@
           <w:rFonts w:cs="TimesNewRomanPSMT"/>
           <w:sz w:val="16"/>
           <w:szCs w:val="16"/>
+          <w:lang w:val="en-US"/>
         </w:rPr>
         <w:t>lot.annexe_remises</w:t>
       </w:r>
@@ -3953,6 +3980,7 @@
           <w:rFonts w:cs="TimesNewRomanPSMT"/>
           <w:sz w:val="16"/>
           <w:szCs w:val="16"/>
+          <w:lang w:val="en-US"/>
         </w:rPr>
         <w:t xml:space="preserve"> and 'remises' not in </w:t>
       </w:r>
@@ -3962,6 +3990,7 @@
           <w:rFonts w:cs="TimesNewRomanPSMT"/>
           <w:sz w:val="16"/>
           <w:szCs w:val="16"/>
+          <w:lang w:val="en-US"/>
         </w:rPr>
         <w:t>displayed_annexes</w:t>
       </w:r>
@@ -3971,6 +4000,7 @@
           <w:rFonts w:cs="TimesNewRomanPSMT"/>
           <w:sz w:val="16"/>
           <w:szCs w:val="16"/>
+          <w:lang w:val="en-US"/>
         </w:rPr>
         <w:t xml:space="preserve"> %}</w:t>
       </w:r>
@@ -3983,13 +4013,15 @@
           <w:rFonts w:cs="TimesNewRomanPSMT"/>
           <w:sz w:val="16"/>
           <w:szCs w:val="16"/>
-        </w:rPr>
-      </w:pPr>
-      <w:r>
-        <w:rPr>
-          <w:rFonts w:cs="TimesNewRomanPSMT"/>
-          <w:sz w:val="16"/>
-          <w:szCs w:val="16"/>
+          <w:lang w:val="en-US"/>
+        </w:rPr>
+      </w:pPr>
+      <w:r>
+        <w:rPr>
+          <w:rFonts w:cs="TimesNewRomanPSMT"/>
+          <w:sz w:val="16"/>
+          <w:szCs w:val="16"/>
+          <w:lang w:val="en-US"/>
         </w:rPr>
         <w:t xml:space="preserve">    {{ </w:t>
       </w:r>
@@ -3999,6 +4031,7 @@
           <w:rFonts w:cs="TimesNewRomanPSMT"/>
           <w:sz w:val="16"/>
           <w:szCs w:val="16"/>
+          <w:lang w:val="en-US"/>
         </w:rPr>
         <w:t>displayed_annexes.append</w:t>
       </w:r>
@@ -4008,6 +4041,7 @@
           <w:rFonts w:cs="TimesNewRomanPSMT"/>
           <w:sz w:val="16"/>
           <w:szCs w:val="16"/>
+          <w:lang w:val="en-US"/>
         </w:rPr>
         <w:t>('remises') or '' }}</w:t>
       </w:r>
@@ -4016,6 +4050,9 @@
       <w:pPr>
         <w:ind w:firstLine="708"/>
         <w:jc w:val="both"/>
+        <w:rPr>
+          <w:lang w:val="en-US"/>
+        </w:rPr>
       </w:pPr>
       <w:r>
         <w:fldChar w:fldCharType="begin">
@@ -4035,6 +4072,7 @@
         <w:rPr>
           <w:sz w:val="16"/>
           <w:szCs w:val="16"/>
+          <w:lang w:val="en-US"/>
         </w:rPr>
         <w:instrText xml:space="preserve"> FORMCHECKBOX </w:instrText>
       </w:r>
@@ -4069,12 +4107,14 @@
           <w:rFonts w:cs="TimesNewRomanPSMT"/>
           <w:sz w:val="16"/>
           <w:szCs w:val="16"/>
+          <w:lang w:val="en-US"/>
         </w:rPr>
         <w:t xml:space="preserve"> </w:t>
       </w:r>
       <w:r>
         <w:rPr>
           <w:rFonts w:cs="TimesNewRomanPSMT"/>
+          <w:lang w:val="en-US"/>
         </w:rPr>
         <w:t>Remise</w:t>
       </w:r>
@@ -4083,32 +4123,18 @@
       <w:pPr>
         <w:ind w:firstLine="708"/>
         <w:jc w:val="both"/>
-      </w:pPr>
-      <w:r>
-        <w:rPr>
-          <w:rFonts w:cs="TimesNewRomanPSMT"/>
-          <w:sz w:val="16"/>
-          <w:szCs w:val="16"/>
-        </w:rPr>
-        <w:t xml:space="preserve">{%- </w:t>
-      </w:r>
-      <w:proofErr w:type="spellStart"/>
-      <w:r>
-        <w:rPr>
-          <w:rFonts w:cs="TimesNewRomanPSMT"/>
-          <w:sz w:val="16"/>
-          <w:szCs w:val="16"/>
-        </w:rPr>
-        <w:t>endif</w:t>
-      </w:r>
-      <w:proofErr w:type="spellEnd"/>
-      <w:r>
-        <w:rPr>
-          <w:rFonts w:cs="TimesNewRomanPSMT"/>
-          <w:sz w:val="16"/>
-          <w:szCs w:val="16"/>
-        </w:rPr>
-        <w:t xml:space="preserve"> %} </w:t>
+        <w:rPr>
+          <w:lang w:val="en-US"/>
+        </w:rPr>
+      </w:pPr>
+      <w:r>
+        <w:rPr>
+          <w:rFonts w:cs="TimesNewRomanPSMT"/>
+          <w:sz w:val="16"/>
+          <w:szCs w:val="16"/>
+          <w:lang w:val="en-US"/>
+        </w:rPr>
+        <w:t xml:space="preserve">{%- endif %} </w:t>
       </w:r>
     </w:p>
     <w:p>
@@ -4119,13 +4145,15 @@
           <w:rFonts w:cs="TimesNewRomanPSMT"/>
           <w:sz w:val="16"/>
           <w:szCs w:val="16"/>
-        </w:rPr>
-      </w:pPr>
-      <w:r>
-        <w:rPr>
-          <w:rFonts w:cs="TimesNewRomanPSMT"/>
-          <w:sz w:val="16"/>
-          <w:szCs w:val="16"/>
+          <w:lang w:val="en-US"/>
+        </w:rPr>
+      </w:pPr>
+      <w:r>
+        <w:rPr>
+          <w:rFonts w:cs="TimesNewRomanPSMT"/>
+          <w:sz w:val="16"/>
+          <w:szCs w:val="16"/>
+          <w:lang w:val="en-US"/>
         </w:rPr>
         <w:t xml:space="preserve">{%- if </w:t>
       </w:r>
@@ -4135,6 +4163,7 @@
           <w:rFonts w:cs="TimesNewRomanPSMT"/>
           <w:sz w:val="16"/>
           <w:szCs w:val="16"/>
+          <w:lang w:val="en-US"/>
         </w:rPr>
         <w:t>lot.annexe_ateliers</w:t>
       </w:r>
@@ -4144,6 +4173,7 @@
           <w:rFonts w:cs="TimesNewRomanPSMT"/>
           <w:sz w:val="16"/>
           <w:szCs w:val="16"/>
+          <w:lang w:val="en-US"/>
         </w:rPr>
         <w:t xml:space="preserve"> and 'ateliers' not in </w:t>
       </w:r>
@@ -4153,6 +4183,7 @@
           <w:rFonts w:cs="TimesNewRomanPSMT"/>
           <w:sz w:val="16"/>
           <w:szCs w:val="16"/>
+          <w:lang w:val="en-US"/>
         </w:rPr>
         <w:t>displayed_annexes</w:t>
       </w:r>
@@ -4162,6 +4193,7 @@
           <w:rFonts w:cs="TimesNewRomanPSMT"/>
           <w:sz w:val="16"/>
           <w:szCs w:val="16"/>
+          <w:lang w:val="en-US"/>
         </w:rPr>
         <w:t xml:space="preserve"> %}</w:t>
       </w:r>
@@ -4174,13 +4206,15 @@
           <w:rFonts w:cs="TimesNewRomanPSMT"/>
           <w:sz w:val="16"/>
           <w:szCs w:val="16"/>
-        </w:rPr>
-      </w:pPr>
-      <w:r>
-        <w:rPr>
-          <w:rFonts w:cs="TimesNewRomanPSMT"/>
-          <w:sz w:val="16"/>
-          <w:szCs w:val="16"/>
+          <w:lang w:val="en-US"/>
+        </w:rPr>
+      </w:pPr>
+      <w:r>
+        <w:rPr>
+          <w:rFonts w:cs="TimesNewRomanPSMT"/>
+          <w:sz w:val="16"/>
+          <w:szCs w:val="16"/>
+          <w:lang w:val="en-US"/>
         </w:rPr>
         <w:t xml:space="preserve">   {{ </w:t>
       </w:r>
@@ -4190,6 +4224,7 @@
           <w:rFonts w:cs="TimesNewRomanPSMT"/>
           <w:sz w:val="16"/>
           <w:szCs w:val="16"/>
+          <w:lang w:val="en-US"/>
         </w:rPr>
         <w:t>displayed_annexes.append</w:t>
       </w:r>
@@ -4199,6 +4234,7 @@
           <w:rFonts w:cs="TimesNewRomanPSMT"/>
           <w:sz w:val="16"/>
           <w:szCs w:val="16"/>
+          <w:lang w:val="en-US"/>
         </w:rPr>
         <w:t>('ateliers') or '' }}</w:t>
       </w:r>
@@ -4207,12 +4243,16 @@
       <w:pPr>
         <w:ind w:firstLine="708"/>
         <w:jc w:val="both"/>
-      </w:pPr>
-      <w:r>
-        <w:rPr>
-          <w:rFonts w:cs="TimesNewRomanPSMT"/>
-          <w:sz w:val="16"/>
-          <w:szCs w:val="16"/>
+        <w:rPr>
+          <w:lang w:val="en-US"/>
+        </w:rPr>
+      </w:pPr>
+      <w:r>
+        <w:rPr>
+          <w:rFonts w:cs="TimesNewRomanPSMT"/>
+          <w:sz w:val="16"/>
+          <w:szCs w:val="16"/>
+          <w:lang w:val="en-US"/>
         </w:rPr>
         <w:t xml:space="preserve"> </w:t>
       </w:r>
@@ -4234,6 +4274,7 @@
         <w:rPr>
           <w:sz w:val="16"/>
           <w:szCs w:val="16"/>
+          <w:lang w:val="en-US"/>
         </w:rPr>
         <w:instrText xml:space="preserve"> FORMCHECKBOX </w:instrText>
       </w:r>
@@ -4268,12 +4309,14 @@
           <w:rFonts w:cs="TimesNewRomanPSMT"/>
           <w:sz w:val="16"/>
           <w:szCs w:val="16"/>
+          <w:lang w:val="en-US"/>
         </w:rPr>
         <w:t xml:space="preserve"> </w:t>
       </w:r>
       <w:r>
         <w:rPr>
           <w:rFonts w:cs="TimesNewRomanPSMT"/>
+          <w:lang w:val="en-US"/>
         </w:rPr>
         <w:t>Ateliers</w:t>
       </w:r>
@@ -4282,32 +4325,18 @@
       <w:pPr>
         <w:ind w:firstLine="708"/>
         <w:jc w:val="both"/>
-      </w:pPr>
-      <w:r>
-        <w:rPr>
-          <w:rFonts w:cs="TimesNewRomanPSMT"/>
-          <w:sz w:val="16"/>
-          <w:szCs w:val="16"/>
-        </w:rPr>
-        <w:t xml:space="preserve">{%- </w:t>
-      </w:r>
-      <w:proofErr w:type="spellStart"/>
-      <w:r>
-        <w:rPr>
-          <w:rFonts w:cs="TimesNewRomanPSMT"/>
-          <w:sz w:val="16"/>
-          <w:szCs w:val="16"/>
-        </w:rPr>
-        <w:t>endif</w:t>
-      </w:r>
-      <w:proofErr w:type="spellEnd"/>
-      <w:r>
-        <w:rPr>
-          <w:rFonts w:cs="TimesNewRomanPSMT"/>
-          <w:sz w:val="16"/>
-          <w:szCs w:val="16"/>
-        </w:rPr>
-        <w:t xml:space="preserve"> %} </w:t>
+        <w:rPr>
+          <w:lang w:val="en-US"/>
+        </w:rPr>
+      </w:pPr>
+      <w:r>
+        <w:rPr>
+          <w:rFonts w:cs="TimesNewRomanPSMT"/>
+          <w:sz w:val="16"/>
+          <w:szCs w:val="16"/>
+          <w:lang w:val="en-US"/>
+        </w:rPr>
+        <w:t xml:space="preserve">{%- endif %} </w:t>
       </w:r>
     </w:p>
     <w:p>
@@ -4318,13 +4347,15 @@
           <w:rFonts w:cs="TimesNewRomanPSMT"/>
           <w:sz w:val="16"/>
           <w:szCs w:val="16"/>
-        </w:rPr>
-      </w:pPr>
-      <w:r>
-        <w:rPr>
-          <w:rFonts w:cs="TimesNewRomanPSMT"/>
-          <w:sz w:val="16"/>
-          <w:szCs w:val="16"/>
+          <w:lang w:val="en-US"/>
+        </w:rPr>
+      </w:pPr>
+      <w:r>
+        <w:rPr>
+          <w:rFonts w:cs="TimesNewRomanPSMT"/>
+          <w:sz w:val="16"/>
+          <w:szCs w:val="16"/>
+          <w:lang w:val="en-US"/>
         </w:rPr>
         <w:t xml:space="preserve">{%- if </w:t>
       </w:r>
@@ -4334,6 +4365,7 @@
           <w:rFonts w:cs="TimesNewRomanPSMT"/>
           <w:sz w:val="16"/>
           <w:szCs w:val="16"/>
+          <w:lang w:val="en-US"/>
         </w:rPr>
         <w:t>lot.annexe_sechoirs</w:t>
       </w:r>
@@ -4343,6 +4375,7 @@
           <w:rFonts w:cs="TimesNewRomanPSMT"/>
           <w:sz w:val="16"/>
           <w:szCs w:val="16"/>
+          <w:lang w:val="en-US"/>
         </w:rPr>
         <w:t xml:space="preserve"> and '</w:t>
       </w:r>
@@ -4352,6 +4385,7 @@
           <w:rFonts w:cs="TimesNewRomanPSMT"/>
           <w:sz w:val="16"/>
           <w:szCs w:val="16"/>
+          <w:lang w:val="en-US"/>
         </w:rPr>
         <w:t>sechoirs</w:t>
       </w:r>
@@ -4361,6 +4395,7 @@
           <w:rFonts w:cs="TimesNewRomanPSMT"/>
           <w:sz w:val="16"/>
           <w:szCs w:val="16"/>
+          <w:lang w:val="en-US"/>
         </w:rPr>
         <w:t xml:space="preserve">' not in </w:t>
       </w:r>
@@ -4370,6 +4405,7 @@
           <w:rFonts w:cs="TimesNewRomanPSMT"/>
           <w:sz w:val="16"/>
           <w:szCs w:val="16"/>
+          <w:lang w:val="en-US"/>
         </w:rPr>
         <w:t>displayed_annexes</w:t>
       </w:r>
@@ -4379,6 +4415,7 @@
           <w:rFonts w:cs="TimesNewRomanPSMT"/>
           <w:sz w:val="16"/>
           <w:szCs w:val="16"/>
+          <w:lang w:val="en-US"/>
         </w:rPr>
         <w:t xml:space="preserve"> %}</w:t>
       </w:r>
@@ -4391,13 +4428,15 @@
           <w:rFonts w:cs="TimesNewRomanPSMT"/>
           <w:sz w:val="16"/>
           <w:szCs w:val="16"/>
-        </w:rPr>
-      </w:pPr>
-      <w:r>
-        <w:rPr>
-          <w:rFonts w:cs="TimesNewRomanPSMT"/>
-          <w:sz w:val="16"/>
-          <w:szCs w:val="16"/>
+          <w:lang w:val="en-US"/>
+        </w:rPr>
+      </w:pPr>
+      <w:r>
+        <w:rPr>
+          <w:rFonts w:cs="TimesNewRomanPSMT"/>
+          <w:sz w:val="16"/>
+          <w:szCs w:val="16"/>
+          <w:lang w:val="en-US"/>
         </w:rPr>
         <w:t xml:space="preserve">{{ </w:t>
       </w:r>
@@ -4407,6 +4446,7 @@
           <w:rFonts w:cs="TimesNewRomanPSMT"/>
           <w:sz w:val="16"/>
           <w:szCs w:val="16"/>
+          <w:lang w:val="en-US"/>
         </w:rPr>
         <w:t>displayed_annexes.append</w:t>
       </w:r>
@@ -4416,6 +4456,7 @@
           <w:rFonts w:cs="TimesNewRomanPSMT"/>
           <w:sz w:val="16"/>
           <w:szCs w:val="16"/>
+          <w:lang w:val="en-US"/>
         </w:rPr>
         <w:t>('</w:t>
       </w:r>
@@ -4425,6 +4466,7 @@
           <w:rFonts w:cs="TimesNewRomanPSMT"/>
           <w:sz w:val="16"/>
           <w:szCs w:val="16"/>
+          <w:lang w:val="en-US"/>
         </w:rPr>
         <w:t>sechoirs</w:t>
       </w:r>
@@ -4434,6 +4476,7 @@
           <w:rFonts w:cs="TimesNewRomanPSMT"/>
           <w:sz w:val="16"/>
           <w:szCs w:val="16"/>
+          <w:lang w:val="en-US"/>
         </w:rPr>
         <w:t xml:space="preserve">') or '' }} </w:t>
       </w:r>
@@ -4442,6 +4485,9 @@
       <w:pPr>
         <w:ind w:firstLine="708"/>
         <w:jc w:val="both"/>
+        <w:rPr>
+          <w:lang w:val="en-US"/>
+        </w:rPr>
       </w:pPr>
       <w:r>
         <w:fldChar w:fldCharType="begin">
@@ -4461,6 +4507,7 @@
         <w:rPr>
           <w:sz w:val="16"/>
           <w:szCs w:val="16"/>
+          <w:lang w:val="en-US"/>
         </w:rPr>
         <w:instrText xml:space="preserve"> FORMCHECKBOX </w:instrText>
       </w:r>
@@ -4495,46 +4542,36 @@
           <w:rFonts w:cs="TimesNewRomanPSMT"/>
           <w:sz w:val="16"/>
           <w:szCs w:val="16"/>
+          <w:lang w:val="en-US"/>
         </w:rPr>
         <w:t xml:space="preserve"> </w:t>
       </w:r>
-      <w:r>
-        <w:rPr>
-          <w:rFonts w:cs="TimesNewRomanPSMT"/>
+      <w:proofErr w:type="spellStart"/>
+      <w:r>
+        <w:rPr>
+          <w:rFonts w:cs="TimesNewRomanPSMT"/>
+          <w:lang w:val="en-US"/>
         </w:rPr>
         <w:t>Séchoirs</w:t>
       </w:r>
+      <w:proofErr w:type="spellEnd"/>
     </w:p>
     <w:p>
       <w:pPr>
         <w:ind w:firstLine="708"/>
         <w:jc w:val="both"/>
-      </w:pPr>
-      <w:r>
-        <w:rPr>
-          <w:rFonts w:cs="TimesNewRomanPSMT"/>
-          <w:sz w:val="16"/>
-          <w:szCs w:val="16"/>
-        </w:rPr>
-        <w:t xml:space="preserve">{%- </w:t>
-      </w:r>
-      <w:proofErr w:type="spellStart"/>
-      <w:r>
-        <w:rPr>
-          <w:rFonts w:cs="TimesNewRomanPSMT"/>
-          <w:sz w:val="16"/>
-          <w:szCs w:val="16"/>
-        </w:rPr>
-        <w:t>endif</w:t>
-      </w:r>
-      <w:proofErr w:type="spellEnd"/>
-      <w:r>
-        <w:rPr>
-          <w:rFonts w:cs="TimesNewRomanPSMT"/>
-          <w:sz w:val="16"/>
-          <w:szCs w:val="16"/>
-        </w:rPr>
-        <w:t xml:space="preserve"> %} </w:t>
+        <w:rPr>
+          <w:lang w:val="en-US"/>
+        </w:rPr>
+      </w:pPr>
+      <w:r>
+        <w:rPr>
+          <w:rFonts w:cs="TimesNewRomanPSMT"/>
+          <w:sz w:val="16"/>
+          <w:szCs w:val="16"/>
+          <w:lang w:val="en-US"/>
+        </w:rPr>
+        <w:t xml:space="preserve">{%- endif %} </w:t>
       </w:r>
     </w:p>
     <w:p>
@@ -4545,13 +4582,15 @@
           <w:rFonts w:cs="TimesNewRomanPSMT"/>
           <w:sz w:val="16"/>
           <w:szCs w:val="16"/>
-        </w:rPr>
-      </w:pPr>
-      <w:r>
-        <w:rPr>
-          <w:rFonts w:cs="TimesNewRomanPSMT"/>
-          <w:sz w:val="16"/>
-          <w:szCs w:val="16"/>
+          <w:lang w:val="en-US"/>
+        </w:rPr>
+      </w:pPr>
+      <w:r>
+        <w:rPr>
+          <w:rFonts w:cs="TimesNewRomanPSMT"/>
+          <w:sz w:val="16"/>
+          <w:szCs w:val="16"/>
+          <w:lang w:val="en-US"/>
         </w:rPr>
         <w:t xml:space="preserve">{%- if </w:t>
       </w:r>
@@ -4561,6 +4600,7 @@
           <w:rFonts w:cs="TimesNewRomanPSMT"/>
           <w:sz w:val="16"/>
           <w:szCs w:val="16"/>
+          <w:lang w:val="en-US"/>
         </w:rPr>
         <w:t>lot.annexe_celliers</w:t>
       </w:r>
@@ -4570,15 +4610,37 @@
           <w:rFonts w:cs="TimesNewRomanPSMT"/>
           <w:sz w:val="16"/>
           <w:szCs w:val="16"/>
-        </w:rPr>
-        <w:t xml:space="preserve"> and 'celliers' not in </w:t>
-      </w:r>
-      <w:proofErr w:type="spellStart"/>
-      <w:r>
-        <w:rPr>
-          <w:rFonts w:cs="TimesNewRomanPSMT"/>
-          <w:sz w:val="16"/>
-          <w:szCs w:val="16"/>
+          <w:lang w:val="en-US"/>
+        </w:rPr>
+        <w:t xml:space="preserve"> and '</w:t>
+      </w:r>
+      <w:proofErr w:type="spellStart"/>
+      <w:r>
+        <w:rPr>
+          <w:rFonts w:cs="TimesNewRomanPSMT"/>
+          <w:sz w:val="16"/>
+          <w:szCs w:val="16"/>
+          <w:lang w:val="en-US"/>
+        </w:rPr>
+        <w:t>celliers'</w:t>
+      </w:r>
+      <w:proofErr w:type="spellEnd"/>
+      <w:r>
+        <w:rPr>
+          <w:rFonts w:cs="TimesNewRomanPSMT"/>
+          <w:sz w:val="16"/>
+          <w:szCs w:val="16"/>
+          <w:lang w:val="en-US"/>
+        </w:rPr>
+        <w:t xml:space="preserve"> not in </w:t>
+      </w:r>
+      <w:proofErr w:type="spellStart"/>
+      <w:r>
+        <w:rPr>
+          <w:rFonts w:cs="TimesNewRomanPSMT"/>
+          <w:sz w:val="16"/>
+          <w:szCs w:val="16"/>
+          <w:lang w:val="en-US"/>
         </w:rPr>
         <w:t>displayed_annexes</w:t>
       </w:r>
@@ -4588,6 +4650,7 @@
           <w:rFonts w:cs="TimesNewRomanPSMT"/>
           <w:sz w:val="16"/>
           <w:szCs w:val="16"/>
+          <w:lang w:val="en-US"/>
         </w:rPr>
         <w:t xml:space="preserve"> %}</w:t>
       </w:r>
@@ -4600,13 +4663,15 @@
           <w:rFonts w:cs="TimesNewRomanPSMT"/>
           <w:sz w:val="16"/>
           <w:szCs w:val="16"/>
-        </w:rPr>
-      </w:pPr>
-      <w:r>
-        <w:rPr>
-          <w:rFonts w:cs="TimesNewRomanPSMT"/>
-          <w:sz w:val="16"/>
-          <w:szCs w:val="16"/>
+          <w:lang w:val="en-US"/>
+        </w:rPr>
+      </w:pPr>
+      <w:r>
+        <w:rPr>
+          <w:rFonts w:cs="TimesNewRomanPSMT"/>
+          <w:sz w:val="16"/>
+          <w:szCs w:val="16"/>
+          <w:lang w:val="en-US"/>
         </w:rPr>
         <w:t xml:space="preserve">{{ </w:t>
       </w:r>
@@ -4616,6 +4681,7 @@
           <w:rFonts w:cs="TimesNewRomanPSMT"/>
           <w:sz w:val="16"/>
           <w:szCs w:val="16"/>
+          <w:lang w:val="en-US"/>
         </w:rPr>
         <w:t>displayed_annexes.append</w:t>
       </w:r>
@@ -4625,8 +4691,29 @@
           <w:rFonts w:cs="TimesNewRomanPSMT"/>
           <w:sz w:val="16"/>
           <w:szCs w:val="16"/>
-        </w:rPr>
-        <w:t>('celliers') or '' }}</w:t>
+          <w:lang w:val="en-US"/>
+        </w:rPr>
+        <w:t>('</w:t>
+      </w:r>
+      <w:proofErr w:type="spellStart"/>
+      <w:r>
+        <w:rPr>
+          <w:rFonts w:cs="TimesNewRomanPSMT"/>
+          <w:sz w:val="16"/>
+          <w:szCs w:val="16"/>
+          <w:lang w:val="en-US"/>
+        </w:rPr>
+        <w:t>celliers'</w:t>
+      </w:r>
+      <w:proofErr w:type="spellEnd"/>
+      <w:r>
+        <w:rPr>
+          <w:rFonts w:cs="TimesNewRomanPSMT"/>
+          <w:sz w:val="16"/>
+          <w:szCs w:val="16"/>
+          <w:lang w:val="en-US"/>
+        </w:rPr>
+        <w:t>) or '' }}</w:t>
       </w:r>
     </w:p>
     <w:p>
@@ -4639,6 +4726,7 @@
           <w:rFonts w:cs="TimesNewRomanPSMT"/>
           <w:sz w:val="16"/>
           <w:szCs w:val="16"/>
+          <w:lang w:val="en-US"/>
         </w:rPr>
         <w:t xml:space="preserve"> </w:t>
       </w:r>
@@ -4744,13 +4832,15 @@
           <w:rFonts w:cs="TimesNewRomanPSMT"/>
           <w:sz w:val="16"/>
           <w:szCs w:val="16"/>
-        </w:rPr>
-      </w:pPr>
-      <w:r>
-        <w:rPr>
-          <w:rFonts w:cs="TimesNewRomanPSMT"/>
-          <w:sz w:val="16"/>
-          <w:szCs w:val="16"/>
+          <w:lang w:val="en-US"/>
+        </w:rPr>
+      </w:pPr>
+      <w:r>
+        <w:rPr>
+          <w:rFonts w:cs="TimesNewRomanPSMT"/>
+          <w:sz w:val="16"/>
+          <w:szCs w:val="16"/>
+          <w:lang w:val="en-US"/>
         </w:rPr>
         <w:t xml:space="preserve">{%- if </w:t>
       </w:r>
@@ -4760,6 +4850,7 @@
           <w:rFonts w:cs="TimesNewRomanPSMT"/>
           <w:sz w:val="16"/>
           <w:szCs w:val="16"/>
+          <w:lang w:val="en-US"/>
         </w:rPr>
         <w:t>lot.annexe_resserres</w:t>
       </w:r>
@@ -4769,15 +4860,37 @@
           <w:rFonts w:cs="TimesNewRomanPSMT"/>
           <w:sz w:val="16"/>
           <w:szCs w:val="16"/>
-        </w:rPr>
-        <w:t xml:space="preserve"> and 'resserres' not in </w:t>
-      </w:r>
-      <w:proofErr w:type="spellStart"/>
-      <w:r>
-        <w:rPr>
-          <w:rFonts w:cs="TimesNewRomanPSMT"/>
-          <w:sz w:val="16"/>
-          <w:szCs w:val="16"/>
+          <w:lang w:val="en-US"/>
+        </w:rPr>
+        <w:t xml:space="preserve"> and '</w:t>
+      </w:r>
+      <w:proofErr w:type="spellStart"/>
+      <w:r>
+        <w:rPr>
+          <w:rFonts w:cs="TimesNewRomanPSMT"/>
+          <w:sz w:val="16"/>
+          <w:szCs w:val="16"/>
+          <w:lang w:val="en-US"/>
+        </w:rPr>
+        <w:t>resserres</w:t>
+      </w:r>
+      <w:proofErr w:type="spellEnd"/>
+      <w:r>
+        <w:rPr>
+          <w:rFonts w:cs="TimesNewRomanPSMT"/>
+          <w:sz w:val="16"/>
+          <w:szCs w:val="16"/>
+          <w:lang w:val="en-US"/>
+        </w:rPr>
+        <w:t xml:space="preserve">' not in </w:t>
+      </w:r>
+      <w:proofErr w:type="spellStart"/>
+      <w:r>
+        <w:rPr>
+          <w:rFonts w:cs="TimesNewRomanPSMT"/>
+          <w:sz w:val="16"/>
+          <w:szCs w:val="16"/>
+          <w:lang w:val="en-US"/>
         </w:rPr>
         <w:t>displayed_annexes</w:t>
       </w:r>
@@ -4787,6 +4900,7 @@
           <w:rFonts w:cs="TimesNewRomanPSMT"/>
           <w:sz w:val="16"/>
           <w:szCs w:val="16"/>
+          <w:lang w:val="en-US"/>
         </w:rPr>
         <w:t xml:space="preserve"> %}</w:t>
       </w:r>
@@ -4799,13 +4913,15 @@
           <w:rFonts w:cs="TimesNewRomanPSMT"/>
           <w:sz w:val="16"/>
           <w:szCs w:val="16"/>
-        </w:rPr>
-      </w:pPr>
-      <w:r>
-        <w:rPr>
-          <w:rFonts w:cs="TimesNewRomanPSMT"/>
-          <w:sz w:val="16"/>
-          <w:szCs w:val="16"/>
+          <w:lang w:val="en-US"/>
+        </w:rPr>
+      </w:pPr>
+      <w:r>
+        <w:rPr>
+          <w:rFonts w:cs="TimesNewRomanPSMT"/>
+          <w:sz w:val="16"/>
+          <w:szCs w:val="16"/>
+          <w:lang w:val="en-US"/>
         </w:rPr>
         <w:t xml:space="preserve">{{ </w:t>
       </w:r>
@@ -4815,6 +4931,7 @@
           <w:rFonts w:cs="TimesNewRomanPSMT"/>
           <w:sz w:val="16"/>
           <w:szCs w:val="16"/>
+          <w:lang w:val="en-US"/>
         </w:rPr>
         <w:t>displayed_annexes.append</w:t>
       </w:r>
@@ -4824,20 +4941,45 @@
           <w:rFonts w:cs="TimesNewRomanPSMT"/>
           <w:sz w:val="16"/>
           <w:szCs w:val="16"/>
-        </w:rPr>
-        <w:t>('resserres') or '' }}</w:t>
+          <w:lang w:val="en-US"/>
+        </w:rPr>
+        <w:t>('</w:t>
+      </w:r>
+      <w:proofErr w:type="spellStart"/>
+      <w:r>
+        <w:rPr>
+          <w:rFonts w:cs="TimesNewRomanPSMT"/>
+          <w:sz w:val="16"/>
+          <w:szCs w:val="16"/>
+          <w:lang w:val="en-US"/>
+        </w:rPr>
+        <w:t>resserres</w:t>
+      </w:r>
+      <w:proofErr w:type="spellEnd"/>
+      <w:r>
+        <w:rPr>
+          <w:rFonts w:cs="TimesNewRomanPSMT"/>
+          <w:sz w:val="16"/>
+          <w:szCs w:val="16"/>
+          <w:lang w:val="en-US"/>
+        </w:rPr>
+        <w:t>') or '' }}</w:t>
       </w:r>
     </w:p>
     <w:p>
       <w:pPr>
         <w:ind w:firstLine="708"/>
         <w:jc w:val="both"/>
-      </w:pPr>
-      <w:r>
-        <w:rPr>
-          <w:rFonts w:cs="TimesNewRomanPSMT"/>
-          <w:sz w:val="16"/>
-          <w:szCs w:val="16"/>
+        <w:rPr>
+          <w:lang w:val="en-US"/>
+        </w:rPr>
+      </w:pPr>
+      <w:r>
+        <w:rPr>
+          <w:rFonts w:cs="TimesNewRomanPSMT"/>
+          <w:sz w:val="16"/>
+          <w:szCs w:val="16"/>
+          <w:lang w:val="en-US"/>
         </w:rPr>
         <w:t xml:space="preserve"> </w:t>
       </w:r>
@@ -4859,6 +5001,7 @@
         <w:rPr>
           <w:sz w:val="16"/>
           <w:szCs w:val="16"/>
+          <w:lang w:val="en-US"/>
         </w:rPr>
         <w:instrText xml:space="preserve"> FORMCHECKBOX </w:instrText>
       </w:r>
@@ -4893,46 +5036,36 @@
           <w:rFonts w:cs="TimesNewRomanPSMT"/>
           <w:sz w:val="16"/>
           <w:szCs w:val="16"/>
+          <w:lang w:val="en-US"/>
         </w:rPr>
         <w:t xml:space="preserve"> </w:t>
       </w:r>
-      <w:r>
-        <w:rPr>
-          <w:rFonts w:cs="TimesNewRomanPSMT"/>
+      <w:proofErr w:type="spellStart"/>
+      <w:r>
+        <w:rPr>
+          <w:rFonts w:cs="TimesNewRomanPSMT"/>
+          <w:lang w:val="en-US"/>
         </w:rPr>
         <w:t>Resserres</w:t>
       </w:r>
+      <w:proofErr w:type="spellEnd"/>
     </w:p>
     <w:p>
       <w:pPr>
         <w:ind w:firstLine="708"/>
         <w:jc w:val="both"/>
-      </w:pPr>
-      <w:r>
-        <w:rPr>
-          <w:rFonts w:cs="TimesNewRomanPSMT"/>
-          <w:sz w:val="16"/>
-          <w:szCs w:val="16"/>
-        </w:rPr>
-        <w:t xml:space="preserve">{%- </w:t>
-      </w:r>
-      <w:proofErr w:type="spellStart"/>
-      <w:r>
-        <w:rPr>
-          <w:rFonts w:cs="TimesNewRomanPSMT"/>
-          <w:sz w:val="16"/>
-          <w:szCs w:val="16"/>
-        </w:rPr>
-        <w:t>endif</w:t>
-      </w:r>
-      <w:proofErr w:type="spellEnd"/>
-      <w:r>
-        <w:rPr>
-          <w:rFonts w:cs="TimesNewRomanPSMT"/>
-          <w:sz w:val="16"/>
-          <w:szCs w:val="16"/>
-        </w:rPr>
-        <w:t xml:space="preserve"> %} </w:t>
+        <w:rPr>
+          <w:lang w:val="en-US"/>
+        </w:rPr>
+      </w:pPr>
+      <w:r>
+        <w:rPr>
+          <w:rFonts w:cs="TimesNewRomanPSMT"/>
+          <w:sz w:val="16"/>
+          <w:szCs w:val="16"/>
+          <w:lang w:val="en-US"/>
+        </w:rPr>
+        <w:t xml:space="preserve">{%- endif %} </w:t>
       </w:r>
     </w:p>
     <w:p>
@@ -4943,13 +5076,15 @@
           <w:rFonts w:cs="TimesNewRomanPSMT"/>
           <w:sz w:val="16"/>
           <w:szCs w:val="16"/>
-        </w:rPr>
-      </w:pPr>
-      <w:r>
-        <w:rPr>
-          <w:rFonts w:cs="TimesNewRomanPSMT"/>
-          <w:sz w:val="16"/>
-          <w:szCs w:val="16"/>
+          <w:lang w:val="en-US"/>
+        </w:rPr>
+      </w:pPr>
+      <w:r>
+        <w:rPr>
+          <w:rFonts w:cs="TimesNewRomanPSMT"/>
+          <w:sz w:val="16"/>
+          <w:szCs w:val="16"/>
+          <w:lang w:val="en-US"/>
         </w:rPr>
         <w:t xml:space="preserve">{%- if </w:t>
       </w:r>
@@ -4959,6 +5094,7 @@
           <w:rFonts w:cs="TimesNewRomanPSMT"/>
           <w:sz w:val="16"/>
           <w:szCs w:val="16"/>
+          <w:lang w:val="en-US"/>
         </w:rPr>
         <w:t>lot.annexe_combles</w:t>
       </w:r>
@@ -4968,6 +5104,7 @@
           <w:rFonts w:cs="TimesNewRomanPSMT"/>
           <w:sz w:val="16"/>
           <w:szCs w:val="16"/>
+          <w:lang w:val="en-US"/>
         </w:rPr>
         <w:t xml:space="preserve"> and 'combles' not in </w:t>
       </w:r>
@@ -4977,6 +5114,7 @@
           <w:rFonts w:cs="TimesNewRomanPSMT"/>
           <w:sz w:val="16"/>
           <w:szCs w:val="16"/>
+          <w:lang w:val="en-US"/>
         </w:rPr>
         <w:t>displayed_annexes</w:t>
       </w:r>
@@ -4986,6 +5124,7 @@
           <w:rFonts w:cs="TimesNewRomanPSMT"/>
           <w:sz w:val="16"/>
           <w:szCs w:val="16"/>
+          <w:lang w:val="en-US"/>
         </w:rPr>
         <w:t xml:space="preserve"> %}</w:t>
       </w:r>
@@ -4998,13 +5137,15 @@
           <w:rFonts w:cs="TimesNewRomanPSMT"/>
           <w:sz w:val="16"/>
           <w:szCs w:val="16"/>
-        </w:rPr>
-      </w:pPr>
-      <w:r>
-        <w:rPr>
-          <w:rFonts w:cs="TimesNewRomanPSMT"/>
-          <w:sz w:val="16"/>
-          <w:szCs w:val="16"/>
+          <w:lang w:val="en-US"/>
+        </w:rPr>
+      </w:pPr>
+      <w:r>
+        <w:rPr>
+          <w:rFonts w:cs="TimesNewRomanPSMT"/>
+          <w:sz w:val="16"/>
+          <w:szCs w:val="16"/>
+          <w:lang w:val="en-US"/>
         </w:rPr>
         <w:t xml:space="preserve">{{ </w:t>
       </w:r>
@@ -5014,6 +5155,7 @@
           <w:rFonts w:cs="TimesNewRomanPSMT"/>
           <w:sz w:val="16"/>
           <w:szCs w:val="16"/>
+          <w:lang w:val="en-US"/>
         </w:rPr>
         <w:t>displayed_annexes.append</w:t>
       </w:r>
@@ -5023,6 +5165,7 @@
           <w:rFonts w:cs="TimesNewRomanPSMT"/>
           <w:sz w:val="16"/>
           <w:szCs w:val="16"/>
+          <w:lang w:val="en-US"/>
         </w:rPr>
         <w:t>('combles') or '' }}</w:t>
       </w:r>
@@ -5037,6 +5180,7 @@
           <w:rFonts w:cs="TimesNewRomanPSMT"/>
           <w:sz w:val="16"/>
           <w:szCs w:val="16"/>
+          <w:lang w:val="en-US"/>
         </w:rPr>
         <w:t xml:space="preserve"> </w:t>
       </w:r>
@@ -5142,13 +5286,15 @@
           <w:rFonts w:cs="TimesNewRomanPSMT"/>
           <w:sz w:val="16"/>
           <w:szCs w:val="16"/>
-        </w:rPr>
-      </w:pPr>
-      <w:r>
-        <w:rPr>
-          <w:rFonts w:cs="TimesNewRomanPSMT"/>
-          <w:sz w:val="16"/>
-          <w:szCs w:val="16"/>
+          <w:lang w:val="en-US"/>
+        </w:rPr>
+      </w:pPr>
+      <w:r>
+        <w:rPr>
+          <w:rFonts w:cs="TimesNewRomanPSMT"/>
+          <w:sz w:val="16"/>
+          <w:szCs w:val="16"/>
+          <w:lang w:val="en-US"/>
         </w:rPr>
         <w:t xml:space="preserve">{%- if </w:t>
       </w:r>
@@ -5158,6 +5304,7 @@
           <w:rFonts w:cs="TimesNewRomanPSMT"/>
           <w:sz w:val="16"/>
           <w:szCs w:val="16"/>
+          <w:lang w:val="en-US"/>
         </w:rPr>
         <w:t>lot.annexe_balcons</w:t>
       </w:r>
@@ -5167,15 +5314,37 @@
           <w:rFonts w:cs="TimesNewRomanPSMT"/>
           <w:sz w:val="16"/>
           <w:szCs w:val="16"/>
-        </w:rPr>
-        <w:t xml:space="preserve"> and 'balcons' not in </w:t>
-      </w:r>
-      <w:proofErr w:type="spellStart"/>
-      <w:r>
-        <w:rPr>
-          <w:rFonts w:cs="TimesNewRomanPSMT"/>
-          <w:sz w:val="16"/>
-          <w:szCs w:val="16"/>
+          <w:lang w:val="en-US"/>
+        </w:rPr>
+        <w:t xml:space="preserve"> and '</w:t>
+      </w:r>
+      <w:proofErr w:type="spellStart"/>
+      <w:r>
+        <w:rPr>
+          <w:rFonts w:cs="TimesNewRomanPSMT"/>
+          <w:sz w:val="16"/>
+          <w:szCs w:val="16"/>
+          <w:lang w:val="en-US"/>
+        </w:rPr>
+        <w:t>balcons</w:t>
+      </w:r>
+      <w:proofErr w:type="spellEnd"/>
+      <w:r>
+        <w:rPr>
+          <w:rFonts w:cs="TimesNewRomanPSMT"/>
+          <w:sz w:val="16"/>
+          <w:szCs w:val="16"/>
+          <w:lang w:val="en-US"/>
+        </w:rPr>
+        <w:t xml:space="preserve">' not in </w:t>
+      </w:r>
+      <w:proofErr w:type="spellStart"/>
+      <w:r>
+        <w:rPr>
+          <w:rFonts w:cs="TimesNewRomanPSMT"/>
+          <w:sz w:val="16"/>
+          <w:szCs w:val="16"/>
+          <w:lang w:val="en-US"/>
         </w:rPr>
         <w:t>displayed_annexes</w:t>
       </w:r>
@@ -5185,6 +5354,7 @@
           <w:rFonts w:cs="TimesNewRomanPSMT"/>
           <w:sz w:val="16"/>
           <w:szCs w:val="16"/>
+          <w:lang w:val="en-US"/>
         </w:rPr>
         <w:t xml:space="preserve"> %}</w:t>
       </w:r>
@@ -5197,13 +5367,15 @@
           <w:rFonts w:cs="TimesNewRomanPSMT"/>
           <w:sz w:val="16"/>
           <w:szCs w:val="16"/>
-        </w:rPr>
-      </w:pPr>
-      <w:r>
-        <w:rPr>
-          <w:rFonts w:cs="TimesNewRomanPSMT"/>
-          <w:sz w:val="16"/>
-          <w:szCs w:val="16"/>
+          <w:lang w:val="en-US"/>
+        </w:rPr>
+      </w:pPr>
+      <w:r>
+        <w:rPr>
+          <w:rFonts w:cs="TimesNewRomanPSMT"/>
+          <w:sz w:val="16"/>
+          <w:szCs w:val="16"/>
+          <w:lang w:val="en-US"/>
         </w:rPr>
         <w:t xml:space="preserve">{{ </w:t>
       </w:r>
@@ -5213,6 +5385,7 @@
           <w:rFonts w:cs="TimesNewRomanPSMT"/>
           <w:sz w:val="16"/>
           <w:szCs w:val="16"/>
+          <w:lang w:val="en-US"/>
         </w:rPr>
         <w:t>displayed_annexes.append</w:t>
       </w:r>
@@ -5222,20 +5395,45 @@
           <w:rFonts w:cs="TimesNewRomanPSMT"/>
           <w:sz w:val="16"/>
           <w:szCs w:val="16"/>
-        </w:rPr>
-        <w:t>('balcons') or '' }}</w:t>
+          <w:lang w:val="en-US"/>
+        </w:rPr>
+        <w:t>('</w:t>
+      </w:r>
+      <w:proofErr w:type="spellStart"/>
+      <w:r>
+        <w:rPr>
+          <w:rFonts w:cs="TimesNewRomanPSMT"/>
+          <w:sz w:val="16"/>
+          <w:szCs w:val="16"/>
+          <w:lang w:val="en-US"/>
+        </w:rPr>
+        <w:t>balcons</w:t>
+      </w:r>
+      <w:proofErr w:type="spellEnd"/>
+      <w:r>
+        <w:rPr>
+          <w:rFonts w:cs="TimesNewRomanPSMT"/>
+          <w:sz w:val="16"/>
+          <w:szCs w:val="16"/>
+          <w:lang w:val="en-US"/>
+        </w:rPr>
+        <w:t>') or '' }}</w:t>
       </w:r>
     </w:p>
     <w:p>
       <w:pPr>
         <w:ind w:firstLine="708"/>
         <w:jc w:val="both"/>
-      </w:pPr>
-      <w:r>
-        <w:rPr>
-          <w:rFonts w:cs="TimesNewRomanPSMT"/>
-          <w:sz w:val="16"/>
-          <w:szCs w:val="16"/>
+        <w:rPr>
+          <w:lang w:val="en-US"/>
+        </w:rPr>
+      </w:pPr>
+      <w:r>
+        <w:rPr>
+          <w:rFonts w:cs="TimesNewRomanPSMT"/>
+          <w:sz w:val="16"/>
+          <w:szCs w:val="16"/>
+          <w:lang w:val="en-US"/>
         </w:rPr>
         <w:t xml:space="preserve"> </w:t>
       </w:r>
@@ -5257,6 +5455,7 @@
         <w:rPr>
           <w:sz w:val="16"/>
           <w:szCs w:val="16"/>
+          <w:lang w:val="en-US"/>
         </w:rPr>
         <w:instrText xml:space="preserve"> FORMCHECKBOX </w:instrText>
       </w:r>
@@ -5291,46 +5490,36 @@
           <w:rFonts w:cs="TimesNewRomanPSMT"/>
           <w:sz w:val="16"/>
           <w:szCs w:val="16"/>
+          <w:lang w:val="en-US"/>
         </w:rPr>
         <w:t xml:space="preserve"> </w:t>
       </w:r>
-      <w:r>
-        <w:rPr>
-          <w:rFonts w:cs="TimesNewRomanPSMT"/>
+      <w:proofErr w:type="spellStart"/>
+      <w:r>
+        <w:rPr>
+          <w:rFonts w:cs="TimesNewRomanPSMT"/>
+          <w:lang w:val="en-US"/>
         </w:rPr>
         <w:t>Balcons</w:t>
       </w:r>
+      <w:proofErr w:type="spellEnd"/>
     </w:p>
     <w:p>
       <w:pPr>
         <w:ind w:firstLine="708"/>
         <w:jc w:val="both"/>
-      </w:pPr>
-      <w:r>
-        <w:rPr>
-          <w:rFonts w:cs="TimesNewRomanPSMT"/>
-          <w:sz w:val="16"/>
-          <w:szCs w:val="16"/>
-        </w:rPr>
-        <w:t xml:space="preserve">{%- </w:t>
-      </w:r>
-      <w:proofErr w:type="spellStart"/>
-      <w:r>
-        <w:rPr>
-          <w:rFonts w:cs="TimesNewRomanPSMT"/>
-          <w:sz w:val="16"/>
-          <w:szCs w:val="16"/>
-        </w:rPr>
-        <w:t>endif</w:t>
-      </w:r>
-      <w:proofErr w:type="spellEnd"/>
-      <w:r>
-        <w:rPr>
-          <w:rFonts w:cs="TimesNewRomanPSMT"/>
-          <w:sz w:val="16"/>
-          <w:szCs w:val="16"/>
-        </w:rPr>
-        <w:t xml:space="preserve"> %} </w:t>
+        <w:rPr>
+          <w:lang w:val="en-US"/>
+        </w:rPr>
+      </w:pPr>
+      <w:r>
+        <w:rPr>
+          <w:rFonts w:cs="TimesNewRomanPSMT"/>
+          <w:sz w:val="16"/>
+          <w:szCs w:val="16"/>
+          <w:lang w:val="en-US"/>
+        </w:rPr>
+        <w:t xml:space="preserve">{%- endif %} </w:t>
       </w:r>
     </w:p>
     <w:p>
@@ -5341,13 +5530,15 @@
           <w:rFonts w:cs="TimesNewRomanPSMT"/>
           <w:sz w:val="16"/>
           <w:szCs w:val="16"/>
-        </w:rPr>
-      </w:pPr>
-      <w:r>
-        <w:rPr>
-          <w:rFonts w:cs="TimesNewRomanPSMT"/>
-          <w:sz w:val="16"/>
-          <w:szCs w:val="16"/>
+          <w:lang w:val="en-US"/>
+        </w:rPr>
+      </w:pPr>
+      <w:r>
+        <w:rPr>
+          <w:rFonts w:cs="TimesNewRomanPSMT"/>
+          <w:sz w:val="16"/>
+          <w:szCs w:val="16"/>
+          <w:lang w:val="en-US"/>
         </w:rPr>
         <w:t xml:space="preserve">{%- if </w:t>
       </w:r>
@@ -5357,6 +5548,7 @@
           <w:rFonts w:cs="TimesNewRomanPSMT"/>
           <w:sz w:val="16"/>
           <w:szCs w:val="16"/>
+          <w:lang w:val="en-US"/>
         </w:rPr>
         <w:t>lot.annexe_loggias</w:t>
       </w:r>
@@ -5366,6 +5558,7 @@
           <w:rFonts w:cs="TimesNewRomanPSMT"/>
           <w:sz w:val="16"/>
           <w:szCs w:val="16"/>
+          <w:lang w:val="en-US"/>
         </w:rPr>
         <w:t xml:space="preserve"> and 'loggias' not in </w:t>
       </w:r>
@@ -5375,6 +5568,7 @@
           <w:rFonts w:cs="TimesNewRomanPSMT"/>
           <w:sz w:val="16"/>
           <w:szCs w:val="16"/>
+          <w:lang w:val="en-US"/>
         </w:rPr>
         <w:t>displayed_annexes</w:t>
       </w:r>
@@ -5384,6 +5578,7 @@
           <w:rFonts w:cs="TimesNewRomanPSMT"/>
           <w:sz w:val="16"/>
           <w:szCs w:val="16"/>
+          <w:lang w:val="en-US"/>
         </w:rPr>
         <w:t xml:space="preserve"> %}</w:t>
       </w:r>
@@ -5396,13 +5591,15 @@
           <w:rFonts w:cs="TimesNewRomanPSMT"/>
           <w:sz w:val="16"/>
           <w:szCs w:val="16"/>
-        </w:rPr>
-      </w:pPr>
-      <w:r>
-        <w:rPr>
-          <w:rFonts w:cs="TimesNewRomanPSMT"/>
-          <w:sz w:val="16"/>
-          <w:szCs w:val="16"/>
+          <w:lang w:val="en-US"/>
+        </w:rPr>
+      </w:pPr>
+      <w:r>
+        <w:rPr>
+          <w:rFonts w:cs="TimesNewRomanPSMT"/>
+          <w:sz w:val="16"/>
+          <w:szCs w:val="16"/>
+          <w:lang w:val="en-US"/>
         </w:rPr>
         <w:t xml:space="preserve">{{ </w:t>
       </w:r>
@@ -5412,6 +5609,7 @@
           <w:rFonts w:cs="TimesNewRomanPSMT"/>
           <w:sz w:val="16"/>
           <w:szCs w:val="16"/>
+          <w:lang w:val="en-US"/>
         </w:rPr>
         <w:t>displayed_annexes.append</w:t>
       </w:r>
@@ -5421,6 +5619,7 @@
           <w:rFonts w:cs="TimesNewRomanPSMT"/>
           <w:sz w:val="16"/>
           <w:szCs w:val="16"/>
+          <w:lang w:val="en-US"/>
         </w:rPr>
         <w:t>('loggias') or '' }}</w:t>
       </w:r>
@@ -5429,12 +5628,16 @@
       <w:pPr>
         <w:ind w:firstLine="708"/>
         <w:jc w:val="both"/>
-      </w:pPr>
-      <w:r>
-        <w:rPr>
-          <w:rFonts w:cs="TimesNewRomanPSMT"/>
-          <w:sz w:val="16"/>
-          <w:szCs w:val="16"/>
+        <w:rPr>
+          <w:lang w:val="en-US"/>
+        </w:rPr>
+      </w:pPr>
+      <w:r>
+        <w:rPr>
+          <w:rFonts w:cs="TimesNewRomanPSMT"/>
+          <w:sz w:val="16"/>
+          <w:szCs w:val="16"/>
+          <w:lang w:val="en-US"/>
         </w:rPr>
         <w:t xml:space="preserve"> </w:t>
       </w:r>
@@ -5456,6 +5659,7 @@
         <w:rPr>
           <w:sz w:val="16"/>
           <w:szCs w:val="16"/>
+          <w:lang w:val="en-US"/>
         </w:rPr>
         <w:instrText xml:space="preserve"> FORMCHECKBOX </w:instrText>
       </w:r>
@@ -5490,46 +5694,43 @@
           <w:rFonts w:cs="TimesNewRomanPSMT"/>
           <w:sz w:val="16"/>
           <w:szCs w:val="16"/>
+          <w:lang w:val="en-US"/>
         </w:rPr>
         <w:t xml:space="preserve"> </w:t>
       </w:r>
       <w:r>
         <w:rPr>
           <w:rFonts w:cs="TimesNewRomanPSMT"/>
-        </w:rPr>
-        <w:t>Loggias et Vérandas</w:t>
-      </w:r>
+          <w:lang w:val="en-US"/>
+        </w:rPr>
+        <w:t xml:space="preserve">Loggias et </w:t>
+      </w:r>
+      <w:proofErr w:type="spellStart"/>
+      <w:r>
+        <w:rPr>
+          <w:rFonts w:cs="TimesNewRomanPSMT"/>
+          <w:lang w:val="en-US"/>
+        </w:rPr>
+        <w:t>Vérandas</w:t>
+      </w:r>
+      <w:proofErr w:type="spellEnd"/>
     </w:p>
     <w:p>
       <w:pPr>
         <w:ind w:firstLine="708"/>
         <w:jc w:val="both"/>
-      </w:pPr>
-      <w:r>
-        <w:rPr>
-          <w:rFonts w:cs="TimesNewRomanPSMT"/>
-          <w:sz w:val="16"/>
-          <w:szCs w:val="16"/>
-        </w:rPr>
-        <w:t xml:space="preserve">{%- </w:t>
-      </w:r>
-      <w:proofErr w:type="spellStart"/>
-      <w:r>
-        <w:rPr>
-          <w:rFonts w:cs="TimesNewRomanPSMT"/>
-          <w:sz w:val="16"/>
-          <w:szCs w:val="16"/>
-        </w:rPr>
-        <w:t>endif</w:t>
-      </w:r>
-      <w:proofErr w:type="spellEnd"/>
-      <w:r>
-        <w:rPr>
-          <w:rFonts w:cs="TimesNewRomanPSMT"/>
-          <w:sz w:val="16"/>
-          <w:szCs w:val="16"/>
-        </w:rPr>
-        <w:t xml:space="preserve"> %} </w:t>
+        <w:rPr>
+          <w:lang w:val="en-US"/>
+        </w:rPr>
+      </w:pPr>
+      <w:r>
+        <w:rPr>
+          <w:rFonts w:cs="TimesNewRomanPSMT"/>
+          <w:sz w:val="16"/>
+          <w:szCs w:val="16"/>
+          <w:lang w:val="en-US"/>
+        </w:rPr>
+        <w:t xml:space="preserve">{%- endif %} </w:t>
       </w:r>
     </w:p>
     <w:p>
@@ -5540,13 +5741,15 @@
           <w:rFonts w:cs="TimesNewRomanPSMT"/>
           <w:sz w:val="16"/>
           <w:szCs w:val="16"/>
-        </w:rPr>
-      </w:pPr>
-      <w:r>
-        <w:rPr>
-          <w:rFonts w:cs="TimesNewRomanPSMT"/>
-          <w:sz w:val="16"/>
-          <w:szCs w:val="16"/>
+          <w:lang w:val="en-US"/>
+        </w:rPr>
+      </w:pPr>
+      <w:r>
+        <w:rPr>
+          <w:rFonts w:cs="TimesNewRomanPSMT"/>
+          <w:sz w:val="16"/>
+          <w:szCs w:val="16"/>
+          <w:lang w:val="en-US"/>
         </w:rPr>
         <w:t xml:space="preserve">{%- if </w:t>
       </w:r>
@@ -5556,6 +5759,7 @@
           <w:rFonts w:cs="TimesNewRomanPSMT"/>
           <w:sz w:val="16"/>
           <w:szCs w:val="16"/>
+          <w:lang w:val="en-US"/>
         </w:rPr>
         <w:t>lot.annexe_terrasses</w:t>
       </w:r>
@@ -5565,6 +5769,7 @@
           <w:rFonts w:cs="TimesNewRomanPSMT"/>
           <w:sz w:val="16"/>
           <w:szCs w:val="16"/>
+          <w:lang w:val="en-US"/>
         </w:rPr>
         <w:t xml:space="preserve"> and 'terrasses' not in </w:t>
       </w:r>
@@ -5574,6 +5779,7 @@
           <w:rFonts w:cs="TimesNewRomanPSMT"/>
           <w:sz w:val="16"/>
           <w:szCs w:val="16"/>
+          <w:lang w:val="en-US"/>
         </w:rPr>
         <w:t>displayed_annexes</w:t>
       </w:r>
@@ -5583,6 +5789,7 @@
           <w:rFonts w:cs="TimesNewRomanPSMT"/>
           <w:sz w:val="16"/>
           <w:szCs w:val="16"/>
+          <w:lang w:val="en-US"/>
         </w:rPr>
         <w:t xml:space="preserve"> %}</w:t>
       </w:r>
@@ -5595,13 +5802,15 @@
           <w:rFonts w:cs="TimesNewRomanPSMT"/>
           <w:sz w:val="16"/>
           <w:szCs w:val="16"/>
-        </w:rPr>
-      </w:pPr>
-      <w:r>
-        <w:rPr>
-          <w:rFonts w:cs="TimesNewRomanPSMT"/>
-          <w:sz w:val="16"/>
-          <w:szCs w:val="16"/>
+          <w:lang w:val="en-US"/>
+        </w:rPr>
+      </w:pPr>
+      <w:r>
+        <w:rPr>
+          <w:rFonts w:cs="TimesNewRomanPSMT"/>
+          <w:sz w:val="16"/>
+          <w:szCs w:val="16"/>
+          <w:lang w:val="en-US"/>
         </w:rPr>
         <w:t xml:space="preserve">{{ </w:t>
       </w:r>
@@ -5611,6 +5820,7 @@
           <w:rFonts w:cs="TimesNewRomanPSMT"/>
           <w:sz w:val="16"/>
           <w:szCs w:val="16"/>
+          <w:lang w:val="en-US"/>
         </w:rPr>
         <w:t>displayed_annexes.append</w:t>
       </w:r>
@@ -5620,6 +5830,7 @@
           <w:rFonts w:cs="TimesNewRomanPSMT"/>
           <w:sz w:val="16"/>
           <w:szCs w:val="16"/>
+          <w:lang w:val="en-US"/>
         </w:rPr>
         <w:t>('terrasses') or '' }}</w:t>
       </w:r>
@@ -5634,6 +5845,7 @@
           <w:rFonts w:cs="TimesNewRomanPSMT"/>
           <w:sz w:val="16"/>
           <w:szCs w:val="16"/>
+          <w:lang w:val="en-US"/>
         </w:rPr>
         <w:t xml:space="preserve"> </w:t>
       </w:r>
@@ -6928,7 +7140,6 @@
         <w:rPr>
           <w:rFonts w:cs="TimesNewRomanPSMT"/>
           <w:sz w:val="20"/>
-          <w:lang w:val="en-US"/>
         </w:rPr>
         <w:t xml:space="preserve">{% if </w:t>
       </w:r>
@@ -6937,7 +7148,6 @@
         <w:rPr>
           <w:rFonts w:cs="TimesNewRomanPSMT"/>
           <w:sz w:val="20"/>
-          <w:lang w:val="en-US"/>
         </w:rPr>
         <w:t>logements_sans_loyer</w:t>
       </w:r>
@@ -6946,7 +7156,6 @@
         <w:rPr>
           <w:rFonts w:cs="TimesNewRomanPSMT"/>
           <w:sz w:val="20"/>
-          <w:lang w:val="en-US"/>
         </w:rPr>
         <w:t xml:space="preserve"> %}</w:t>
       </w:r>
@@ -6957,7 +7166,6 @@
         <w:rPr>
           <w:rFonts w:cs="TimesNewRomanPSMT"/>
           <w:sz w:val="20"/>
-          <w:lang w:val="en-US"/>
         </w:rPr>
       </w:pPr>
     </w:p>
@@ -8721,7 +8929,6 @@
         <w:rPr>
           <w:rFonts w:cs="TimesNewRomanPSMT"/>
           <w:sz w:val="20"/>
-          <w:lang w:val="en-US"/>
         </w:rPr>
         <w:t xml:space="preserve">{% if </w:t>
       </w:r>
@@ -8730,7 +8937,6 @@
         <w:rPr>
           <w:rFonts w:cs="TimesNewRomanPSMT"/>
           <w:sz w:val="20"/>
-          <w:lang w:val="en-US"/>
         </w:rPr>
         <w:t>logements_corrigee_sans_loyer</w:t>
       </w:r>
@@ -8739,7 +8945,6 @@
         <w:rPr>
           <w:rFonts w:cs="TimesNewRomanPSMT"/>
           <w:sz w:val="20"/>
-          <w:lang w:val="en-US"/>
         </w:rPr>
         <w:t xml:space="preserve"> %}</w:t>
       </w:r>
@@ -8750,7 +8955,6 @@
         <w:rPr>
           <w:rFonts w:cs="TimesNewRomanPSMT"/>
           <w:sz w:val="20"/>
-          <w:lang w:val="en-US"/>
         </w:rPr>
       </w:pPr>
     </w:p>
@@ -10461,13 +10665,11 @@
       <w:pPr>
         <w:rPr>
           <w:rFonts w:cs="TimesNewRomanPSMT"/>
-          <w:lang w:val="en-US"/>
-        </w:rPr>
-      </w:pPr>
-      <w:r>
-        <w:rPr>
-          <w:rFonts w:cs="TimesNewRomanPSMT"/>
-          <w:lang w:val="en-US"/>
+        </w:rPr>
+      </w:pPr>
+      <w:r>
+        <w:rPr>
+          <w:rFonts w:cs="TimesNewRomanPSMT"/>
         </w:rPr>
         <w:t xml:space="preserve">{% if </w:t>
       </w:r>
@@ -10475,7 +10677,6 @@
       <w:r>
         <w:rPr>
           <w:rFonts w:cs="TimesNewRomanPSMT"/>
-          <w:lang w:val="en-US"/>
         </w:rPr>
         <w:t>avenant_type_edd</w:t>
       </w:r>
@@ -10483,7 +10684,6 @@
       <w:r>
         <w:rPr>
           <w:rFonts w:cs="TimesNewRomanPSMT"/>
-          <w:lang w:val="en-US"/>
         </w:rPr>
         <w:t xml:space="preserve"> %}</w:t>
       </w:r>
@@ -10520,18 +10720,13 @@
       </w:pPr>
     </w:p>
     <w:p>
-      <w:pPr>
-        <w:rPr>
-          <w:lang w:val="en-US"/>
-        </w:rPr>
-      </w:pPr>
-      <w:r>
-        <w:rPr>
-          <w:rFonts w:cs="TimesNewRomanPSMT"/>
-          <w:lang w:val="en-US"/>
+      <w:r>
+        <w:rPr>
+          <w:rFonts w:cs="TimesNewRomanPSMT"/>
         </w:rPr>
         <w:t xml:space="preserve">{% if </w:t>
       </w:r>
+      <w:proofErr w:type="spellStart"/>
       <w:r>
         <w:rPr>
           <w:rFonts w:cs="TimesNewRomanPSMT"/>
@@ -10541,23 +10736,13 @@
       <w:r>
         <w:rPr>
           <w:rFonts w:cs="TimesNewRomanPSMT"/>
-          <w:lang w:val="en-US"/>
-        </w:rPr>
-        <w:t>.</w:t>
-      </w:r>
-      <w:proofErr w:type="spellStart"/>
-      <w:r>
-        <w:rPr>
-          <w:rFonts w:cs="TimesNewRomanPSMT"/>
-          <w:lang w:val="en-US"/>
-        </w:rPr>
-        <w:t>edd_volumetrique_text</w:t>
-      </w:r>
-      <w:proofErr w:type="spellEnd"/>
-      <w:r>
-        <w:rPr>
-          <w:rFonts w:cs="TimesNewRomanPSMT"/>
-          <w:lang w:val="en-US"/>
+        </w:rPr>
+        <w:t>.edd_volumetrique_text</w:t>
+      </w:r>
+      <w:proofErr w:type="spellEnd"/>
+      <w:r>
+        <w:rPr>
+          <w:rFonts w:cs="TimesNewRomanPSMT"/>
         </w:rPr>
         <w:t>()|</w:t>
       </w:r>
@@ -10565,7 +10750,6 @@
       <w:r>
         <w:rPr>
           <w:rFonts w:cs="TimesNewRomanPSMT"/>
-          <w:lang w:val="en-US"/>
         </w:rPr>
         <w:t>len</w:t>
       </w:r>
@@ -10573,24 +10757,18 @@
       <w:r>
         <w:rPr>
           <w:rFonts w:cs="TimesNewRomanPSMT"/>
-          <w:lang w:val="en-US"/>
         </w:rPr>
         <w:t xml:space="preserve"> %}</w:t>
       </w:r>
     </w:p>
     <w:p>
-      <w:pPr>
-        <w:rPr>
-          <w:lang w:val="en-US"/>
-        </w:rPr>
-      </w:pPr>
-      <w:r>
-        <w:rPr>
-          <w:rFonts w:cs="TimesNewRomanPSMT"/>
-          <w:lang w:val="en-US"/>
+      <w:r>
+        <w:rPr>
+          <w:rFonts w:cs="TimesNewRomanPSMT"/>
         </w:rPr>
         <w:t xml:space="preserve">{{ </w:t>
       </w:r>
+      <w:proofErr w:type="spellStart"/>
       <w:r>
         <w:rPr>
           <w:rFonts w:cs="TimesNewRomanPSMT"/>
@@ -10600,23 +10778,13 @@
       <w:r>
         <w:rPr>
           <w:rFonts w:cs="TimesNewRomanPSMT"/>
-          <w:lang w:val="en-US"/>
-        </w:rPr>
-        <w:t>.</w:t>
-      </w:r>
-      <w:proofErr w:type="spellStart"/>
-      <w:r>
-        <w:rPr>
-          <w:rFonts w:cs="TimesNewRomanPSMT"/>
-          <w:lang w:val="en-US"/>
-        </w:rPr>
-        <w:t>edd_volumetrique_text</w:t>
-      </w:r>
-      <w:proofErr w:type="spellEnd"/>
-      <w:r>
-        <w:rPr>
-          <w:rFonts w:cs="TimesNewRomanPSMT"/>
-          <w:lang w:val="en-US"/>
+        </w:rPr>
+        <w:t>.edd_volumetrique_text</w:t>
+      </w:r>
+      <w:proofErr w:type="spellEnd"/>
+      <w:r>
+        <w:rPr>
+          <w:rFonts w:cs="TimesNewRomanPSMT"/>
         </w:rPr>
         <w:t>() }}</w:t>
       </w:r>
@@ -10624,23 +10792,30 @@
       <w:bookmarkEnd w:id="50"/>
     </w:p>
     <w:p>
-      <w:pPr>
-        <w:rPr>
-          <w:lang w:val="en-US"/>
-        </w:rPr>
-      </w:pPr>
-      <w:r>
-        <w:rPr>
-          <w:rFonts w:cs="TimesNewRomanPSMT"/>
-          <w:lang w:val="en-US"/>
-        </w:rPr>
-        <w:t xml:space="preserve">{% endif %}{% for image in </w:t>
-      </w:r>
-      <w:proofErr w:type="spellStart"/>
-      <w:r>
-        <w:rPr>
-          <w:rFonts w:cs="TimesNewRomanPSMT"/>
-          <w:lang w:val="en-US"/>
+      <w:r>
+        <w:rPr>
+          <w:rFonts w:cs="TimesNewRomanPSMT"/>
+        </w:rPr>
+        <w:t xml:space="preserve">{% </w:t>
+      </w:r>
+      <w:proofErr w:type="spellStart"/>
+      <w:r>
+        <w:rPr>
+          <w:rFonts w:cs="TimesNewRomanPSMT"/>
+        </w:rPr>
+        <w:t>endif</w:t>
+      </w:r>
+      <w:proofErr w:type="spellEnd"/>
+      <w:r>
+        <w:rPr>
+          <w:rFonts w:cs="TimesNewRomanPSMT"/>
+        </w:rPr>
+        <w:t xml:space="preserve"> %}{% for image in </w:t>
+      </w:r>
+      <w:proofErr w:type="spellStart"/>
+      <w:r>
+        <w:rPr>
+          <w:rFonts w:cs="TimesNewRomanPSMT"/>
         </w:rPr>
         <w:t>edd_volumetrique_images</w:t>
       </w:r>
@@ -10648,35 +10823,22 @@
       <w:r>
         <w:rPr>
           <w:rFonts w:cs="TimesNewRomanPSMT"/>
-          <w:lang w:val="en-US"/>
         </w:rPr>
         <w:t xml:space="preserve"> %}</w:t>
       </w:r>
     </w:p>
     <w:p>
-      <w:pPr>
-        <w:rPr>
-          <w:lang w:val="en-US"/>
-        </w:rPr>
-      </w:pPr>
-      <w:r>
-        <w:rPr>
-          <w:rFonts w:cs="TimesNewRomanPSMT"/>
-          <w:lang w:val="en-US"/>
+      <w:r>
+        <w:rPr>
+          <w:rFonts w:cs="TimesNewRomanPSMT"/>
         </w:rPr>
         <w:t>{{image}}</w:t>
       </w:r>
     </w:p>
     <w:p>
-      <w:pPr>
-        <w:rPr>
-          <w:lang w:val="en-US"/>
-        </w:rPr>
-      </w:pPr>
-      <w:r>
-        <w:rPr>
-          <w:rFonts w:cs="TimesNewRomanPSMT"/>
-          <w:lang w:val="en-US"/>
+      <w:r>
+        <w:rPr>
+          <w:rFonts w:cs="TimesNewRomanPSMT"/>
         </w:rPr>
         <w:t xml:space="preserve">{% </w:t>
       </w:r>
@@ -10684,7 +10846,6 @@
       <w:r>
         <w:rPr>
           <w:rFonts w:cs="TimesNewRomanPSMT"/>
-          <w:lang w:val="en-US"/>
         </w:rPr>
         <w:t>endfor</w:t>
       </w:r>
@@ -10692,7 +10853,6 @@
       <w:r>
         <w:rPr>
           <w:rFonts w:cs="TimesNewRomanPSMT"/>
-          <w:lang w:val="en-US"/>
         </w:rPr>
         <w:t xml:space="preserve"> %}{% if </w:t>
       </w:r>
@@ -10700,7 +10860,6 @@
       <w:r>
         <w:rPr>
           <w:rFonts w:cs="TimesNewRomanPSMT"/>
-          <w:lang w:val="en-US"/>
         </w:rPr>
         <w:t>programme.mention_publication_edd_volumetrique</w:t>
       </w:r>
@@ -10708,7 +10867,6 @@
       <w:r>
         <w:rPr>
           <w:rFonts w:cs="TimesNewRomanPSMT"/>
-          <w:lang w:val="en-US"/>
         </w:rPr>
         <w:t xml:space="preserve"> %}</w:t>
       </w:r>
@@ -10736,18 +10894,27 @@
       </w:r>
     </w:p>
     <w:p>
-      <w:pPr>
-        <w:rPr>
-          <w:lang w:val="en-US"/>
-        </w:rPr>
-      </w:pPr>
-      <w:r>
-        <w:rPr>
-          <w:rFonts w:cs="TimesNewRomanPSMT"/>
-          <w:lang w:val="en-US"/>
-        </w:rPr>
-        <w:t xml:space="preserve">{% endif %}{% if </w:t>
-      </w:r>
+      <w:r>
+        <w:rPr>
+          <w:rFonts w:cs="TimesNewRomanPSMT"/>
+        </w:rPr>
+        <w:t xml:space="preserve">{% </w:t>
+      </w:r>
+      <w:proofErr w:type="spellStart"/>
+      <w:r>
+        <w:rPr>
+          <w:rFonts w:cs="TimesNewRomanPSMT"/>
+        </w:rPr>
+        <w:t>endif</w:t>
+      </w:r>
+      <w:proofErr w:type="spellEnd"/>
+      <w:r>
+        <w:rPr>
+          <w:rFonts w:cs="TimesNewRomanPSMT"/>
+        </w:rPr>
+        <w:t xml:space="preserve"> %}{% if </w:t>
+      </w:r>
+      <w:proofErr w:type="spellStart"/>
       <w:r>
         <w:rPr>
           <w:rFonts w:cs="TimesNewRomanPSMT"/>
@@ -10757,23 +10924,13 @@
       <w:r>
         <w:rPr>
           <w:rFonts w:cs="TimesNewRomanPSMT"/>
-          <w:lang w:val="en-US"/>
-        </w:rPr>
-        <w:t>.</w:t>
-      </w:r>
-      <w:proofErr w:type="spellStart"/>
-      <w:r>
-        <w:rPr>
-          <w:rFonts w:cs="TimesNewRomanPSMT"/>
-          <w:lang w:val="en-US"/>
-        </w:rPr>
-        <w:t>edd_classique_text</w:t>
-      </w:r>
-      <w:proofErr w:type="spellEnd"/>
-      <w:r>
-        <w:rPr>
-          <w:rFonts w:cs="TimesNewRomanPSMT"/>
-          <w:lang w:val="en-US"/>
+        </w:rPr>
+        <w:t>.edd_classique_text</w:t>
+      </w:r>
+      <w:proofErr w:type="spellEnd"/>
+      <w:r>
+        <w:rPr>
+          <w:rFonts w:cs="TimesNewRomanPSMT"/>
         </w:rPr>
         <w:t>()|</w:t>
       </w:r>
@@ -10781,7 +10938,6 @@
       <w:r>
         <w:rPr>
           <w:rFonts w:cs="TimesNewRomanPSMT"/>
-          <w:lang w:val="en-US"/>
         </w:rPr>
         <w:t>len</w:t>
       </w:r>
@@ -10789,24 +10945,18 @@
       <w:r>
         <w:rPr>
           <w:rFonts w:cs="TimesNewRomanPSMT"/>
-          <w:lang w:val="en-US"/>
         </w:rPr>
         <w:t xml:space="preserve"> %}</w:t>
       </w:r>
     </w:p>
     <w:p>
-      <w:pPr>
-        <w:rPr>
-          <w:lang w:val="en-US"/>
-        </w:rPr>
-      </w:pPr>
-      <w:r>
-        <w:rPr>
-          <w:rFonts w:cs="TimesNewRomanPSMT"/>
-          <w:lang w:val="en-US"/>
+      <w:r>
+        <w:rPr>
+          <w:rFonts w:cs="TimesNewRomanPSMT"/>
         </w:rPr>
         <w:t xml:space="preserve">{{ </w:t>
       </w:r>
+      <w:proofErr w:type="spellStart"/>
       <w:r>
         <w:rPr>
           <w:rFonts w:cs="TimesNewRomanPSMT"/>
@@ -10816,23 +10966,13 @@
       <w:r>
         <w:rPr>
           <w:rFonts w:cs="TimesNewRomanPSMT"/>
-          <w:lang w:val="en-US"/>
-        </w:rPr>
-        <w:t>.</w:t>
-      </w:r>
-      <w:proofErr w:type="spellStart"/>
-      <w:r>
-        <w:rPr>
-          <w:rFonts w:cs="TimesNewRomanPSMT"/>
-          <w:lang w:val="en-US"/>
-        </w:rPr>
-        <w:t>edd_classique_text</w:t>
-      </w:r>
-      <w:proofErr w:type="spellEnd"/>
-      <w:r>
-        <w:rPr>
-          <w:rFonts w:cs="TimesNewRomanPSMT"/>
-          <w:lang w:val="en-US"/>
+        </w:rPr>
+        <w:t>.edd_classique_text</w:t>
+      </w:r>
+      <w:proofErr w:type="spellEnd"/>
+      <w:r>
+        <w:rPr>
+          <w:rFonts w:cs="TimesNewRomanPSMT"/>
         </w:rPr>
         <w:t>() }}</w:t>
       </w:r>
@@ -11938,13 +12078,7 @@
         <w:rPr>
           <w:rFonts w:cs="TimesNewRomanPSMT"/>
         </w:rPr>
-        <w:t>Organisme financeur</w:t>
-      </w:r>
-      <w:r>
-        <w:rPr>
-          <w:rFonts w:cs="TimesNewRomanPSMT"/>
-        </w:rPr>
-        <w:t xml:space="preserve"> : {{ </w:t>
+        <w:t xml:space="preserve">Organisme financeur : {{ </w:t>
       </w:r>
       <w:proofErr w:type="spellStart"/>
       <w:r>
@@ -11968,7 +12102,6 @@
       <w:r>
         <w:rPr>
           <w:rFonts w:cs="TimesNewRomanPSMT"/>
-          <w:lang w:val="en-US"/>
         </w:rPr>
         <w:t xml:space="preserve">{% </w:t>
       </w:r>
@@ -11976,7 +12109,6 @@
       <w:r>
         <w:rPr>
           <w:rFonts w:cs="TimesNewRomanPSMT"/>
-          <w:lang w:val="en-US"/>
         </w:rPr>
         <w:t>endfor</w:t>
       </w:r>
@@ -11984,7 +12116,6 @@
       <w:r>
         <w:rPr>
           <w:rFonts w:cs="TimesNewRomanPSMT"/>
-          <w:lang w:val="en-US"/>
         </w:rPr>
         <w:t xml:space="preserve"> %}</w:t>
       </w:r>
@@ -12381,13 +12512,7 @@
         <w:rPr>
           <w:rFonts w:cs="TimesNewRomanPSMT"/>
         </w:rPr>
-        <w:t>Organisme financeur </w:t>
-      </w:r>
-      <w:r>
-        <w:rPr>
-          <w:rFonts w:cs="TimesNewRomanPSMT"/>
-        </w:rPr>
-        <w:t xml:space="preserve">: {{ </w:t>
+        <w:t xml:space="preserve">Organisme financeur : {{ </w:t>
       </w:r>
       <w:proofErr w:type="spellStart"/>
       <w:r>
@@ -13849,12 +13974,12 @@
     </w:p>
     <w:p/>
     <w:sectPr>
-      <w:headerReference w:type="even" r:id="rId7"/>
-      <w:headerReference w:type="default" r:id="rId8"/>
-      <w:footerReference w:type="even" r:id="rId9"/>
-      <w:footerReference w:type="default" r:id="rId10"/>
-      <w:headerReference w:type="first" r:id="rId11"/>
-      <w:footerReference w:type="first" r:id="rId12"/>
+      <w:headerReference w:type="even" r:id="rId8"/>
+      <w:headerReference w:type="default" r:id="rId9"/>
+      <w:footerReference w:type="even" r:id="rId10"/>
+      <w:footerReference w:type="default" r:id="rId11"/>
+      <w:headerReference w:type="first" r:id="rId12"/>
+      <w:footerReference w:type="first" r:id="rId13"/>
       <w:pgSz w:w="11906" w:h="16838"/>
       <w:pgMar w:top="1418" w:right="703" w:bottom="1418" w:left="2926" w:header="284" w:footer="720" w:gutter="0"/>
       <w:pgBorders>
@@ -14404,6 +14529,41 @@
 
 <file path=word/header3.xml><?xml version="1.0" encoding="utf-8"?>
 <w:hdr xmlns:wpc="http://schemas.microsoft.com/office/word/2010/wordprocessingCanvas" xmlns:cx="http://schemas.microsoft.com/office/drawing/2014/chartex" xmlns:cx1="http://schemas.microsoft.com/office/drawing/2015/9/8/chartex" xmlns:cx2="http://schemas.microsoft.com/office/drawing/2015/10/21/chartex" xmlns:cx3="http://schemas.microsoft.com/office/drawing/2016/5/9/chartex" xmlns:cx4="http://schemas.microsoft.com/office/drawing/2016/5/10/chartex" xmlns:cx5="http://schemas.microsoft.com/office/drawing/2016/5/11/chartex" xmlns:cx6="http://schemas.microsoft.com/office/drawing/2016/5/12/chartex" xmlns:cx7="http://schemas.microsoft.com/office/drawing/2016/5/13/chartex" xmlns:cx8="http://schemas.microsoft.com/office/drawing/2016/5/14/chartex" xmlns:mc="http://schemas.openxmlformats.org/markup-compatibility/2006" xmlns:aink="http://schemas.microsoft.com/office/drawing/2016/ink" xmlns:am3d="http://schemas.microsoft.com/office/drawing/2017/model3d" xmlns:o="urn:schemas-microsoft-com:office:office" xmlns:oel="http://schemas.microsoft.com/office/2019/extlst" xmlns:r="http://schemas.openxmlformats.org/officeDocument/2006/relationships" xmlns:m="http://schemas.openxmlformats.org/officeDocument/2006/math" xmlns:v="urn:schemas-microsoft-com:vml" xmlns:wp14="http://schemas.microsoft.com/office/word/2010/wordprocessingDrawing" xmlns:wp="http://schemas.openxmlformats.org/drawingml/2006/wordprocessingDrawing" xmlns:w10="urn:schemas-microsoft-com:office:word" xmlns:w="http://schemas.openxmlformats.org/wordprocessingml/2006/main" xmlns:w14="http://schemas.microsoft.com/office/word/2010/wordml" xmlns:w15="http://schemas.microsoft.com/office/word/2012/wordml" xmlns:w16cex="http://schemas.microsoft.com/office/word/2018/wordml/cex" xmlns:w16cid="http://schemas.microsoft.com/office/word/2016/wordml/cid" xmlns:w16="http://schemas.microsoft.com/office/word/2018/wordml" xmlns:w16du="http://schemas.microsoft.com/office/word/2023/wordml/word16du" xmlns:w16sdtdh="http://schemas.microsoft.com/office/word/2020/wordml/sdtdatahash" xmlns:w16sdtfl="http://schemas.microsoft.com/office/word/2024/wordml/sdtformatlock" xmlns:w16se="http://schemas.microsoft.com/office/word/2015/wordml/symex" xmlns:wpg="http://schemas.microsoft.com/office/word/2010/wordprocessingGroup" xmlns:wpi="http://schemas.microsoft.com/office/word/2010/wordprocessingInk" xmlns:wne="http://schemas.microsoft.com/office/word/2006/wordml" xmlns:wps="http://schemas.microsoft.com/office/word/2010/wordprocessingShape" mc:Ignorable="w14 w15 w16se w16cid w16 w16cex w16sdtdh w16sdtfl w16du wp14">
+  <w:p>
+    <w:pPr>
+      <w:rPr>
+        <w:sz w:val="22"/>
+        <w:szCs w:val="22"/>
+        <w:lang w:val="en-US"/>
+      </w:rPr>
+    </w:pPr>
+    <w:r>
+      <w:rPr>
+        <w:sz w:val="22"/>
+        <w:szCs w:val="22"/>
+        <w:lang w:val="en-US"/>
+      </w:rPr>
+      <w:t xml:space="preserve">{% if </w:t>
+    </w:r>
+    <w:proofErr w:type="spellStart"/>
+    <w:r>
+      <w:rPr>
+        <w:sz w:val="22"/>
+        <w:szCs w:val="22"/>
+        <w:lang w:val="en-US"/>
+      </w:rPr>
+      <w:t>can_be_published</w:t>
+    </w:r>
+    <w:proofErr w:type="spellEnd"/>
+    <w:r>
+      <w:rPr>
+        <w:sz w:val="22"/>
+        <w:szCs w:val="22"/>
+        <w:lang w:val="en-US"/>
+      </w:rPr>
+      <w:t xml:space="preserve"> %}</w:t>
+    </w:r>
+  </w:p>
   <w:tbl>
     <w:tblPr>
       <w:tblStyle w:val="Grilledutableau"/>
@@ -14436,6 +14596,7 @@
             <w:rPr>
               <w:sz w:val="12"/>
               <w:szCs w:val="12"/>
+              <w:lang w:val="en-US"/>
             </w:rPr>
           </w:pPr>
         </w:p>
@@ -14889,10 +15050,38 @@
             <w:t>TOTAL</w:t>
           </w:r>
         </w:p>
-        <w:p/>
+        <w:p>
+          <w:pPr>
+            <w:pStyle w:val="En-tte"/>
+            <w:tabs>
+              <w:tab w:val="clear" w:pos="4536"/>
+              <w:tab w:val="clear" w:pos="9072"/>
+            </w:tabs>
+          </w:pPr>
+        </w:p>
       </w:tc>
     </w:tr>
   </w:tbl>
+  <w:p>
+    <w:pPr>
+      <w:pStyle w:val="En-tte"/>
+      <w:tabs>
+        <w:tab w:val="clear" w:pos="4536"/>
+        <w:tab w:val="clear" w:pos="9072"/>
+      </w:tabs>
+    </w:pPr>
+    <w:r>
+      <w:t xml:space="preserve">{% </w:t>
+    </w:r>
+    <w:proofErr w:type="spellStart"/>
+    <w:r>
+      <w:t>endif</w:t>
+    </w:r>
+    <w:proofErr w:type="spellEnd"/>
+    <w:r>
+      <w:t xml:space="preserve"> %}</w:t>
+    </w:r>
+  </w:p>
   <w:p>
     <w:pPr>
       <w:pStyle w:val="En-tte"/>
@@ -16965,6 +17154,7 @@
   <w:style w:type="paragraph" w:styleId="En-tte">
     <w:name w:val="header"/>
     <w:basedOn w:val="Normal"/>
+    <w:link w:val="En-tteCar"/>
     <w:pPr>
       <w:tabs>
         <w:tab w:val="center" w:pos="4536"/>
@@ -17512,6 +17702,16 @@
       </w:tblBorders>
     </w:tblPr>
   </w:style>
+  <w:style w:type="character" w:customStyle="1" w:styleId="En-tteCar">
+    <w:name w:val="En-tête Car"/>
+    <w:basedOn w:val="Policepardfaut"/>
+    <w:link w:val="En-tte"/>
+    <w:rsid w:val="002866DF"/>
+    <w:rPr>
+      <w:sz w:val="24"/>
+      <w:lang w:eastAsia="zh-CN"/>
+    </w:rPr>
+  </w:style>
 </w:styles>
 </file>
 
@@ -17808,4 +18008,16 @@
     </a:ext>
   </a:extLst>
 </a:theme>
+</file>
+
+<file path=customXml/item1.xml><?xml version="1.0" encoding="utf-8"?>
+<b:Sources xmlns:b="http://schemas.openxmlformats.org/officeDocument/2006/bibliography" xmlns="http://schemas.openxmlformats.org/officeDocument/2006/bibliography" SelectedStyle="\APASixthEditionOfficeOnline.xsl" StyleName="APA" Version="6"/>
+</file>
+
+<file path=customXml/itemProps1.xml><?xml version="1.0" encoding="utf-8"?>
+<ds:datastoreItem xmlns:ds="http://schemas.openxmlformats.org/officeDocument/2006/customXml" ds:itemID="{9805C05D-F7F7-4043-BC43-4E5E865F4A1D}">
+  <ds:schemaRefs>
+    <ds:schemaRef ds:uri="http://schemas.openxmlformats.org/officeDocument/2006/bibliography"/>
+  </ds:schemaRefs>
+</ds:datastoreItem>
 </file>
</xml_diff>